<commit_message>
Add offline voyage almanac PDF generator
</commit_message>
<xml_diff>
--- a/docs/v2/output/Celestial_Navigation_Manual_v2.docx
+++ b/docs/v2/output/Celestial_Navigation_Manual_v2.docx
@@ -3488,6 +3488,49 @@
             </w:pPr>
             <w:r>
               <w:rPr/>
+              <w:t>Generate Almanac…</w:t>
+            </w:r>
+          </w:p>
+        </w:tc>
+        <w:tc>
+          <w:tcPr>
+            <w:tcW w:w="9215" w:type="dxa"/>
+            <w:tcBorders/>
+            <w:vAlign w:val="center"/>
+          </w:tcPr>
+          <w:p>
+            <w:pPr>
+              <w:pStyle w:val="TableContents"/>
+              <w:bidi w:val="0"/>
+              <w:spacing w:before="0" w:after="283"/>
+              <w:jc w:val="start"/>
+              <w:rPr/>
+            </w:pPr>
+            <w:r>
+              <w:rPr/>
+              <w:t>Build a tailored, completely offline voyage almanac and calculator-complete paper backup as a PDF.</w:t>
+            </w:r>
+          </w:p>
+        </w:tc>
+      </w:tr>
+      <w:tr>
+        <w:trPr/>
+        <w:tc>
+          <w:tcPr>
+            <w:tcW w:w="2124" w:type="dxa"/>
+            <w:tcBorders/>
+            <w:vAlign w:val="center"/>
+          </w:tcPr>
+          <w:p>
+            <w:pPr>
+              <w:pStyle w:val="TableContents"/>
+              <w:bidi w:val="0"/>
+              <w:spacing w:before="0" w:after="283"/>
+              <w:jc w:val="start"/>
+              <w:rPr/>
+            </w:pPr>
+            <w:r>
+              <w:rPr/>
               <w:t>Eclipses…</w:t>
             </w:r>
           </w:p>
@@ -4467,7 +4510,415 @@
       </w:pPr>
       <w:r>
         <w:rPr/>
-        <w:t>9.5 Time-tagged moving observer</w:t>
+        <w:t>9.5 Generate Voyage Almanac</w:t>
+      </w:r>
+    </w:p>
+    <w:p>
+      <w:pPr>
+        <w:pStyle w:val="BodyText"/>
+        <w:bidi w:val="0"/>
+        <w:jc w:val="start"/>
+        <w:rPr/>
+      </w:pPr>
+      <w:r>
+        <w:rPr>
+          <w:rStyle w:val="Strong"/>
+        </w:rPr>
+        <w:t>Generate Almanac…</w:t>
+      </w:r>
+      <w:r>
+        <w:rPr/>
+        <w:t xml:space="preserve"> on the main Sights window creates an independent OpenCPN Voyage Almanac PDF. It is not an official Nautical Almanac and does not imitate an official publication's page design. It uses the same completely offline calculation engine as the planner.</w:t>
+      </w:r>
+    </w:p>
+    <w:p>
+      <w:pPr>
+        <w:pStyle w:val="BodyText"/>
+        <w:bidi w:val="0"/>
+        <w:jc w:val="start"/>
+        <w:rPr/>
+      </w:pPr>
+      <w:r>
+        <w:rPr/>
+        <w:t xml:space="preserve">Select any saved route in the generator. Alternatively, open the route's OpenCPN context menu and choose </w:t>
+      </w:r>
+      <w:r>
+        <w:rPr>
+          <w:rStyle w:val="Strong"/>
+        </w:rPr>
+        <w:t>Generate fallback almanac…</w:t>
+      </w:r>
+      <w:r>
+        <w:rPr/>
+        <w:t>. That shortcut opens the same generator with the route, document title and default 150 NM off-course corridor preselected; all settings remain editable.</w:t>
+      </w:r>
+    </w:p>
+    <w:p>
+      <w:pPr>
+        <w:pStyle w:val="Heading3"/>
+        <w:bidi w:val="0"/>
+        <w:jc w:val="start"/>
+        <w:rPr/>
+      </w:pPr>
+      <w:r>
+        <w:rPr/>
+        <w:t>Presets and safety level</w:t>
+      </w:r>
+    </w:p>
+    <w:p>
+      <w:pPr>
+        <w:pStyle w:val="BodyText"/>
+        <w:numPr>
+          <w:ilvl w:val="0"/>
+          <w:numId w:val="8"/>
+        </w:numPr>
+        <w:tabs>
+          <w:tab w:val="clear" w:pos="1134"/>
+          <w:tab w:val="left" w:pos="709" w:leader="none"/>
+        </w:tabs>
+        <w:bidi w:val="0"/>
+        <w:spacing w:before="0" w:after="0"/>
+        <w:ind w:hanging="283" w:start="709"/>
+        <w:jc w:val="start"/>
+        <w:rPr/>
+      </w:pPr>
+      <w:r>
+        <w:rPr>
+          <w:rStyle w:val="Strong"/>
+        </w:rPr>
+        <w:t>Passage Brief</w:t>
+      </w:r>
+      <w:r>
+        <w:rPr/>
+        <w:t xml:space="preserve"> is a compact planning aid. It deliberately omits some reduction reference material. </w:t>
+      </w:r>
+    </w:p>
+    <w:p>
+      <w:pPr>
+        <w:pStyle w:val="BodyText"/>
+        <w:numPr>
+          <w:ilvl w:val="0"/>
+          <w:numId w:val="8"/>
+        </w:numPr>
+        <w:tabs>
+          <w:tab w:val="clear" w:pos="1134"/>
+          <w:tab w:val="left" w:pos="709" w:leader="none"/>
+        </w:tabs>
+        <w:bidi w:val="0"/>
+        <w:spacing w:before="0" w:after="0"/>
+        <w:ind w:hanging="283" w:start="709"/>
+        <w:jc w:val="start"/>
+        <w:rPr/>
+      </w:pPr>
+      <w:r>
+        <w:rPr>
+          <w:rStyle w:val="Strong"/>
+        </w:rPr>
+        <w:t>Voyage Almanac</w:t>
+      </w:r>
+      <w:r>
+        <w:rPr/>
+        <w:t xml:space="preserve"> is the normal calculator-complete paper backup. </w:t>
+      </w:r>
+    </w:p>
+    <w:p>
+      <w:pPr>
+        <w:pStyle w:val="BodyText"/>
+        <w:numPr>
+          <w:ilvl w:val="0"/>
+          <w:numId w:val="8"/>
+        </w:numPr>
+        <w:tabs>
+          <w:tab w:val="clear" w:pos="1134"/>
+          <w:tab w:val="left" w:pos="709" w:leader="none"/>
+        </w:tabs>
+        <w:bidi w:val="0"/>
+        <w:spacing w:before="0" w:after="0"/>
+        <w:ind w:hanging="283" w:start="709"/>
+        <w:jc w:val="start"/>
+        <w:rPr/>
+      </w:pPr>
+      <w:r>
+        <w:rPr>
+          <w:rStyle w:val="Strong"/>
+        </w:rPr>
+        <w:t>Celestial Navigator</w:t>
+      </w:r>
+      <w:r>
+        <w:rPr/>
+        <w:t xml:space="preserve"> provides more forms and fuller planning material. </w:t>
+      </w:r>
+    </w:p>
+    <w:p>
+      <w:pPr>
+        <w:pStyle w:val="BodyText"/>
+        <w:numPr>
+          <w:ilvl w:val="0"/>
+          <w:numId w:val="8"/>
+        </w:numPr>
+        <w:tabs>
+          <w:tab w:val="clear" w:pos="1134"/>
+          <w:tab w:val="left" w:pos="709" w:leader="none"/>
+        </w:tabs>
+        <w:bidi w:val="0"/>
+        <w:ind w:hanging="283" w:start="709"/>
+        <w:jc w:val="start"/>
+        <w:rPr/>
+      </w:pPr>
+      <w:r>
+        <w:rPr>
+          <w:rStyle w:val="Strong"/>
+        </w:rPr>
+        <w:t>Custom</w:t>
+      </w:r>
+      <w:r>
+        <w:rPr/>
+        <w:t xml:space="preserve"> appears when preset options are changed. </w:t>
+      </w:r>
+    </w:p>
+    <w:p>
+      <w:pPr>
+        <w:pStyle w:val="BodyText"/>
+        <w:bidi w:val="0"/>
+        <w:jc w:val="start"/>
+        <w:rPr/>
+      </w:pPr>
+      <w:r>
+        <w:rPr>
+          <w:rStyle w:val="Strong"/>
+        </w:rPr>
+        <w:t>Self-contained with scientific calculator</w:t>
+      </w:r>
+      <w:r>
+        <w:rPr/>
+        <w:t xml:space="preserve"> means that the PDF includes hourly Sun, Moon, Aries and navigational-planet data, the 57 navigational stars, corrections, formulae, procedures and forms needed to perform reductions with an ordinary scientific calculator. It does not mean that sextant, accurate time, plotting tools, training or judgement are no longer needed. Gate-6 output does not contain the many volumes of global precomputed sight-reduction tables needed for calculator-free tabular work.</w:t>
+      </w:r>
+    </w:p>
+    <w:p>
+      <w:pPr>
+        <w:pStyle w:val="Heading3"/>
+        <w:bidi w:val="0"/>
+        <w:jc w:val="start"/>
+        <w:rPr/>
+      </w:pPr>
+      <w:r>
+        <w:rPr/>
+        <w:t>Coverage</w:t>
+      </w:r>
+    </w:p>
+    <w:p>
+      <w:pPr>
+        <w:pStyle w:val="BodyText"/>
+        <w:bidi w:val="0"/>
+        <w:jc w:val="start"/>
+        <w:rPr/>
+      </w:pPr>
+      <w:r>
+        <w:rPr/>
+        <w:t>The hourly geocentric ephemeris for every included body remains usable independently of the route. Coverage and observability choices compact the location-dependent suggestions and planning pages, not the universal data needed if the vessel leaves the expected track:</w:t>
+      </w:r>
+    </w:p>
+    <w:p>
+      <w:pPr>
+        <w:pStyle w:val="BodyText"/>
+        <w:numPr>
+          <w:ilvl w:val="0"/>
+          <w:numId w:val="9"/>
+        </w:numPr>
+        <w:tabs>
+          <w:tab w:val="clear" w:pos="1134"/>
+          <w:tab w:val="left" w:pos="709" w:leader="none"/>
+        </w:tabs>
+        <w:bidi w:val="0"/>
+        <w:spacing w:before="0" w:after="0"/>
+        <w:ind w:hanging="283" w:start="709"/>
+        <w:jc w:val="start"/>
+        <w:rPr/>
+      </w:pPr>
+      <w:r>
+        <w:rPr>
+          <w:rStyle w:val="Strong"/>
+        </w:rPr>
+        <w:t>Planned OpenCPN route:</w:t>
+      </w:r>
+      <w:r>
+        <w:rPr/>
+        <w:t xml:space="preserve"> begins at the first waypoint on the From date and advances along cumulative route distance at the selected fallback speed. The corridor states the planning uncertainty; it does not alter universal GHA/declination data. </w:t>
+      </w:r>
+    </w:p>
+    <w:p>
+      <w:pPr>
+        <w:pStyle w:val="BodyText"/>
+        <w:numPr>
+          <w:ilvl w:val="0"/>
+          <w:numId w:val="9"/>
+        </w:numPr>
+        <w:tabs>
+          <w:tab w:val="clear" w:pos="1134"/>
+          <w:tab w:val="left" w:pos="709" w:leader="none"/>
+        </w:tabs>
+        <w:bidi w:val="0"/>
+        <w:spacing w:before="0" w:after="0"/>
+        <w:ind w:hanging="283" w:start="709"/>
+        <w:jc w:val="start"/>
+        <w:rPr/>
+      </w:pPr>
+      <w:r>
+        <w:rPr>
+          <w:rStyle w:val="Strong"/>
+        </w:rPr>
+        <w:t>Fixed position:</w:t>
+      </w:r>
+      <w:r>
+        <w:rPr/>
+        <w:t xml:space="preserve"> produces events and recommendations for one latitude/longitude. </w:t>
+      </w:r>
+    </w:p>
+    <w:p>
+      <w:pPr>
+        <w:pStyle w:val="BodyText"/>
+        <w:numPr>
+          <w:ilvl w:val="0"/>
+          <w:numId w:val="9"/>
+        </w:numPr>
+        <w:tabs>
+          <w:tab w:val="clear" w:pos="1134"/>
+          <w:tab w:val="left" w:pos="709" w:leader="none"/>
+        </w:tabs>
+        <w:bidi w:val="0"/>
+        <w:spacing w:before="0" w:after="0"/>
+        <w:ind w:hanging="283" w:start="709"/>
+        <w:jc w:val="start"/>
+        <w:rPr/>
+      </w:pPr>
+      <w:r>
+        <w:rPr>
+          <w:rStyle w:val="Strong"/>
+        </w:rPr>
+        <w:t>Latitude band:</w:t>
+      </w:r>
+      <w:r>
+        <w:rPr/>
+        <w:t xml:space="preserve"> uses the middle of the band for the present Gate-6 planning page while retaining the band on the manifest. Do not interpret that sample as valid at every longitude. </w:t>
+      </w:r>
+    </w:p>
+    <w:p>
+      <w:pPr>
+        <w:pStyle w:val="BodyText"/>
+        <w:numPr>
+          <w:ilvl w:val="0"/>
+          <w:numId w:val="9"/>
+        </w:numPr>
+        <w:tabs>
+          <w:tab w:val="clear" w:pos="1134"/>
+          <w:tab w:val="left" w:pos="709" w:leader="none"/>
+        </w:tabs>
+        <w:bidi w:val="0"/>
+        <w:ind w:hanging="283" w:start="709"/>
+        <w:jc w:val="start"/>
+        <w:rPr/>
+      </w:pPr>
+      <w:r>
+        <w:rPr>
+          <w:rStyle w:val="Strong"/>
+        </w:rPr>
+        <w:t>Global:</w:t>
+      </w:r>
+      <w:r>
+        <w:rPr/>
+        <w:t xml:space="preserve"> retains universal ephemeris and uses 0° N, 0° E only as a clearly labelled planning example. </w:t>
+      </w:r>
+    </w:p>
+    <w:p>
+      <w:pPr>
+        <w:pStyle w:val="Heading3"/>
+        <w:bidi w:val="0"/>
+        <w:jc w:val="start"/>
+        <w:rPr/>
+      </w:pPr>
+      <w:r>
+        <w:rPr/>
+        <w:t>Time basis and DUT1</w:t>
+      </w:r>
+    </w:p>
+    <w:p>
+      <w:pPr>
+        <w:pStyle w:val="BodyText"/>
+        <w:bidi w:val="0"/>
+        <w:jc w:val="start"/>
+        <w:rPr/>
+      </w:pPr>
+      <w:r>
+        <w:rPr/>
+        <w:t>Daily rows are labelled in UTC. Earth rotation is evaluated using UT1 = UTC + DUT1. The generator never downloads DUT1: enter a current value obtained before departure, or leave it unchecked and the cover will record the explicit 0.000-second assumption and warning. Future leap seconds and future DUT1 cannot be known exactly in advance.</w:t>
+      </w:r>
+    </w:p>
+    <w:p>
+      <w:pPr>
+        <w:pStyle w:val="Heading3"/>
+        <w:bidi w:val="0"/>
+        <w:jc w:val="start"/>
+        <w:rPr/>
+      </w:pPr>
+      <w:r>
+        <w:rPr/>
+        <w:t>Preview, page count and output</w:t>
+      </w:r>
+    </w:p>
+    <w:p>
+      <w:pPr>
+        <w:pStyle w:val="BodyText"/>
+        <w:bidi w:val="0"/>
+        <w:jc w:val="start"/>
+        <w:rPr/>
+      </w:pPr>
+      <w:r>
+        <w:rPr/>
+        <w:t xml:space="preserve">The live page count is structural and exact; it does not need to calculate every body merely to count pages. </w:t>
+      </w:r>
+      <w:r>
+        <w:rPr>
+          <w:rStyle w:val="Strong"/>
+        </w:rPr>
+        <w:t>Preview first pages</w:t>
+      </w:r>
+      <w:r>
+        <w:rPr/>
+        <w:t xml:space="preserve"> shows the cover, manifest and opening pages from the same semantic document model used by the PDF renderer. Output is first completed as a sibling temporary file and then renamed, so a failed calculation does not leave a plausible but partial final PDF.</w:t>
+      </w:r>
+    </w:p>
+    <w:p>
+      <w:pPr>
+        <w:pStyle w:val="BodyText"/>
+        <w:bidi w:val="0"/>
+        <w:ind w:hanging="0" w:start="0" w:end="0"/>
+        <w:jc w:val="start"/>
+        <w:rPr/>
+      </w:pPr>
+      <w:r>
+        <w:rPr>
+          <w:rStyle w:val="Strong"/>
+          <w:shd w:fill="FFF0F0" w:val="clear"/>
+        </w:rPr>
+        <w:t>Check before departure.</w:t>
+      </w:r>
+      <w:r>
+        <w:rPr>
+          <w:shd w:fill="FFF0F0" w:val="clear"/>
+        </w:rPr>
+        <w:t xml:space="preserve"> Generate the actual voyage PDF, open it independently, inspect several daily pages and print a sample duplex pair. Compare representative GHA/declination and event values with an authoritative source. Retain the cover manifest with the document.</w:t>
+      </w:r>
+    </w:p>
+    <w:p>
+      <w:pPr>
+        <w:pStyle w:val="Heading2"/>
+        <w:bidi w:val="0"/>
+        <w:jc w:val="start"/>
+        <w:rPr/>
+      </w:pPr>
+      <w:r>
+        <w:rPr/>
+        <w:t>9.6 Time-tagged moving observer</w:t>
       </w:r>
     </w:p>
     <w:p>
@@ -4583,7 +5034,7 @@
         <w:pStyle w:val="BodyText"/>
         <w:numPr>
           <w:ilvl w:val="0"/>
-          <w:numId w:val="8"/>
+          <w:numId w:val="10"/>
         </w:numPr>
         <w:tabs>
           <w:tab w:val="clear" w:pos="1134"/>
@@ -4605,7 +5056,7 @@
         <w:pStyle w:val="BodyText"/>
         <w:numPr>
           <w:ilvl w:val="0"/>
-          <w:numId w:val="8"/>
+          <w:numId w:val="10"/>
         </w:numPr>
         <w:tabs>
           <w:tab w:val="clear" w:pos="1134"/>
@@ -4627,7 +5078,7 @@
         <w:pStyle w:val="BodyText"/>
         <w:numPr>
           <w:ilvl w:val="0"/>
-          <w:numId w:val="8"/>
+          <w:numId w:val="10"/>
         </w:numPr>
         <w:tabs>
           <w:tab w:val="clear" w:pos="1134"/>
@@ -4649,7 +5100,7 @@
         <w:pStyle w:val="BodyText"/>
         <w:numPr>
           <w:ilvl w:val="0"/>
-          <w:numId w:val="8"/>
+          <w:numId w:val="10"/>
         </w:numPr>
         <w:tabs>
           <w:tab w:val="clear" w:pos="1134"/>
@@ -4895,7 +5346,7 @@
         <w:pStyle w:val="BodyText"/>
         <w:numPr>
           <w:ilvl w:val="0"/>
-          <w:numId w:val="9"/>
+          <w:numId w:val="11"/>
         </w:numPr>
         <w:tabs>
           <w:tab w:val="clear" w:pos="1134"/>
@@ -4910,360 +5361,6 @@
       <w:r>
         <w:rPr/>
         <w:t xml:space="preserve">The lunar distance LDOpc from the selected Moon limb/contact to the second body. </w:t>
-      </w:r>
-    </w:p>
-    <w:p>
-      <w:pPr>
-        <w:pStyle w:val="BodyText"/>
-        <w:numPr>
-          <w:ilvl w:val="0"/>
-          <w:numId w:val="9"/>
-        </w:numPr>
-        <w:tabs>
-          <w:tab w:val="clear" w:pos="1134"/>
-          <w:tab w:val="left" w:pos="709" w:leader="none"/>
-        </w:tabs>
-        <w:bidi w:val="0"/>
-        <w:spacing w:before="0" w:after="0"/>
-        <w:ind w:hanging="283" w:start="709"/>
-        <w:jc w:val="start"/>
-        <w:rPr/>
-      </w:pPr>
-      <w:r>
-        <w:rPr/>
-        <w:t xml:space="preserve">The Moon altitude above the horizon. </w:t>
-      </w:r>
-    </w:p>
-    <w:p>
-      <w:pPr>
-        <w:pStyle w:val="BodyText"/>
-        <w:numPr>
-          <w:ilvl w:val="0"/>
-          <w:numId w:val="9"/>
-        </w:numPr>
-        <w:tabs>
-          <w:tab w:val="clear" w:pos="1134"/>
-          <w:tab w:val="left" w:pos="709" w:leader="none"/>
-        </w:tabs>
-        <w:bidi w:val="0"/>
-        <w:spacing w:before="0" w:after="0"/>
-        <w:ind w:hanging="283" w:start="709"/>
-        <w:jc w:val="start"/>
-        <w:rPr/>
-      </w:pPr>
-      <w:r>
-        <w:rPr/>
-        <w:t xml:space="preserve">The second-body altitude above the horizon. </w:t>
-      </w:r>
-    </w:p>
-    <w:p>
-      <w:pPr>
-        <w:pStyle w:val="BodyText"/>
-        <w:numPr>
-          <w:ilvl w:val="0"/>
-          <w:numId w:val="9"/>
-        </w:numPr>
-        <w:tabs>
-          <w:tab w:val="clear" w:pos="1134"/>
-          <w:tab w:val="left" w:pos="709" w:leader="none"/>
-        </w:tabs>
-        <w:bidi w:val="0"/>
-        <w:ind w:hanging="283" w:start="709"/>
-        <w:jc w:val="start"/>
-        <w:rPr/>
-      </w:pPr>
-      <w:r>
-        <w:rPr/>
-        <w:t xml:space="preserve">The watch time of every reading, plus index error, limb/contact and uncertainty. </w:t>
-      </w:r>
-    </w:p>
-    <w:p>
-      <w:pPr>
-        <w:pStyle w:val="Heading2"/>
-        <w:bidi w:val="0"/>
-        <w:jc w:val="start"/>
-        <w:rPr/>
-      </w:pPr>
-      <w:r>
-        <w:rPr/>
-        <w:t>12.2 Sequential observations</w:t>
-      </w:r>
-    </w:p>
-    <w:p>
-      <w:pPr>
-        <w:pStyle w:val="BodyText"/>
-        <w:bidi w:val="0"/>
-        <w:jc w:val="start"/>
-        <w:rPr/>
-      </w:pPr>
-      <w:r>
-        <w:rPr/>
-        <w:t xml:space="preserve">Enable </w:t>
-      </w:r>
-      <w:r>
-        <w:rPr>
-          <w:rStyle w:val="Strong"/>
-        </w:rPr>
-        <w:t>The three angles have separate watch times</w:t>
-      </w:r>
-      <w:r>
-        <w:rPr/>
-        <w:t xml:space="preserve"> when the readings were not simultaneous. The lunar-distance date/time is the reference epoch. Enter Moon-altitude and body-altitude watch times separately. Times near midnight are interpreted as the nearest occurrence within twelve hours of the reference reading.</w:t>
-      </w:r>
-    </w:p>
-    <w:p>
-      <w:pPr>
-        <w:pStyle w:val="BodyText"/>
-        <w:bidi w:val="0"/>
-        <w:jc w:val="start"/>
-        <w:rPr/>
-      </w:pPr>
-      <w:r>
-        <w:rPr/>
-        <w:t xml:space="preserve">If the vessel moved materially, enable </w:t>
-      </w:r>
-      <w:r>
-        <w:rPr>
-          <w:rStyle w:val="Strong"/>
-        </w:rPr>
-        <w:t>Advance vessel between readings</w:t>
-      </w:r>
-      <w:r>
-        <w:rPr/>
-        <w:t xml:space="preserve"> and enter true COG and SOG. The same unknown constant watch correction is applied to all three watch times; the intervals between them are preserved.</w:t>
-      </w:r>
-    </w:p>
-    <w:p>
-      <w:pPr>
-        <w:pStyle w:val="Heading2"/>
-        <w:bidi w:val="0"/>
-        <w:jc w:val="start"/>
-        <w:rPr/>
-      </w:pPr>
-      <w:r>
-        <w:rPr/>
-        <w:t>12.3 Solving</w:t>
-      </w:r>
-    </w:p>
-    <w:p>
-      <w:pPr>
-        <w:pStyle w:val="BodyText"/>
-        <w:numPr>
-          <w:ilvl w:val="0"/>
-          <w:numId w:val="10"/>
-        </w:numPr>
-        <w:tabs>
-          <w:tab w:val="clear" w:pos="1134"/>
-          <w:tab w:val="left" w:pos="709" w:leader="none"/>
-        </w:tabs>
-        <w:bidi w:val="0"/>
-        <w:spacing w:before="0" w:after="0"/>
-        <w:ind w:hanging="283" w:start="709"/>
-        <w:jc w:val="start"/>
-        <w:rPr/>
-      </w:pPr>
-      <w:r>
-        <w:rPr/>
-        <w:t xml:space="preserve">Create a </w:t>
-      </w:r>
-      <w:r>
-        <w:rPr>
-          <w:rStyle w:val="Strong"/>
-        </w:rPr>
-        <w:t>Lunar</w:t>
-      </w:r>
-      <w:r>
-        <w:rPr/>
-        <w:t xml:space="preserve"> sight and select the second body. </w:t>
-      </w:r>
-    </w:p>
-    <w:p>
-      <w:pPr>
-        <w:pStyle w:val="BodyText"/>
-        <w:numPr>
-          <w:ilvl w:val="0"/>
-          <w:numId w:val="10"/>
-        </w:numPr>
-        <w:tabs>
-          <w:tab w:val="clear" w:pos="1134"/>
-          <w:tab w:val="left" w:pos="709" w:leader="none"/>
-        </w:tabs>
-        <w:bidi w:val="0"/>
-        <w:spacing w:before="0" w:after="0"/>
-        <w:ind w:hanging="283" w:start="709"/>
-        <w:jc w:val="start"/>
-        <w:rPr/>
-      </w:pPr>
-      <w:r>
-        <w:rPr/>
-        <w:t xml:space="preserve">Enter LDOpc, near/centre/far contact and both body altitudes with correct limbs. </w:t>
-      </w:r>
-    </w:p>
-    <w:p>
-      <w:pPr>
-        <w:pStyle w:val="BodyText"/>
-        <w:numPr>
-          <w:ilvl w:val="0"/>
-          <w:numId w:val="10"/>
-        </w:numPr>
-        <w:tabs>
-          <w:tab w:val="clear" w:pos="1134"/>
-          <w:tab w:val="left" w:pos="709" w:leader="none"/>
-        </w:tabs>
-        <w:bidi w:val="0"/>
-        <w:spacing w:before="0" w:after="0"/>
-        <w:ind w:hanging="283" w:start="709"/>
-        <w:jc w:val="start"/>
-        <w:rPr/>
-      </w:pPr>
-      <w:r>
-        <w:rPr/>
-        <w:t xml:space="preserve">Enter one time or enable separate times as actually observed. </w:t>
-      </w:r>
-    </w:p>
-    <w:p>
-      <w:pPr>
-        <w:pStyle w:val="BodyText"/>
-        <w:numPr>
-          <w:ilvl w:val="0"/>
-          <w:numId w:val="10"/>
-        </w:numPr>
-        <w:tabs>
-          <w:tab w:val="clear" w:pos="1134"/>
-          <w:tab w:val="left" w:pos="709" w:leader="none"/>
-        </w:tabs>
-        <w:bidi w:val="0"/>
-        <w:spacing w:before="0" w:after="0"/>
-        <w:ind w:hanging="283" w:start="709"/>
-        <w:jc w:val="start"/>
-        <w:rPr/>
-      </w:pPr>
-      <w:r>
-        <w:rPr/>
-        <w:t xml:space="preserve">Set a plausible total UTC search span around the watch time. </w:t>
-      </w:r>
-    </w:p>
-    <w:p>
-      <w:pPr>
-        <w:pStyle w:val="BodyText"/>
-        <w:numPr>
-          <w:ilvl w:val="0"/>
-          <w:numId w:val="10"/>
-        </w:numPr>
-        <w:tabs>
-          <w:tab w:val="clear" w:pos="1134"/>
-          <w:tab w:val="left" w:pos="709" w:leader="none"/>
-        </w:tabs>
-        <w:bidi w:val="0"/>
-        <w:spacing w:before="0" w:after="0"/>
-        <w:ind w:hanging="283" w:start="709"/>
-        <w:jc w:val="start"/>
-        <w:rPr/>
-      </w:pPr>
-      <w:r>
-        <w:rPr/>
-        <w:t xml:space="preserve">Select </w:t>
-      </w:r>
-      <w:r>
-        <w:rPr>
-          <w:rStyle w:val="Strong"/>
-        </w:rPr>
-        <w:t>Time</w:t>
-      </w:r>
-      <w:r>
-        <w:rPr/>
-        <w:t xml:space="preserve">. Review all matching time candidates, clock correction, uncertainty and position candidates. </w:t>
-      </w:r>
-    </w:p>
-    <w:p>
-      <w:pPr>
-        <w:pStyle w:val="BodyText"/>
-        <w:numPr>
-          <w:ilvl w:val="0"/>
-          <w:numId w:val="10"/>
-        </w:numPr>
-        <w:tabs>
-          <w:tab w:val="clear" w:pos="1134"/>
-          <w:tab w:val="left" w:pos="709" w:leader="none"/>
-        </w:tabs>
-        <w:bidi w:val="0"/>
-        <w:ind w:hanging="283" w:start="709"/>
-        <w:jc w:val="start"/>
-        <w:rPr/>
-      </w:pPr>
-      <w:r>
-        <w:rPr/>
-        <w:t xml:space="preserve">Use rough DR, hemisphere, an additional altitude sight or independent evidence to select the physical solution. </w:t>
-      </w:r>
-    </w:p>
-    <w:p>
-      <w:pPr>
-        <w:pStyle w:val="BodyText"/>
-        <w:bidi w:val="0"/>
-        <w:ind w:hanging="0" w:start="0" w:end="0"/>
-        <w:jc w:val="start"/>
-        <w:rPr/>
-      </w:pPr>
-      <w:r>
-        <w:rPr>
-          <w:rStyle w:val="Strong"/>
-          <w:shd w:fill="FFF0F0" w:val="clear"/>
-        </w:rPr>
-        <w:t>Lunar accuracy is demanding.</w:t>
-      </w:r>
-      <w:r>
-        <w:rPr>
-          <w:shd w:fill="FFF0F0" w:val="clear"/>
-        </w:rPr>
-        <w:t xml:space="preserve"> A lunar distance changes slowly enough that a small angular error can become a large time error. Sextant adjustment, side error, limb contact, refraction/parallax clearing and repeated observations matter substantially more than in an ordinary altitude sight.</w:t>
-      </w:r>
-    </w:p>
-    <w:p>
-      <w:pPr>
-        <w:pStyle w:val="Heading2"/>
-        <w:bidi w:val="0"/>
-        <w:jc w:val="start"/>
-        <w:rPr/>
-      </w:pPr>
-      <w:r>
-        <w:rPr/>
-        <w:t>12.4 Unknown UTC and longitude</w:t>
-      </w:r>
-    </w:p>
-    <w:p>
-      <w:pPr>
-        <w:pStyle w:val="BodyText"/>
-        <w:bidi w:val="0"/>
-        <w:jc w:val="start"/>
-        <w:rPr/>
-      </w:pPr>
-      <w:r>
-        <w:rPr/>
-        <w:t>The solver does not use the crude “15 degrees per hour” shortcut as a longitude answer. It searches clock correction and reference position jointly against the lunar distance and altitude constraints. More than one physical candidate can remain. Reported numerical convergence does not remove geometric ambiguity or observational uncertainty.</w:t>
-      </w:r>
-    </w:p>
-    <w:p>
-      <w:pPr>
-        <w:pStyle w:val="Heading2"/>
-        <w:bidi w:val="0"/>
-        <w:jc w:val="start"/>
-        <w:rPr/>
-      </w:pPr>
-      <w:r>
-        <w:rPr/>
-        <w:t>12.5 Joint lunar-sequence estimation</w:t>
-      </w:r>
-    </w:p>
-    <w:p>
-      <w:pPr>
-        <w:pStyle w:val="BodyText"/>
-        <w:bidi w:val="0"/>
-        <w:jc w:val="start"/>
-        <w:rPr/>
-      </w:pPr>
-      <w:r>
-        <w:rPr/>
-        <w:t>One lunar triple contains three measured angles and can solve three primary unknowns—constant watch correction, latitude and longitude—but it supplies almost no redundancy. Several timed triples are much more useful: one shared solution can reveal scatter, weak geometry, a competing time/position minimum or a reading that disagrees with the others.</w:t>
       </w:r>
     </w:p>
     <w:p>
@@ -5285,17 +5382,7 @@
       </w:pPr>
       <w:r>
         <w:rPr/>
-        <w:t xml:space="preserve">Save at least two complete </w:t>
-      </w:r>
-      <w:r>
-        <w:rPr>
-          <w:rStyle w:val="Strong"/>
-        </w:rPr>
-        <w:t>Lunar</w:t>
-      </w:r>
-      <w:r>
-        <w:rPr/>
-        <w:t xml:space="preserve"> sights. Use each sight's separate-time controls whenever the three angles were not simultaneous. </w:t>
+        <w:t xml:space="preserve">The Moon altitude above the horizon. </w:t>
       </w:r>
     </w:p>
     <w:p>
@@ -5317,17 +5404,7 @@
       </w:pPr>
       <w:r>
         <w:rPr/>
-        <w:t xml:space="preserve">Select </w:t>
-      </w:r>
-      <w:r>
-        <w:rPr>
-          <w:rStyle w:val="Strong"/>
-        </w:rPr>
-        <w:t>Lunar Tools… → Lunar sequence</w:t>
-      </w:r>
-      <w:r>
-        <w:rPr/>
-        <w:t xml:space="preserve"> and tick the observations belonging to one watch/session. </w:t>
+        <w:t xml:space="preserve">The second-body altitude above the horizon. </w:t>
       </w:r>
     </w:p>
     <w:p>
@@ -5342,153 +5419,69 @@
           <w:tab w:val="left" w:pos="709" w:leader="none"/>
         </w:tabs>
         <w:bidi w:val="0"/>
-        <w:spacing w:before="0" w:after="0"/>
         <w:ind w:hanging="283" w:start="709"/>
         <w:jc w:val="start"/>
         <w:rPr/>
       </w:pPr>
       <w:r>
         <w:rPr/>
-        <w:t xml:space="preserve">Choose </w:t>
+        <w:t xml:space="preserve">The watch time of every reading, plus index error, limb/contact and uncertainty. </w:t>
+      </w:r>
+    </w:p>
+    <w:p>
+      <w:pPr>
+        <w:pStyle w:val="Heading2"/>
+        <w:bidi w:val="0"/>
+        <w:jc w:val="start"/>
+        <w:rPr/>
+      </w:pPr>
+      <w:r>
+        <w:rPr/>
+        <w:t>12.2 Sequential observations</w:t>
+      </w:r>
+    </w:p>
+    <w:p>
+      <w:pPr>
+        <w:pStyle w:val="BodyText"/>
+        <w:bidi w:val="0"/>
+        <w:jc w:val="start"/>
+        <w:rPr/>
+      </w:pPr>
+      <w:r>
+        <w:rPr/>
+        <w:t xml:space="preserve">Enable </w:t>
       </w:r>
       <w:r>
         <w:rPr>
           <w:rStyle w:val="Strong"/>
         </w:rPr>
-        <w:t>Recover time and position</w:t>
-      </w:r>
-      <w:r>
-        <w:rPr/>
-        <w:t xml:space="preserve">, or </w:t>
+        <w:t>The three angles have separate watch times</w:t>
+      </w:r>
+      <w:r>
+        <w:rPr/>
+        <w:t xml:space="preserve"> when the readings were not simultaneous. The lunar-distance date/time is the reference epoch. Enter Moon-altitude and body-altitude watch times separately. Times near midnight are interpreted as the nearest occurrence within twelve hours of the reference reading.</w:t>
+      </w:r>
+    </w:p>
+    <w:p>
+      <w:pPr>
+        <w:pStyle w:val="BodyText"/>
+        <w:bidi w:val="0"/>
+        <w:jc w:val="start"/>
+        <w:rPr/>
+      </w:pPr>
+      <w:r>
+        <w:rPr/>
+        <w:t xml:space="preserve">If the vessel moved materially, enable </w:t>
       </w:r>
       <w:r>
         <w:rPr>
           <w:rStyle w:val="Strong"/>
         </w:rPr>
-        <w:t>Recover time at known position</w:t>
-      </w:r>
-      <w:r>
-        <w:rPr/>
-        <w:t xml:space="preserve"> for a clock check at a trustworthy position. </w:t>
-      </w:r>
-    </w:p>
-    <w:p>
-      <w:pPr>
-        <w:pStyle w:val="BodyText"/>
-        <w:numPr>
-          <w:ilvl w:val="0"/>
-          <w:numId w:val="11"/>
-        </w:numPr>
-        <w:tabs>
-          <w:tab w:val="clear" w:pos="1134"/>
-          <w:tab w:val="left" w:pos="709" w:leader="none"/>
-        </w:tabs>
-        <w:bidi w:val="0"/>
-        <w:spacing w:before="0" w:after="0"/>
-        <w:ind w:hanging="283" w:start="709"/>
-        <w:jc w:val="start"/>
-        <w:rPr/>
-      </w:pPr>
-      <w:r>
-        <w:rPr/>
-        <w:t xml:space="preserve">Enter an initial/known position and a physically justified watch-correction search span. If the vessel moved over the session, enter true COG and SOG. </w:t>
-      </w:r>
-    </w:p>
-    <w:p>
-      <w:pPr>
-        <w:pStyle w:val="BodyText"/>
-        <w:numPr>
-          <w:ilvl w:val="0"/>
-          <w:numId w:val="11"/>
-        </w:numPr>
-        <w:tabs>
-          <w:tab w:val="clear" w:pos="1134"/>
-          <w:tab w:val="left" w:pos="709" w:leader="none"/>
-        </w:tabs>
-        <w:bidi w:val="0"/>
-        <w:spacing w:before="0" w:after="0"/>
-        <w:ind w:hanging="283" w:start="709"/>
-        <w:jc w:val="start"/>
-        <w:rPr/>
-      </w:pPr>
-      <w:r>
-        <w:rPr/>
-        <w:t xml:space="preserve">Normally retain </w:t>
-      </w:r>
-      <w:r>
-        <w:rPr>
-          <w:rStyle w:val="Strong"/>
-        </w:rPr>
-        <w:t>Robust fit</w:t>
-      </w:r>
-      <w:r>
-        <w:rPr/>
-        <w:t xml:space="preserve">. It reduces the leverage of a discrepant reading but still displays and flags every residual; it never deletes evidence. </w:t>
-      </w:r>
-    </w:p>
-    <w:p>
-      <w:pPr>
-        <w:pStyle w:val="BodyText"/>
-        <w:numPr>
-          <w:ilvl w:val="0"/>
-          <w:numId w:val="11"/>
-        </w:numPr>
-        <w:tabs>
-          <w:tab w:val="clear" w:pos="1134"/>
-          <w:tab w:val="left" w:pos="709" w:leader="none"/>
-        </w:tabs>
-        <w:bidi w:val="0"/>
-        <w:ind w:hanging="283" w:start="709"/>
-        <w:jc w:val="start"/>
-        <w:rPr/>
-      </w:pPr>
-      <w:r>
-        <w:rPr/>
-        <w:t xml:space="preserve">Solve, inspect all competitive candidates, angular and weighted RMS, formal uncertainties and every component residual before applying a watch correction. </w:t>
-      </w:r>
-    </w:p>
-    <w:p>
-      <w:pPr>
-        <w:pStyle w:val="BodyText"/>
-        <w:bidi w:val="0"/>
-        <w:jc w:val="start"/>
-        <w:rPr/>
-      </w:pPr>
-      <w:r>
-        <w:rPr/>
-        <w:t xml:space="preserve">The reported correction is additional to the correction already displayed by the plugin. </w:t>
-      </w:r>
-      <w:r>
-        <w:rPr>
-          <w:rStyle w:val="Strong"/>
-        </w:rPr>
-        <w:t>Apply watch correction</w:t>
-      </w:r>
-      <w:r>
-        <w:rPr/>
-        <w:t xml:space="preserve"> explicitly shows the resulting total and asks for confirmation. Raw watch timestamps remain in the observation record.</w:t>
-      </w:r>
-    </w:p>
-    <w:p>
-      <w:pPr>
-        <w:pStyle w:val="BodyText"/>
-        <w:bidi w:val="0"/>
-        <w:ind w:hanging="0" w:start="0" w:end="0"/>
-        <w:jc w:val="start"/>
-        <w:rPr/>
-      </w:pPr>
-      <w:r>
-        <w:rPr>
-          <w:rStyle w:val="Strong"/>
-          <w:shd w:fill="FFF0F0" w:val="clear"/>
-        </w:rPr>
-        <w:t>Do not select a pleasing minimum merely because it is numerical.</w:t>
-      </w:r>
-      <w:r>
-        <w:rPr>
-          <w:shd w:fill="FFF0F0" w:val="clear"/>
-        </w:rPr>
-        <w:t xml:space="preserve"> A high condition number, large uncertainty, competitive alternate solution or residual beyond three stated standard uncertainties requires more evidence. The optional common residual index-bias parameter is an advanced diagnostic; with too few observations it can trade against clock correction and should not be treated as a sextant calibration.</w:t>
+        <w:t>Advance vessel between readings</w:t>
+      </w:r>
+      <w:r>
+        <w:rPr/>
+        <w:t xml:space="preserve"> and enter true COG and SOG. The same unknown constant watch correction is applied to all three watch times; the intervals between them are preserved.</w:t>
       </w:r>
     </w:p>
     <w:p>
@@ -5500,156 +5493,7 @@
       </w:pPr>
       <w:r>
         <w:rPr/>
-        <w:t>12.6 Lunar pair planner</w:t>
-      </w:r>
-    </w:p>
-    <w:p>
-      <w:pPr>
-        <w:pStyle w:val="BodyText"/>
-        <w:bidi w:val="0"/>
-        <w:jc w:val="start"/>
-        <w:rPr/>
-      </w:pPr>
-      <w:r>
-        <w:rPr>
-          <w:rStyle w:val="Strong"/>
-        </w:rPr>
-        <w:t>Lunar Tools… → Lunar planner</w:t>
-      </w:r>
-      <w:r>
-        <w:rPr/>
-        <w:t xml:space="preserve"> ranks the offline body catalogue for a selected UTC and position. It displays Moon and body altitude, centre separation, distance rate in arcminutes per hour and the approximate time change corresponding to 0.1′ of distance. A small time value means useful time sensitivity. The quality text also penalises hidden/low bodies, awkward sextant angles, very unequal altitudes and faint stars.</w:t>
-      </w:r>
-    </w:p>
-    <w:p>
-      <w:pPr>
-        <w:pStyle w:val="BodyText"/>
-        <w:bidi w:val="0"/>
-        <w:jc w:val="start"/>
-        <w:rPr/>
-      </w:pPr>
-      <w:r>
-        <w:rPr/>
-        <w:t>The ranking is a planning aid, not a visibility guarantee. Cloud, Moon phase/glare, twilight, haze, telescope field, the chosen limb/contact and the observer's ability remain decisive. Recalculate at candidate times and choose a pair you can identify unambiguously.</w:t>
-      </w:r>
-    </w:p>
-    <w:p>
-      <w:pPr>
-        <w:pStyle w:val="Heading2"/>
-        <w:bidi w:val="0"/>
-        <w:jc w:val="start"/>
-        <w:rPr/>
-      </w:pPr>
-      <w:r>
-        <w:rPr/>
-        <w:t>12.7 Sextant observational checks and correction profiles</w:t>
-      </w:r>
-    </w:p>
-    <w:p>
-      <w:pPr>
-        <w:pStyle w:val="BodyText"/>
-        <w:bidi w:val="0"/>
-        <w:jc w:val="start"/>
-        <w:rPr/>
-      </w:pPr>
-      <w:r>
-        <w:rPr>
-          <w:rStyle w:val="Strong"/>
-        </w:rPr>
-        <w:t>Lunar Tools… → Sextant check</w:t>
-      </w:r>
-      <w:r>
-        <w:rPr/>
-        <w:t xml:space="preserve"> predicts the topocentric, refracted, apparent distance between two selected bodies for a stated UTC, position, pressure and temperature. Select centre-to-centre, near contact or far contact to match what was actually observed; limb contacts include the applicable semidiameters. Record repeated sextant readings, their uncertainty and any shade/note. The displayed correction is </w:t>
-      </w:r>
-      <w:r>
-        <w:rPr>
-          <w:rStyle w:val="Emphasis"/>
-        </w:rPr>
-        <w:t>predicted minus observed</w:t>
-      </w:r>
-      <w:r>
-        <w:rPr/>
-        <w:t>: add it to the raw reading.</w:t>
-      </w:r>
-    </w:p>
-    <w:p>
-      <w:pPr>
-        <w:pStyle w:val="BodyText"/>
-        <w:bidi w:val="0"/>
-        <w:jc w:val="start"/>
-        <w:rPr/>
-      </w:pPr>
-      <w:r>
-        <w:rPr/>
-        <w:t>For checking scale or centering behaviour, prefer well-identified stars at similar, comfortable altitudes and away from the horizon. Star–star checks largely avoid limb and parallax ambiguity. Moon–star, Moon–planet and Sun/Moon pairs are valuable end-to-end checks, but incorrect UTC, position, limb choice or atmospheric conditions can masquerade as instrument error.</w:t>
-      </w:r>
-    </w:p>
-    <w:p>
-      <w:pPr>
-        <w:pStyle w:val="BodyText"/>
-        <w:bidi w:val="0"/>
-        <w:jc w:val="start"/>
-        <w:rPr/>
-      </w:pPr>
-      <w:r>
-        <w:rPr>
-          <w:rStyle w:val="Strong"/>
-        </w:rPr>
-        <w:t>Build / save profile</w:t>
-      </w:r>
-      <w:r>
-        <w:rPr/>
-        <w:t xml:space="preserve"> groups repeated checks by angular range and stores correction points, uncertainty, repeatability, instrument name and serial number in the plugin configuration. Select a saved profile to display its interpolated correction at the currently entered observed angle. Between tested angles the plugin uses straight-line interpolation; beyond the tested range it clearly marks the nearest endpoint rather than inventing a polynomial trend. The table is advisory and does not alter saved sights automatically, preserving the raw record and its provenance.</w:t>
-      </w:r>
-    </w:p>
-    <w:p>
-      <w:pPr>
-        <w:pStyle w:val="BodyText"/>
-        <w:bidi w:val="0"/>
-        <w:ind w:hanging="0" w:start="0" w:end="0"/>
-        <w:jc w:val="start"/>
-        <w:rPr/>
-      </w:pPr>
-      <w:r>
-        <w:rPr>
-          <w:rStyle w:val="Strong"/>
-          <w:shd w:fill="FFF0F0" w:val="clear"/>
-        </w:rPr>
-        <w:t>A computed profile is not mechanical adjustment.</w:t>
-      </w:r>
-      <w:r>
-        <w:rPr>
-          <w:shd w:fill="FFF0F0" w:val="clear"/>
-        </w:rPr>
-        <w:t xml:space="preserve"> Follow the sextant maker's specified sequence—normally perpendicularity, side, collimation and index checks—before investigating graduation, centering or scale behaviour. A changing or irregular correction may indicate damage, technique, shades, temperature or an adjustment fault that software must not conceal.</w:t>
-      </w:r>
-    </w:p>
-    <w:p>
-      <w:pPr>
-        <w:pStyle w:val="Heading1"/>
-        <w:bidi w:val="0"/>
-        <w:ind w:hanging="0" w:start="0" w:end="0"/>
-        <w:jc w:val="start"/>
-        <w:rPr/>
-      </w:pPr>
-      <w:bookmarkStart w:id="18" w:name="horizon"/>
-      <w:bookmarkEnd w:id="18"/>
-      <w:r>
-        <w:rPr/>
-        <w:t>13. Sunrise and sunset horizon events</w:t>
-      </w:r>
-    </w:p>
-    <w:p>
-      <w:pPr>
-        <w:pStyle w:val="BodyText"/>
-        <w:bidi w:val="0"/>
-        <w:jc w:val="start"/>
-        <w:rPr/>
-      </w:pPr>
-      <w:r>
-        <w:rPr/>
-        <w:t>The Horizon Event workflow records first upper-limb appearance at sunrise or final upper-limb disappearance at sunset. Timing gives an approximate altitude constraint. An optional bearing adds a rough directional constraint.</w:t>
+        <w:t>12.3 Solving</w:t>
       </w:r>
     </w:p>
     <w:p>
@@ -5671,7 +5515,17 @@
       </w:pPr>
       <w:r>
         <w:rPr/>
-        <w:t xml:space="preserve">Select sunrise or sunset and enter/capture the UTC date and time. </w:t>
+        <w:t xml:space="preserve">Create a </w:t>
+      </w:r>
+      <w:r>
+        <w:rPr>
+          <w:rStyle w:val="Strong"/>
+        </w:rPr>
+        <w:t>Lunar</w:t>
+      </w:r>
+      <w:r>
+        <w:rPr/>
+        <w:t xml:space="preserve"> sight and select the second body. </w:t>
       </w:r>
     </w:p>
     <w:p>
@@ -5693,7 +5547,7 @@
       </w:pPr>
       <w:r>
         <w:rPr/>
-        <w:t xml:space="preserve">Record time uncertainty and identify the time source. </w:t>
+        <w:t xml:space="preserve">Enter LDOpc, near/centre/far contact and both body altitudes with correct limbs. </w:t>
       </w:r>
     </w:p>
     <w:p>
@@ -5715,7 +5569,7 @@
       </w:pPr>
       <w:r>
         <w:rPr/>
-        <w:t xml:space="preserve">If a bearing was taken, select magnetic compass or true bearing. </w:t>
+        <w:t xml:space="preserve">Enter one time or enable separate times as actually observed. </w:t>
       </w:r>
     </w:p>
     <w:p>
@@ -5737,7 +5591,7 @@
       </w:pPr>
       <w:r>
         <w:rPr/>
-        <w:t xml:space="preserve">For a magnetic observation, enter magnetic variation and compass deviation using the displayed E+/W− convention. </w:t>
+        <w:t xml:space="preserve">Set a plausible total UTC search span around the watch time. </w:t>
       </w:r>
     </w:p>
     <w:p>
@@ -5759,7 +5613,17 @@
       </w:pPr>
       <w:r>
         <w:rPr/>
-        <w:t xml:space="preserve">Enter bearing uncertainty, height of eye, pressure, temperature, horizon quality and horizon/refraction uncertainty. </w:t>
+        <w:t xml:space="preserve">Select </w:t>
+      </w:r>
+      <w:r>
+        <w:rPr>
+          <w:rStyle w:val="Strong"/>
+        </w:rPr>
+        <w:t>Time</w:t>
+      </w:r>
+      <w:r>
+        <w:rPr/>
+        <w:t xml:space="preserve">. Review all matching time candidates, clock correction, uncertainty and position candidates. </w:t>
       </w:r>
     </w:p>
     <w:p>
@@ -5768,6 +5632,593 @@
         <w:numPr>
           <w:ilvl w:val="0"/>
           <w:numId w:val="12"/>
+        </w:numPr>
+        <w:tabs>
+          <w:tab w:val="clear" w:pos="1134"/>
+          <w:tab w:val="left" w:pos="709" w:leader="none"/>
+        </w:tabs>
+        <w:bidi w:val="0"/>
+        <w:ind w:hanging="283" w:start="709"/>
+        <w:jc w:val="start"/>
+        <w:rPr/>
+      </w:pPr>
+      <w:r>
+        <w:rPr/>
+        <w:t xml:space="preserve">Use rough DR, hemisphere, an additional altitude sight or independent evidence to select the physical solution. </w:t>
+      </w:r>
+    </w:p>
+    <w:p>
+      <w:pPr>
+        <w:pStyle w:val="BodyText"/>
+        <w:bidi w:val="0"/>
+        <w:ind w:hanging="0" w:start="0" w:end="0"/>
+        <w:jc w:val="start"/>
+        <w:rPr/>
+      </w:pPr>
+      <w:r>
+        <w:rPr>
+          <w:rStyle w:val="Strong"/>
+          <w:shd w:fill="FFF0F0" w:val="clear"/>
+        </w:rPr>
+        <w:t>Lunar accuracy is demanding.</w:t>
+      </w:r>
+      <w:r>
+        <w:rPr>
+          <w:shd w:fill="FFF0F0" w:val="clear"/>
+        </w:rPr>
+        <w:t xml:space="preserve"> A lunar distance changes slowly enough that a small angular error can become a large time error. Sextant adjustment, side error, limb contact, refraction/parallax clearing and repeated observations matter substantially more than in an ordinary altitude sight.</w:t>
+      </w:r>
+    </w:p>
+    <w:p>
+      <w:pPr>
+        <w:pStyle w:val="Heading2"/>
+        <w:bidi w:val="0"/>
+        <w:jc w:val="start"/>
+        <w:rPr/>
+      </w:pPr>
+      <w:r>
+        <w:rPr/>
+        <w:t>12.4 Unknown UTC and longitude</w:t>
+      </w:r>
+    </w:p>
+    <w:p>
+      <w:pPr>
+        <w:pStyle w:val="BodyText"/>
+        <w:bidi w:val="0"/>
+        <w:jc w:val="start"/>
+        <w:rPr/>
+      </w:pPr>
+      <w:r>
+        <w:rPr/>
+        <w:t>The solver does not use the crude “15 degrees per hour” shortcut as a longitude answer. It searches clock correction and reference position jointly against the lunar distance and altitude constraints. More than one physical candidate can remain. Reported numerical convergence does not remove geometric ambiguity or observational uncertainty.</w:t>
+      </w:r>
+    </w:p>
+    <w:p>
+      <w:pPr>
+        <w:pStyle w:val="Heading2"/>
+        <w:bidi w:val="0"/>
+        <w:jc w:val="start"/>
+        <w:rPr/>
+      </w:pPr>
+      <w:r>
+        <w:rPr/>
+        <w:t>12.5 Joint lunar-sequence estimation</w:t>
+      </w:r>
+    </w:p>
+    <w:p>
+      <w:pPr>
+        <w:pStyle w:val="BodyText"/>
+        <w:bidi w:val="0"/>
+        <w:jc w:val="start"/>
+        <w:rPr/>
+      </w:pPr>
+      <w:r>
+        <w:rPr/>
+        <w:t>One lunar triple contains three measured angles and can solve three primary unknowns—constant watch correction, latitude and longitude—but it supplies almost no redundancy. Several timed triples are much more useful: one shared solution can reveal scatter, weak geometry, a competing time/position minimum or a reading that disagrees with the others.</w:t>
+      </w:r>
+    </w:p>
+    <w:p>
+      <w:pPr>
+        <w:pStyle w:val="BodyText"/>
+        <w:numPr>
+          <w:ilvl w:val="0"/>
+          <w:numId w:val="13"/>
+        </w:numPr>
+        <w:tabs>
+          <w:tab w:val="clear" w:pos="1134"/>
+          <w:tab w:val="left" w:pos="709" w:leader="none"/>
+        </w:tabs>
+        <w:bidi w:val="0"/>
+        <w:spacing w:before="0" w:after="0"/>
+        <w:ind w:hanging="283" w:start="709"/>
+        <w:jc w:val="start"/>
+        <w:rPr/>
+      </w:pPr>
+      <w:r>
+        <w:rPr/>
+        <w:t xml:space="preserve">Save at least two complete </w:t>
+      </w:r>
+      <w:r>
+        <w:rPr>
+          <w:rStyle w:val="Strong"/>
+        </w:rPr>
+        <w:t>Lunar</w:t>
+      </w:r>
+      <w:r>
+        <w:rPr/>
+        <w:t xml:space="preserve"> sights. Use each sight's separate-time controls whenever the three angles were not simultaneous. </w:t>
+      </w:r>
+    </w:p>
+    <w:p>
+      <w:pPr>
+        <w:pStyle w:val="BodyText"/>
+        <w:numPr>
+          <w:ilvl w:val="0"/>
+          <w:numId w:val="13"/>
+        </w:numPr>
+        <w:tabs>
+          <w:tab w:val="clear" w:pos="1134"/>
+          <w:tab w:val="left" w:pos="709" w:leader="none"/>
+        </w:tabs>
+        <w:bidi w:val="0"/>
+        <w:spacing w:before="0" w:after="0"/>
+        <w:ind w:hanging="283" w:start="709"/>
+        <w:jc w:val="start"/>
+        <w:rPr/>
+      </w:pPr>
+      <w:r>
+        <w:rPr/>
+        <w:t xml:space="preserve">Select </w:t>
+      </w:r>
+      <w:r>
+        <w:rPr>
+          <w:rStyle w:val="Strong"/>
+        </w:rPr>
+        <w:t>Lunar Tools… → Lunar sequence</w:t>
+      </w:r>
+      <w:r>
+        <w:rPr/>
+        <w:t xml:space="preserve"> and tick the observations belonging to one watch/session. </w:t>
+      </w:r>
+    </w:p>
+    <w:p>
+      <w:pPr>
+        <w:pStyle w:val="BodyText"/>
+        <w:numPr>
+          <w:ilvl w:val="0"/>
+          <w:numId w:val="13"/>
+        </w:numPr>
+        <w:tabs>
+          <w:tab w:val="clear" w:pos="1134"/>
+          <w:tab w:val="left" w:pos="709" w:leader="none"/>
+        </w:tabs>
+        <w:bidi w:val="0"/>
+        <w:spacing w:before="0" w:after="0"/>
+        <w:ind w:hanging="283" w:start="709"/>
+        <w:jc w:val="start"/>
+        <w:rPr/>
+      </w:pPr>
+      <w:r>
+        <w:rPr/>
+        <w:t xml:space="preserve">Choose </w:t>
+      </w:r>
+      <w:r>
+        <w:rPr>
+          <w:rStyle w:val="Strong"/>
+        </w:rPr>
+        <w:t>Recover time and position</w:t>
+      </w:r>
+      <w:r>
+        <w:rPr/>
+        <w:t xml:space="preserve">, or </w:t>
+      </w:r>
+      <w:r>
+        <w:rPr>
+          <w:rStyle w:val="Strong"/>
+        </w:rPr>
+        <w:t>Recover time at known position</w:t>
+      </w:r>
+      <w:r>
+        <w:rPr/>
+        <w:t xml:space="preserve"> for a clock check at a trustworthy position. </w:t>
+      </w:r>
+    </w:p>
+    <w:p>
+      <w:pPr>
+        <w:pStyle w:val="BodyText"/>
+        <w:numPr>
+          <w:ilvl w:val="0"/>
+          <w:numId w:val="13"/>
+        </w:numPr>
+        <w:tabs>
+          <w:tab w:val="clear" w:pos="1134"/>
+          <w:tab w:val="left" w:pos="709" w:leader="none"/>
+        </w:tabs>
+        <w:bidi w:val="0"/>
+        <w:spacing w:before="0" w:after="0"/>
+        <w:ind w:hanging="283" w:start="709"/>
+        <w:jc w:val="start"/>
+        <w:rPr/>
+      </w:pPr>
+      <w:r>
+        <w:rPr/>
+        <w:t xml:space="preserve">Enter an initial/known position and a physically justified watch-correction search span. If the vessel moved over the session, enter true COG and SOG. </w:t>
+      </w:r>
+    </w:p>
+    <w:p>
+      <w:pPr>
+        <w:pStyle w:val="BodyText"/>
+        <w:numPr>
+          <w:ilvl w:val="0"/>
+          <w:numId w:val="13"/>
+        </w:numPr>
+        <w:tabs>
+          <w:tab w:val="clear" w:pos="1134"/>
+          <w:tab w:val="left" w:pos="709" w:leader="none"/>
+        </w:tabs>
+        <w:bidi w:val="0"/>
+        <w:spacing w:before="0" w:after="0"/>
+        <w:ind w:hanging="283" w:start="709"/>
+        <w:jc w:val="start"/>
+        <w:rPr/>
+      </w:pPr>
+      <w:r>
+        <w:rPr/>
+        <w:t xml:space="preserve">Normally retain </w:t>
+      </w:r>
+      <w:r>
+        <w:rPr>
+          <w:rStyle w:val="Strong"/>
+        </w:rPr>
+        <w:t>Robust fit</w:t>
+      </w:r>
+      <w:r>
+        <w:rPr/>
+        <w:t xml:space="preserve">. It reduces the leverage of a discrepant reading but still displays and flags every residual; it never deletes evidence. </w:t>
+      </w:r>
+    </w:p>
+    <w:p>
+      <w:pPr>
+        <w:pStyle w:val="BodyText"/>
+        <w:numPr>
+          <w:ilvl w:val="0"/>
+          <w:numId w:val="13"/>
+        </w:numPr>
+        <w:tabs>
+          <w:tab w:val="clear" w:pos="1134"/>
+          <w:tab w:val="left" w:pos="709" w:leader="none"/>
+        </w:tabs>
+        <w:bidi w:val="0"/>
+        <w:ind w:hanging="283" w:start="709"/>
+        <w:jc w:val="start"/>
+        <w:rPr/>
+      </w:pPr>
+      <w:r>
+        <w:rPr/>
+        <w:t xml:space="preserve">Solve, inspect all competitive candidates, angular and weighted RMS, formal uncertainties and every component residual before applying a watch correction. </w:t>
+      </w:r>
+    </w:p>
+    <w:p>
+      <w:pPr>
+        <w:pStyle w:val="BodyText"/>
+        <w:bidi w:val="0"/>
+        <w:jc w:val="start"/>
+        <w:rPr/>
+      </w:pPr>
+      <w:r>
+        <w:rPr/>
+        <w:t xml:space="preserve">The reported correction is additional to the correction already displayed by the plugin. </w:t>
+      </w:r>
+      <w:r>
+        <w:rPr>
+          <w:rStyle w:val="Strong"/>
+        </w:rPr>
+        <w:t>Apply watch correction</w:t>
+      </w:r>
+      <w:r>
+        <w:rPr/>
+        <w:t xml:space="preserve"> explicitly shows the resulting total and asks for confirmation. Raw watch timestamps remain in the observation record.</w:t>
+      </w:r>
+    </w:p>
+    <w:p>
+      <w:pPr>
+        <w:pStyle w:val="BodyText"/>
+        <w:bidi w:val="0"/>
+        <w:ind w:hanging="0" w:start="0" w:end="0"/>
+        <w:jc w:val="start"/>
+        <w:rPr/>
+      </w:pPr>
+      <w:r>
+        <w:rPr>
+          <w:rStyle w:val="Strong"/>
+          <w:shd w:fill="FFF0F0" w:val="clear"/>
+        </w:rPr>
+        <w:t>Do not select a pleasing minimum merely because it is numerical.</w:t>
+      </w:r>
+      <w:r>
+        <w:rPr>
+          <w:shd w:fill="FFF0F0" w:val="clear"/>
+        </w:rPr>
+        <w:t xml:space="preserve"> A high condition number, large uncertainty, competitive alternate solution or residual beyond three stated standard uncertainties requires more evidence. The optional common residual index-bias parameter is an advanced diagnostic; with too few observations it can trade against clock correction and should not be treated as a sextant calibration.</w:t>
+      </w:r>
+    </w:p>
+    <w:p>
+      <w:pPr>
+        <w:pStyle w:val="Heading2"/>
+        <w:bidi w:val="0"/>
+        <w:jc w:val="start"/>
+        <w:rPr/>
+      </w:pPr>
+      <w:r>
+        <w:rPr/>
+        <w:t>12.6 Lunar pair planner</w:t>
+      </w:r>
+    </w:p>
+    <w:p>
+      <w:pPr>
+        <w:pStyle w:val="BodyText"/>
+        <w:bidi w:val="0"/>
+        <w:jc w:val="start"/>
+        <w:rPr/>
+      </w:pPr>
+      <w:r>
+        <w:rPr>
+          <w:rStyle w:val="Strong"/>
+        </w:rPr>
+        <w:t>Lunar Tools… → Lunar planner</w:t>
+      </w:r>
+      <w:r>
+        <w:rPr/>
+        <w:t xml:space="preserve"> ranks the offline body catalogue for a selected UTC and position. It displays Moon and body altitude, centre separation, distance rate in arcminutes per hour and the approximate time change corresponding to 0.1′ of distance. A small time value means useful time sensitivity. The quality text also penalises hidden/low bodies, awkward sextant angles, very unequal altitudes and faint stars.</w:t>
+      </w:r>
+    </w:p>
+    <w:p>
+      <w:pPr>
+        <w:pStyle w:val="BodyText"/>
+        <w:bidi w:val="0"/>
+        <w:jc w:val="start"/>
+        <w:rPr/>
+      </w:pPr>
+      <w:r>
+        <w:rPr/>
+        <w:t>The ranking is a planning aid, not a visibility guarantee. Cloud, Moon phase/glare, twilight, haze, telescope field, the chosen limb/contact and the observer's ability remain decisive. Recalculate at candidate times and choose a pair you can identify unambiguously.</w:t>
+      </w:r>
+    </w:p>
+    <w:p>
+      <w:pPr>
+        <w:pStyle w:val="Heading2"/>
+        <w:bidi w:val="0"/>
+        <w:jc w:val="start"/>
+        <w:rPr/>
+      </w:pPr>
+      <w:r>
+        <w:rPr/>
+        <w:t>12.7 Sextant observational checks and correction profiles</w:t>
+      </w:r>
+    </w:p>
+    <w:p>
+      <w:pPr>
+        <w:pStyle w:val="BodyText"/>
+        <w:bidi w:val="0"/>
+        <w:jc w:val="start"/>
+        <w:rPr/>
+      </w:pPr>
+      <w:r>
+        <w:rPr>
+          <w:rStyle w:val="Strong"/>
+        </w:rPr>
+        <w:t>Lunar Tools… → Sextant check</w:t>
+      </w:r>
+      <w:r>
+        <w:rPr/>
+        <w:t xml:space="preserve"> predicts the topocentric, refracted, apparent distance between two selected bodies for a stated UTC, position, pressure and temperature. Select centre-to-centre, near contact or far contact to match what was actually observed; limb contacts include the applicable semidiameters. Record repeated sextant readings, their uncertainty and any shade/note. The displayed correction is </w:t>
+      </w:r>
+      <w:r>
+        <w:rPr>
+          <w:rStyle w:val="Emphasis"/>
+        </w:rPr>
+        <w:t>predicted minus observed</w:t>
+      </w:r>
+      <w:r>
+        <w:rPr/>
+        <w:t>: add it to the raw reading.</w:t>
+      </w:r>
+    </w:p>
+    <w:p>
+      <w:pPr>
+        <w:pStyle w:val="BodyText"/>
+        <w:bidi w:val="0"/>
+        <w:jc w:val="start"/>
+        <w:rPr/>
+      </w:pPr>
+      <w:r>
+        <w:rPr/>
+        <w:t>For checking scale or centering behaviour, prefer well-identified stars at similar, comfortable altitudes and away from the horizon. Star–star checks largely avoid limb and parallax ambiguity. Moon–star, Moon–planet and Sun/Moon pairs are valuable end-to-end checks, but incorrect UTC, position, limb choice or atmospheric conditions can masquerade as instrument error.</w:t>
+      </w:r>
+    </w:p>
+    <w:p>
+      <w:pPr>
+        <w:pStyle w:val="BodyText"/>
+        <w:bidi w:val="0"/>
+        <w:jc w:val="start"/>
+        <w:rPr/>
+      </w:pPr>
+      <w:r>
+        <w:rPr>
+          <w:rStyle w:val="Strong"/>
+        </w:rPr>
+        <w:t>Build / save profile</w:t>
+      </w:r>
+      <w:r>
+        <w:rPr/>
+        <w:t xml:space="preserve"> groups repeated checks by angular range and stores correction points, uncertainty, repeatability, instrument name and serial number in the plugin configuration. Select a saved profile to display its interpolated correction at the currently entered observed angle. Between tested angles the plugin uses straight-line interpolation; beyond the tested range it clearly marks the nearest endpoint rather than inventing a polynomial trend. The table is advisory and does not alter saved sights automatically, preserving the raw record and its provenance.</w:t>
+      </w:r>
+    </w:p>
+    <w:p>
+      <w:pPr>
+        <w:pStyle w:val="BodyText"/>
+        <w:bidi w:val="0"/>
+        <w:ind w:hanging="0" w:start="0" w:end="0"/>
+        <w:jc w:val="start"/>
+        <w:rPr/>
+      </w:pPr>
+      <w:r>
+        <w:rPr>
+          <w:rStyle w:val="Strong"/>
+          <w:shd w:fill="FFF0F0" w:val="clear"/>
+        </w:rPr>
+        <w:t>A computed profile is not mechanical adjustment.</w:t>
+      </w:r>
+      <w:r>
+        <w:rPr>
+          <w:shd w:fill="FFF0F0" w:val="clear"/>
+        </w:rPr>
+        <w:t xml:space="preserve"> Follow the sextant maker's specified sequence—normally perpendicularity, side, collimation and index checks—before investigating graduation, centering or scale behaviour. A changing or irregular correction may indicate damage, technique, shades, temperature or an adjustment fault that software must not conceal.</w:t>
+      </w:r>
+    </w:p>
+    <w:p>
+      <w:pPr>
+        <w:pStyle w:val="Heading1"/>
+        <w:bidi w:val="0"/>
+        <w:ind w:hanging="0" w:start="0" w:end="0"/>
+        <w:jc w:val="start"/>
+        <w:rPr/>
+      </w:pPr>
+      <w:bookmarkStart w:id="18" w:name="horizon"/>
+      <w:bookmarkEnd w:id="18"/>
+      <w:r>
+        <w:rPr/>
+        <w:t>13. Sunrise and sunset horizon events</w:t>
+      </w:r>
+    </w:p>
+    <w:p>
+      <w:pPr>
+        <w:pStyle w:val="BodyText"/>
+        <w:bidi w:val="0"/>
+        <w:jc w:val="start"/>
+        <w:rPr/>
+      </w:pPr>
+      <w:r>
+        <w:rPr/>
+        <w:t>The Horizon Event workflow records first upper-limb appearance at sunrise or final upper-limb disappearance at sunset. Timing gives an approximate altitude constraint. An optional bearing adds a rough directional constraint.</w:t>
+      </w:r>
+    </w:p>
+    <w:p>
+      <w:pPr>
+        <w:pStyle w:val="BodyText"/>
+        <w:numPr>
+          <w:ilvl w:val="0"/>
+          <w:numId w:val="14"/>
+        </w:numPr>
+        <w:tabs>
+          <w:tab w:val="clear" w:pos="1134"/>
+          <w:tab w:val="left" w:pos="709" w:leader="none"/>
+        </w:tabs>
+        <w:bidi w:val="0"/>
+        <w:spacing w:before="0" w:after="0"/>
+        <w:ind w:hanging="283" w:start="709"/>
+        <w:jc w:val="start"/>
+        <w:rPr/>
+      </w:pPr>
+      <w:r>
+        <w:rPr/>
+        <w:t xml:space="preserve">Select sunrise or sunset and enter/capture the UTC date and time. </w:t>
+      </w:r>
+    </w:p>
+    <w:p>
+      <w:pPr>
+        <w:pStyle w:val="BodyText"/>
+        <w:numPr>
+          <w:ilvl w:val="0"/>
+          <w:numId w:val="14"/>
+        </w:numPr>
+        <w:tabs>
+          <w:tab w:val="clear" w:pos="1134"/>
+          <w:tab w:val="left" w:pos="709" w:leader="none"/>
+        </w:tabs>
+        <w:bidi w:val="0"/>
+        <w:spacing w:before="0" w:after="0"/>
+        <w:ind w:hanging="283" w:start="709"/>
+        <w:jc w:val="start"/>
+        <w:rPr/>
+      </w:pPr>
+      <w:r>
+        <w:rPr/>
+        <w:t xml:space="preserve">Record time uncertainty and identify the time source. </w:t>
+      </w:r>
+    </w:p>
+    <w:p>
+      <w:pPr>
+        <w:pStyle w:val="BodyText"/>
+        <w:numPr>
+          <w:ilvl w:val="0"/>
+          <w:numId w:val="14"/>
+        </w:numPr>
+        <w:tabs>
+          <w:tab w:val="clear" w:pos="1134"/>
+          <w:tab w:val="left" w:pos="709" w:leader="none"/>
+        </w:tabs>
+        <w:bidi w:val="0"/>
+        <w:spacing w:before="0" w:after="0"/>
+        <w:ind w:hanging="283" w:start="709"/>
+        <w:jc w:val="start"/>
+        <w:rPr/>
+      </w:pPr>
+      <w:r>
+        <w:rPr/>
+        <w:t xml:space="preserve">If a bearing was taken, select magnetic compass or true bearing. </w:t>
+      </w:r>
+    </w:p>
+    <w:p>
+      <w:pPr>
+        <w:pStyle w:val="BodyText"/>
+        <w:numPr>
+          <w:ilvl w:val="0"/>
+          <w:numId w:val="14"/>
+        </w:numPr>
+        <w:tabs>
+          <w:tab w:val="clear" w:pos="1134"/>
+          <w:tab w:val="left" w:pos="709" w:leader="none"/>
+        </w:tabs>
+        <w:bidi w:val="0"/>
+        <w:spacing w:before="0" w:after="0"/>
+        <w:ind w:hanging="283" w:start="709"/>
+        <w:jc w:val="start"/>
+        <w:rPr/>
+      </w:pPr>
+      <w:r>
+        <w:rPr/>
+        <w:t xml:space="preserve">For a magnetic observation, enter magnetic variation and compass deviation using the displayed E+/W− convention. </w:t>
+      </w:r>
+    </w:p>
+    <w:p>
+      <w:pPr>
+        <w:pStyle w:val="BodyText"/>
+        <w:numPr>
+          <w:ilvl w:val="0"/>
+          <w:numId w:val="14"/>
+        </w:numPr>
+        <w:tabs>
+          <w:tab w:val="clear" w:pos="1134"/>
+          <w:tab w:val="left" w:pos="709" w:leader="none"/>
+        </w:tabs>
+        <w:bidi w:val="0"/>
+        <w:spacing w:before="0" w:after="0"/>
+        <w:ind w:hanging="283" w:start="709"/>
+        <w:jc w:val="start"/>
+        <w:rPr/>
+      </w:pPr>
+      <w:r>
+        <w:rPr/>
+        <w:t xml:space="preserve">Enter bearing uncertainty, height of eye, pressure, temperature, horizon quality and horizon/refraction uncertainty. </w:t>
+      </w:r>
+    </w:p>
+    <w:p>
+      <w:pPr>
+        <w:pStyle w:val="BodyText"/>
+        <w:numPr>
+          <w:ilvl w:val="0"/>
+          <w:numId w:val="14"/>
         </w:numPr>
         <w:tabs>
           <w:tab w:val="clear" w:pos="1134"/>
@@ -6031,7 +6482,7 @@
         <w:pStyle w:val="BodyText"/>
         <w:numPr>
           <w:ilvl w:val="0"/>
-          <w:numId w:val="13"/>
+          <w:numId w:val="15"/>
         </w:numPr>
         <w:tabs>
           <w:tab w:val="clear" w:pos="1134"/>
@@ -6059,7 +6510,7 @@
         <w:pStyle w:val="BodyText"/>
         <w:numPr>
           <w:ilvl w:val="0"/>
-          <w:numId w:val="13"/>
+          <w:numId w:val="15"/>
         </w:numPr>
         <w:tabs>
           <w:tab w:val="clear" w:pos="1134"/>
@@ -6087,7 +6538,7 @@
         <w:pStyle w:val="BodyText"/>
         <w:numPr>
           <w:ilvl w:val="0"/>
-          <w:numId w:val="13"/>
+          <w:numId w:val="15"/>
         </w:numPr>
         <w:tabs>
           <w:tab w:val="clear" w:pos="1134"/>
@@ -6126,7 +6577,7 @@
         <w:pStyle w:val="BodyText"/>
         <w:numPr>
           <w:ilvl w:val="0"/>
-          <w:numId w:val="14"/>
+          <w:numId w:val="16"/>
         </w:numPr>
         <w:tabs>
           <w:tab w:val="clear" w:pos="1134"/>
@@ -6158,7 +6609,7 @@
         <w:pStyle w:val="BodyText"/>
         <w:numPr>
           <w:ilvl w:val="0"/>
-          <w:numId w:val="14"/>
+          <w:numId w:val="16"/>
         </w:numPr>
         <w:tabs>
           <w:tab w:val="clear" w:pos="1134"/>
@@ -6190,7 +6641,7 @@
         <w:pStyle w:val="BodyText"/>
         <w:numPr>
           <w:ilvl w:val="0"/>
-          <w:numId w:val="14"/>
+          <w:numId w:val="16"/>
         </w:numPr>
         <w:tabs>
           <w:tab w:val="clear" w:pos="1134"/>
@@ -6212,7 +6663,7 @@
         <w:pStyle w:val="BodyText"/>
         <w:numPr>
           <w:ilvl w:val="0"/>
-          <w:numId w:val="14"/>
+          <w:numId w:val="16"/>
         </w:numPr>
         <w:tabs>
           <w:tab w:val="clear" w:pos="1134"/>
@@ -6254,7 +6705,7 @@
         <w:pStyle w:val="BodyText"/>
         <w:numPr>
           <w:ilvl w:val="0"/>
-          <w:numId w:val="14"/>
+          <w:numId w:val="16"/>
         </w:numPr>
         <w:tabs>
           <w:tab w:val="clear" w:pos="1134"/>
@@ -6286,7 +6737,7 @@
         <w:pStyle w:val="BodyText"/>
         <w:numPr>
           <w:ilvl w:val="0"/>
-          <w:numId w:val="14"/>
+          <w:numId w:val="16"/>
         </w:numPr>
         <w:tabs>
           <w:tab w:val="clear" w:pos="1134"/>
@@ -7013,7 +7464,7 @@
         <w:pStyle w:val="BodyText"/>
         <w:numPr>
           <w:ilvl w:val="0"/>
-          <w:numId w:val="15"/>
+          <w:numId w:val="17"/>
         </w:numPr>
         <w:tabs>
           <w:tab w:val="clear" w:pos="1134"/>
@@ -7035,7 +7486,7 @@
         <w:pStyle w:val="BodyText"/>
         <w:numPr>
           <w:ilvl w:val="0"/>
-          <w:numId w:val="15"/>
+          <w:numId w:val="17"/>
         </w:numPr>
         <w:tabs>
           <w:tab w:val="clear" w:pos="1134"/>
@@ -7057,7 +7508,7 @@
         <w:pStyle w:val="BodyText"/>
         <w:numPr>
           <w:ilvl w:val="0"/>
-          <w:numId w:val="15"/>
+          <w:numId w:val="17"/>
         </w:numPr>
         <w:tabs>
           <w:tab w:val="clear" w:pos="1134"/>
@@ -7079,7 +7530,7 @@
         <w:pStyle w:val="BodyText"/>
         <w:numPr>
           <w:ilvl w:val="0"/>
-          <w:numId w:val="15"/>
+          <w:numId w:val="17"/>
         </w:numPr>
         <w:tabs>
           <w:tab w:val="clear" w:pos="1134"/>
@@ -7101,7 +7552,7 @@
         <w:pStyle w:val="BodyText"/>
         <w:numPr>
           <w:ilvl w:val="0"/>
-          <w:numId w:val="15"/>
+          <w:numId w:val="17"/>
         </w:numPr>
         <w:tabs>
           <w:tab w:val="clear" w:pos="1134"/>
@@ -9882,6 +10333,32 @@
         <w:rPr>
           <w:rStyle w:val="Strong"/>
         </w:rPr>
+        <w:t>Calculator-complete backup</w:t>
+      </w:r>
+    </w:p>
+    <w:p>
+      <w:pPr>
+        <w:pStyle w:val="ListContents"/>
+        <w:bidi w:val="0"/>
+        <w:jc w:val="start"/>
+        <w:rPr/>
+      </w:pPr>
+      <w:r>
+        <w:rPr/>
+        <w:t xml:space="preserve">A document containing the ephemeris, corrections, formulae and procedures required to reduce its supported sights using a scientific calculator. It is not calculator-free and does not replace observation instruments, timekeeping, plotting tools or training. </w:t>
+      </w:r>
+    </w:p>
+    <w:p>
+      <w:pPr>
+        <w:pStyle w:val="ListHeading"/>
+        <w:bidi w:val="0"/>
+        <w:jc w:val="start"/>
+        <w:rPr/>
+      </w:pPr>
+      <w:r>
+        <w:rPr>
+          <w:rStyle w:val="Strong"/>
+        </w:rPr>
         <w:t>Celestial equator</w:t>
       </w:r>
     </w:p>
@@ -10181,6 +10658,32 @@
       <w:r>
         <w:rPr/>
         <w:t xml:space="preserve">A documented set of angle-dependent corrections derived from repeated checks of one identified instrument. It supplements, and must not replace, proper mechanical adjustment. </w:t>
+      </w:r>
+    </w:p>
+    <w:p>
+      <w:pPr>
+        <w:pStyle w:val="ListHeading"/>
+        <w:bidi w:val="0"/>
+        <w:jc w:val="start"/>
+        <w:rPr/>
+      </w:pPr>
+      <w:r>
+        <w:rPr>
+          <w:rStyle w:val="Strong"/>
+        </w:rPr>
+        <w:t>Coverage corridor</w:t>
+      </w:r>
+    </w:p>
+    <w:p>
+      <w:pPr>
+        <w:pStyle w:val="ListContents"/>
+        <w:bidi w:val="0"/>
+        <w:jc w:val="start"/>
+        <w:rPr/>
+      </w:pPr>
+      <w:r>
+        <w:rPr/>
+        <w:t xml:space="preserve">The stated cross-track region around a planned route within which location-dependent planning results are intended to remain relevant. It does not limit universal GHA, SHA or declination data. </w:t>
       </w:r>
     </w:p>
     <w:p>
@@ -11659,7 +12162,7 @@
         <w:pStyle w:val="BodyText"/>
         <w:numPr>
           <w:ilvl w:val="0"/>
-          <w:numId w:val="16"/>
+          <w:numId w:val="18"/>
         </w:numPr>
         <w:tabs>
           <w:tab w:val="clear" w:pos="1134"/>
@@ -11681,7 +12184,7 @@
         <w:pStyle w:val="BodyText"/>
         <w:numPr>
           <w:ilvl w:val="0"/>
-          <w:numId w:val="16"/>
+          <w:numId w:val="18"/>
         </w:numPr>
         <w:tabs>
           <w:tab w:val="clear" w:pos="1134"/>
@@ -11703,7 +12206,7 @@
         <w:pStyle w:val="BodyText"/>
         <w:numPr>
           <w:ilvl w:val="0"/>
-          <w:numId w:val="16"/>
+          <w:numId w:val="18"/>
         </w:numPr>
         <w:tabs>
           <w:tab w:val="clear" w:pos="1134"/>
@@ -11725,7 +12228,7 @@
         <w:pStyle w:val="BodyText"/>
         <w:numPr>
           <w:ilvl w:val="0"/>
-          <w:numId w:val="16"/>
+          <w:numId w:val="18"/>
         </w:numPr>
         <w:tabs>
           <w:tab w:val="clear" w:pos="1134"/>
@@ -12056,7 +12559,7 @@
         <w:pStyle w:val="BodyText"/>
         <w:numPr>
           <w:ilvl w:val="0"/>
-          <w:numId w:val="17"/>
+          <w:numId w:val="19"/>
         </w:numPr>
         <w:tabs>
           <w:tab w:val="clear" w:pos="1134"/>
@@ -12100,7 +12603,7 @@
         <w:pStyle w:val="BodyText"/>
         <w:numPr>
           <w:ilvl w:val="0"/>
-          <w:numId w:val="17"/>
+          <w:numId w:val="19"/>
         </w:numPr>
         <w:tabs>
           <w:tab w:val="clear" w:pos="1134"/>
@@ -12144,7 +12647,7 @@
         <w:pStyle w:val="BodyText"/>
         <w:numPr>
           <w:ilvl w:val="0"/>
-          <w:numId w:val="17"/>
+          <w:numId w:val="19"/>
         </w:numPr>
         <w:tabs>
           <w:tab w:val="clear" w:pos="1134"/>
@@ -12188,7 +12691,7 @@
         <w:pStyle w:val="BodyText"/>
         <w:numPr>
           <w:ilvl w:val="0"/>
-          <w:numId w:val="17"/>
+          <w:numId w:val="19"/>
         </w:numPr>
         <w:tabs>
           <w:tab w:val="clear" w:pos="1134"/>
@@ -12232,7 +12735,7 @@
         <w:pStyle w:val="BodyText"/>
         <w:numPr>
           <w:ilvl w:val="0"/>
-          <w:numId w:val="17"/>
+          <w:numId w:val="19"/>
         </w:numPr>
         <w:tabs>
           <w:tab w:val="clear" w:pos="1134"/>
@@ -12266,7 +12769,7 @@
         <w:pStyle w:val="BodyText"/>
         <w:numPr>
           <w:ilvl w:val="0"/>
-          <w:numId w:val="17"/>
+          <w:numId w:val="19"/>
         </w:numPr>
         <w:tabs>
           <w:tab w:val="clear" w:pos="1134"/>
@@ -13218,8 +13721,8 @@
   <w:abstractNum w:abstractNumId="8">
     <w:lvl w:ilvl="0">
       <w:start w:val="1"/>
-      <w:numFmt w:val="decimal"/>
-      <w:lvlText w:val="%1."/>
+      <w:numFmt w:val="bullet"/>
+      <w:lvlText w:val=""/>
       <w:lvlJc w:val="start"/>
       <w:pPr>
         <w:tabs>
@@ -13227,12 +13730,14 @@
         </w:tabs>
         <w:ind w:start="709" w:hanging="283"/>
       </w:pPr>
-      <w:rPr/>
+      <w:rPr>
+        <w:rFonts w:ascii="Symbol" w:hAnsi="Symbol" w:cs="Symbol" w:hint="default"/>
+      </w:rPr>
     </w:lvl>
     <w:lvl w:ilvl="1">
       <w:start w:val="1"/>
-      <w:numFmt w:val="decimal"/>
-      <w:lvlText w:val="%2."/>
+      <w:numFmt w:val="bullet"/>
+      <w:lvlText w:val=""/>
       <w:lvlJc w:val="start"/>
       <w:pPr>
         <w:tabs>
@@ -13240,12 +13745,14 @@
         </w:tabs>
         <w:ind w:start="1418" w:hanging="283"/>
       </w:pPr>
-      <w:rPr/>
+      <w:rPr>
+        <w:rFonts w:ascii="Symbol" w:hAnsi="Symbol" w:cs="Symbol" w:hint="default"/>
+      </w:rPr>
     </w:lvl>
     <w:lvl w:ilvl="2">
       <w:start w:val="1"/>
-      <w:numFmt w:val="decimal"/>
-      <w:lvlText w:val="%3."/>
+      <w:numFmt w:val="bullet"/>
+      <w:lvlText w:val=""/>
       <w:lvlJc w:val="start"/>
       <w:pPr>
         <w:tabs>
@@ -13253,12 +13760,14 @@
         </w:tabs>
         <w:ind w:start="2127" w:hanging="283"/>
       </w:pPr>
-      <w:rPr/>
+      <w:rPr>
+        <w:rFonts w:ascii="Symbol" w:hAnsi="Symbol" w:cs="Symbol" w:hint="default"/>
+      </w:rPr>
     </w:lvl>
     <w:lvl w:ilvl="3">
       <w:start w:val="1"/>
-      <w:numFmt w:val="decimal"/>
-      <w:lvlText w:val="%4."/>
+      <w:numFmt w:val="bullet"/>
+      <w:lvlText w:val=""/>
       <w:lvlJc w:val="start"/>
       <w:pPr>
         <w:tabs>
@@ -13266,12 +13775,14 @@
         </w:tabs>
         <w:ind w:start="2836" w:hanging="283"/>
       </w:pPr>
-      <w:rPr/>
+      <w:rPr>
+        <w:rFonts w:ascii="Symbol" w:hAnsi="Symbol" w:cs="Symbol" w:hint="default"/>
+      </w:rPr>
     </w:lvl>
     <w:lvl w:ilvl="4">
       <w:start w:val="1"/>
-      <w:numFmt w:val="decimal"/>
-      <w:lvlText w:val="%5."/>
+      <w:numFmt w:val="bullet"/>
+      <w:lvlText w:val=""/>
       <w:lvlJc w:val="start"/>
       <w:pPr>
         <w:tabs>
@@ -13279,12 +13790,14 @@
         </w:tabs>
         <w:ind w:start="3545" w:hanging="283"/>
       </w:pPr>
-      <w:rPr/>
+      <w:rPr>
+        <w:rFonts w:ascii="Symbol" w:hAnsi="Symbol" w:cs="Symbol" w:hint="default"/>
+      </w:rPr>
     </w:lvl>
     <w:lvl w:ilvl="5">
       <w:start w:val="1"/>
-      <w:numFmt w:val="decimal"/>
-      <w:lvlText w:val="%6."/>
+      <w:numFmt w:val="bullet"/>
+      <w:lvlText w:val=""/>
       <w:lvlJc w:val="start"/>
       <w:pPr>
         <w:tabs>
@@ -13292,12 +13805,14 @@
         </w:tabs>
         <w:ind w:start="4254" w:hanging="283"/>
       </w:pPr>
-      <w:rPr/>
+      <w:rPr>
+        <w:rFonts w:ascii="Symbol" w:hAnsi="Symbol" w:cs="Symbol" w:hint="default"/>
+      </w:rPr>
     </w:lvl>
     <w:lvl w:ilvl="6">
       <w:start w:val="1"/>
-      <w:numFmt w:val="decimal"/>
-      <w:lvlText w:val="%7."/>
+      <w:numFmt w:val="bullet"/>
+      <w:lvlText w:val=""/>
       <w:lvlJc w:val="start"/>
       <w:pPr>
         <w:tabs>
@@ -13305,12 +13820,14 @@
         </w:tabs>
         <w:ind w:start="4963" w:hanging="283"/>
       </w:pPr>
-      <w:rPr/>
+      <w:rPr>
+        <w:rFonts w:ascii="Symbol" w:hAnsi="Symbol" w:cs="Symbol" w:hint="default"/>
+      </w:rPr>
     </w:lvl>
     <w:lvl w:ilvl="7">
       <w:start w:val="1"/>
-      <w:numFmt w:val="decimal"/>
-      <w:lvlText w:val="%8."/>
+      <w:numFmt w:val="bullet"/>
+      <w:lvlText w:val=""/>
       <w:lvlJc w:val="start"/>
       <w:pPr>
         <w:tabs>
@@ -13318,12 +13835,14 @@
         </w:tabs>
         <w:ind w:start="5672" w:hanging="283"/>
       </w:pPr>
-      <w:rPr/>
+      <w:rPr>
+        <w:rFonts w:ascii="Symbol" w:hAnsi="Symbol" w:cs="Symbol" w:hint="default"/>
+      </w:rPr>
     </w:lvl>
     <w:lvl w:ilvl="8">
       <w:start w:val="1"/>
-      <w:numFmt w:val="decimal"/>
-      <w:lvlText w:val="%9."/>
+      <w:numFmt w:val="bullet"/>
+      <w:lvlText w:val=""/>
       <w:lvlJc w:val="start"/>
       <w:pPr>
         <w:tabs>
@@ -13331,7 +13850,9 @@
         </w:tabs>
         <w:ind w:start="6381" w:hanging="283"/>
       </w:pPr>
-      <w:rPr/>
+      <w:rPr>
+        <w:rFonts w:ascii="Symbol" w:hAnsi="Symbol" w:cs="Symbol" w:hint="default"/>
+      </w:rPr>
     </w:lvl>
   </w:abstractNum>
   <w:abstractNum w:abstractNumId="9">
@@ -13593,8 +14114,8 @@
   <w:abstractNum w:abstractNumId="11">
     <w:lvl w:ilvl="0">
       <w:start w:val="1"/>
-      <w:numFmt w:val="decimal"/>
-      <w:lvlText w:val="%1."/>
+      <w:numFmt w:val="bullet"/>
+      <w:lvlText w:val=""/>
       <w:lvlJc w:val="start"/>
       <w:pPr>
         <w:tabs>
@@ -13602,12 +14123,14 @@
         </w:tabs>
         <w:ind w:start="709" w:hanging="283"/>
       </w:pPr>
-      <w:rPr/>
+      <w:rPr>
+        <w:rFonts w:ascii="Symbol" w:hAnsi="Symbol" w:cs="Symbol" w:hint="default"/>
+      </w:rPr>
     </w:lvl>
     <w:lvl w:ilvl="1">
       <w:start w:val="1"/>
-      <w:numFmt w:val="decimal"/>
-      <w:lvlText w:val="%2."/>
+      <w:numFmt w:val="bullet"/>
+      <w:lvlText w:val=""/>
       <w:lvlJc w:val="start"/>
       <w:pPr>
         <w:tabs>
@@ -13615,12 +14138,14 @@
         </w:tabs>
         <w:ind w:start="1418" w:hanging="283"/>
       </w:pPr>
-      <w:rPr/>
+      <w:rPr>
+        <w:rFonts w:ascii="Symbol" w:hAnsi="Symbol" w:cs="Symbol" w:hint="default"/>
+      </w:rPr>
     </w:lvl>
     <w:lvl w:ilvl="2">
       <w:start w:val="1"/>
-      <w:numFmt w:val="decimal"/>
-      <w:lvlText w:val="%3."/>
+      <w:numFmt w:val="bullet"/>
+      <w:lvlText w:val=""/>
       <w:lvlJc w:val="start"/>
       <w:pPr>
         <w:tabs>
@@ -13628,12 +14153,14 @@
         </w:tabs>
         <w:ind w:start="2127" w:hanging="283"/>
       </w:pPr>
-      <w:rPr/>
+      <w:rPr>
+        <w:rFonts w:ascii="Symbol" w:hAnsi="Symbol" w:cs="Symbol" w:hint="default"/>
+      </w:rPr>
     </w:lvl>
     <w:lvl w:ilvl="3">
       <w:start w:val="1"/>
-      <w:numFmt w:val="decimal"/>
-      <w:lvlText w:val="%4."/>
+      <w:numFmt w:val="bullet"/>
+      <w:lvlText w:val=""/>
       <w:lvlJc w:val="start"/>
       <w:pPr>
         <w:tabs>
@@ -13641,12 +14168,14 @@
         </w:tabs>
         <w:ind w:start="2836" w:hanging="283"/>
       </w:pPr>
-      <w:rPr/>
+      <w:rPr>
+        <w:rFonts w:ascii="Symbol" w:hAnsi="Symbol" w:cs="Symbol" w:hint="default"/>
+      </w:rPr>
     </w:lvl>
     <w:lvl w:ilvl="4">
       <w:start w:val="1"/>
-      <w:numFmt w:val="decimal"/>
-      <w:lvlText w:val="%5."/>
+      <w:numFmt w:val="bullet"/>
+      <w:lvlText w:val=""/>
       <w:lvlJc w:val="start"/>
       <w:pPr>
         <w:tabs>
@@ -13654,12 +14183,14 @@
         </w:tabs>
         <w:ind w:start="3545" w:hanging="283"/>
       </w:pPr>
-      <w:rPr/>
+      <w:rPr>
+        <w:rFonts w:ascii="Symbol" w:hAnsi="Symbol" w:cs="Symbol" w:hint="default"/>
+      </w:rPr>
     </w:lvl>
     <w:lvl w:ilvl="5">
       <w:start w:val="1"/>
-      <w:numFmt w:val="decimal"/>
-      <w:lvlText w:val="%6."/>
+      <w:numFmt w:val="bullet"/>
+      <w:lvlText w:val=""/>
       <w:lvlJc w:val="start"/>
       <w:pPr>
         <w:tabs>
@@ -13667,12 +14198,14 @@
         </w:tabs>
         <w:ind w:start="4254" w:hanging="283"/>
       </w:pPr>
-      <w:rPr/>
+      <w:rPr>
+        <w:rFonts w:ascii="Symbol" w:hAnsi="Symbol" w:cs="Symbol" w:hint="default"/>
+      </w:rPr>
     </w:lvl>
     <w:lvl w:ilvl="6">
       <w:start w:val="1"/>
-      <w:numFmt w:val="decimal"/>
-      <w:lvlText w:val="%7."/>
+      <w:numFmt w:val="bullet"/>
+      <w:lvlText w:val=""/>
       <w:lvlJc w:val="start"/>
       <w:pPr>
         <w:tabs>
@@ -13680,12 +14213,14 @@
         </w:tabs>
         <w:ind w:start="4963" w:hanging="283"/>
       </w:pPr>
-      <w:rPr/>
+      <w:rPr>
+        <w:rFonts w:ascii="Symbol" w:hAnsi="Symbol" w:cs="Symbol" w:hint="default"/>
+      </w:rPr>
     </w:lvl>
     <w:lvl w:ilvl="7">
       <w:start w:val="1"/>
-      <w:numFmt w:val="decimal"/>
-      <w:lvlText w:val="%8."/>
+      <w:numFmt w:val="bullet"/>
+      <w:lvlText w:val=""/>
       <w:lvlJc w:val="start"/>
       <w:pPr>
         <w:tabs>
@@ -13693,12 +14228,14 @@
         </w:tabs>
         <w:ind w:start="5672" w:hanging="283"/>
       </w:pPr>
-      <w:rPr/>
+      <w:rPr>
+        <w:rFonts w:ascii="Symbol" w:hAnsi="Symbol" w:cs="Symbol" w:hint="default"/>
+      </w:rPr>
     </w:lvl>
     <w:lvl w:ilvl="8">
       <w:start w:val="1"/>
-      <w:numFmt w:val="decimal"/>
-      <w:lvlText w:val="%9."/>
+      <w:numFmt w:val="bullet"/>
+      <w:lvlText w:val=""/>
       <w:lvlJc w:val="start"/>
       <w:pPr>
         <w:tabs>
@@ -13706,7 +14243,9 @@
         </w:tabs>
         <w:ind w:start="6381" w:hanging="283"/>
       </w:pPr>
-      <w:rPr/>
+      <w:rPr>
+        <w:rFonts w:ascii="Symbol" w:hAnsi="Symbol" w:cs="Symbol" w:hint="default"/>
+      </w:rPr>
     </w:lvl>
   </w:abstractNum>
   <w:abstractNum w:abstractNumId="12">
@@ -13831,6 +14370,244 @@
   <w:abstractNum w:abstractNumId="13">
     <w:lvl w:ilvl="0">
       <w:start w:val="1"/>
+      <w:numFmt w:val="decimal"/>
+      <w:lvlText w:val="%1."/>
+      <w:lvlJc w:val="start"/>
+      <w:pPr>
+        <w:tabs>
+          <w:tab w:val="num" w:pos="709"/>
+        </w:tabs>
+        <w:ind w:start="709" w:hanging="283"/>
+      </w:pPr>
+      <w:rPr/>
+    </w:lvl>
+    <w:lvl w:ilvl="1">
+      <w:start w:val="1"/>
+      <w:numFmt w:val="decimal"/>
+      <w:lvlText w:val="%2."/>
+      <w:lvlJc w:val="start"/>
+      <w:pPr>
+        <w:tabs>
+          <w:tab w:val="num" w:pos="1418"/>
+        </w:tabs>
+        <w:ind w:start="1418" w:hanging="283"/>
+      </w:pPr>
+      <w:rPr/>
+    </w:lvl>
+    <w:lvl w:ilvl="2">
+      <w:start w:val="1"/>
+      <w:numFmt w:val="decimal"/>
+      <w:lvlText w:val="%3."/>
+      <w:lvlJc w:val="start"/>
+      <w:pPr>
+        <w:tabs>
+          <w:tab w:val="num" w:pos="2127"/>
+        </w:tabs>
+        <w:ind w:start="2127" w:hanging="283"/>
+      </w:pPr>
+      <w:rPr/>
+    </w:lvl>
+    <w:lvl w:ilvl="3">
+      <w:start w:val="1"/>
+      <w:numFmt w:val="decimal"/>
+      <w:lvlText w:val="%4."/>
+      <w:lvlJc w:val="start"/>
+      <w:pPr>
+        <w:tabs>
+          <w:tab w:val="num" w:pos="2836"/>
+        </w:tabs>
+        <w:ind w:start="2836" w:hanging="283"/>
+      </w:pPr>
+      <w:rPr/>
+    </w:lvl>
+    <w:lvl w:ilvl="4">
+      <w:start w:val="1"/>
+      <w:numFmt w:val="decimal"/>
+      <w:lvlText w:val="%5."/>
+      <w:lvlJc w:val="start"/>
+      <w:pPr>
+        <w:tabs>
+          <w:tab w:val="num" w:pos="3545"/>
+        </w:tabs>
+        <w:ind w:start="3545" w:hanging="283"/>
+      </w:pPr>
+      <w:rPr/>
+    </w:lvl>
+    <w:lvl w:ilvl="5">
+      <w:start w:val="1"/>
+      <w:numFmt w:val="decimal"/>
+      <w:lvlText w:val="%6."/>
+      <w:lvlJc w:val="start"/>
+      <w:pPr>
+        <w:tabs>
+          <w:tab w:val="num" w:pos="4254"/>
+        </w:tabs>
+        <w:ind w:start="4254" w:hanging="283"/>
+      </w:pPr>
+      <w:rPr/>
+    </w:lvl>
+    <w:lvl w:ilvl="6">
+      <w:start w:val="1"/>
+      <w:numFmt w:val="decimal"/>
+      <w:lvlText w:val="%7."/>
+      <w:lvlJc w:val="start"/>
+      <w:pPr>
+        <w:tabs>
+          <w:tab w:val="num" w:pos="4963"/>
+        </w:tabs>
+        <w:ind w:start="4963" w:hanging="283"/>
+      </w:pPr>
+      <w:rPr/>
+    </w:lvl>
+    <w:lvl w:ilvl="7">
+      <w:start w:val="1"/>
+      <w:numFmt w:val="decimal"/>
+      <w:lvlText w:val="%8."/>
+      <w:lvlJc w:val="start"/>
+      <w:pPr>
+        <w:tabs>
+          <w:tab w:val="num" w:pos="5672"/>
+        </w:tabs>
+        <w:ind w:start="5672" w:hanging="283"/>
+      </w:pPr>
+      <w:rPr/>
+    </w:lvl>
+    <w:lvl w:ilvl="8">
+      <w:start w:val="1"/>
+      <w:numFmt w:val="decimal"/>
+      <w:lvlText w:val="%9."/>
+      <w:lvlJc w:val="start"/>
+      <w:pPr>
+        <w:tabs>
+          <w:tab w:val="num" w:pos="6381"/>
+        </w:tabs>
+        <w:ind w:start="6381" w:hanging="283"/>
+      </w:pPr>
+      <w:rPr/>
+    </w:lvl>
+  </w:abstractNum>
+  <w:abstractNum w:abstractNumId="14">
+    <w:lvl w:ilvl="0">
+      <w:start w:val="1"/>
+      <w:numFmt w:val="decimal"/>
+      <w:lvlText w:val="%1."/>
+      <w:lvlJc w:val="start"/>
+      <w:pPr>
+        <w:tabs>
+          <w:tab w:val="num" w:pos="709"/>
+        </w:tabs>
+        <w:ind w:start="709" w:hanging="283"/>
+      </w:pPr>
+      <w:rPr/>
+    </w:lvl>
+    <w:lvl w:ilvl="1">
+      <w:start w:val="1"/>
+      <w:numFmt w:val="decimal"/>
+      <w:lvlText w:val="%2."/>
+      <w:lvlJc w:val="start"/>
+      <w:pPr>
+        <w:tabs>
+          <w:tab w:val="num" w:pos="1418"/>
+        </w:tabs>
+        <w:ind w:start="1418" w:hanging="283"/>
+      </w:pPr>
+      <w:rPr/>
+    </w:lvl>
+    <w:lvl w:ilvl="2">
+      <w:start w:val="1"/>
+      <w:numFmt w:val="decimal"/>
+      <w:lvlText w:val="%3."/>
+      <w:lvlJc w:val="start"/>
+      <w:pPr>
+        <w:tabs>
+          <w:tab w:val="num" w:pos="2127"/>
+        </w:tabs>
+        <w:ind w:start="2127" w:hanging="283"/>
+      </w:pPr>
+      <w:rPr/>
+    </w:lvl>
+    <w:lvl w:ilvl="3">
+      <w:start w:val="1"/>
+      <w:numFmt w:val="decimal"/>
+      <w:lvlText w:val="%4."/>
+      <w:lvlJc w:val="start"/>
+      <w:pPr>
+        <w:tabs>
+          <w:tab w:val="num" w:pos="2836"/>
+        </w:tabs>
+        <w:ind w:start="2836" w:hanging="283"/>
+      </w:pPr>
+      <w:rPr/>
+    </w:lvl>
+    <w:lvl w:ilvl="4">
+      <w:start w:val="1"/>
+      <w:numFmt w:val="decimal"/>
+      <w:lvlText w:val="%5."/>
+      <w:lvlJc w:val="start"/>
+      <w:pPr>
+        <w:tabs>
+          <w:tab w:val="num" w:pos="3545"/>
+        </w:tabs>
+        <w:ind w:start="3545" w:hanging="283"/>
+      </w:pPr>
+      <w:rPr/>
+    </w:lvl>
+    <w:lvl w:ilvl="5">
+      <w:start w:val="1"/>
+      <w:numFmt w:val="decimal"/>
+      <w:lvlText w:val="%6."/>
+      <w:lvlJc w:val="start"/>
+      <w:pPr>
+        <w:tabs>
+          <w:tab w:val="num" w:pos="4254"/>
+        </w:tabs>
+        <w:ind w:start="4254" w:hanging="283"/>
+      </w:pPr>
+      <w:rPr/>
+    </w:lvl>
+    <w:lvl w:ilvl="6">
+      <w:start w:val="1"/>
+      <w:numFmt w:val="decimal"/>
+      <w:lvlText w:val="%7."/>
+      <w:lvlJc w:val="start"/>
+      <w:pPr>
+        <w:tabs>
+          <w:tab w:val="num" w:pos="4963"/>
+        </w:tabs>
+        <w:ind w:start="4963" w:hanging="283"/>
+      </w:pPr>
+      <w:rPr/>
+    </w:lvl>
+    <w:lvl w:ilvl="7">
+      <w:start w:val="1"/>
+      <w:numFmt w:val="decimal"/>
+      <w:lvlText w:val="%8."/>
+      <w:lvlJc w:val="start"/>
+      <w:pPr>
+        <w:tabs>
+          <w:tab w:val="num" w:pos="5672"/>
+        </w:tabs>
+        <w:ind w:start="5672" w:hanging="283"/>
+      </w:pPr>
+      <w:rPr/>
+    </w:lvl>
+    <w:lvl w:ilvl="8">
+      <w:start w:val="1"/>
+      <w:numFmt w:val="decimal"/>
+      <w:lvlText w:val="%9."/>
+      <w:lvlJc w:val="start"/>
+      <w:pPr>
+        <w:tabs>
+          <w:tab w:val="num" w:pos="6381"/>
+        </w:tabs>
+        <w:ind w:start="6381" w:hanging="283"/>
+      </w:pPr>
+      <w:rPr/>
+    </w:lvl>
+  </w:abstractNum>
+  <w:abstractNum w:abstractNumId="15">
+    <w:lvl w:ilvl="0">
+      <w:start w:val="1"/>
       <w:numFmt w:val="bullet"/>
       <w:lvlText w:val=""/>
       <w:lvlJc w:val="start"/>
@@ -13965,7 +14742,7 @@
       </w:rPr>
     </w:lvl>
   </w:abstractNum>
-  <w:abstractNum w:abstractNumId="14">
+  <w:abstractNum w:abstractNumId="16">
     <w:lvl w:ilvl="0">
       <w:start w:val="1"/>
       <w:numFmt w:val="decimal"/>
@@ -14084,7 +14861,7 @@
       <w:rPr/>
     </w:lvl>
   </w:abstractNum>
-  <w:abstractNum w:abstractNumId="15">
+  <w:abstractNum w:abstractNumId="17">
     <w:lvl w:ilvl="0">
       <w:start w:val="1"/>
       <w:numFmt w:val="bullet"/>
@@ -14221,7 +14998,7 @@
       </w:rPr>
     </w:lvl>
   </w:abstractNum>
-  <w:abstractNum w:abstractNumId="16">
+  <w:abstractNum w:abstractNumId="18">
     <w:lvl w:ilvl="0">
       <w:start w:val="1"/>
       <w:numFmt w:val="bullet"/>
@@ -14358,7 +15135,7 @@
       </w:rPr>
     </w:lvl>
   </w:abstractNum>
-  <w:abstractNum w:abstractNumId="17">
+  <w:abstractNum w:abstractNumId="19">
     <w:lvl w:ilvl="0">
       <w:start w:val="1"/>
       <w:numFmt w:val="decimal"/>
@@ -14477,7 +15254,7 @@
       <w:rPr/>
     </w:lvl>
   </w:abstractNum>
-  <w:abstractNum w:abstractNumId="18">
+  <w:abstractNum w:abstractNumId="20">
     <w:lvl w:ilvl="0">
       <w:start w:val="1"/>
       <w:numFmt w:val="none"/>
@@ -14652,6 +15429,12 @@
   </w:num>
   <w:num w:numId="18">
     <w:abstractNumId w:val="18"/>
+  </w:num>
+  <w:num w:numId="19">
+    <w:abstractNumId w:val="19"/>
+  </w:num>
+  <w:num w:numId="20">
+    <w:abstractNumId w:val="20"/>
   </w:num>
 </w:numbering>
 </file>

</xml_diff>

<commit_message>
Complete versatile offline almanac generator
</commit_message>
<xml_diff>
--- a/docs/v2/output/Celestial_Navigation_Manual_v2.docx
+++ b/docs/v2/output/Celestial_Navigation_Manual_v2.docx
@@ -3508,7 +3508,7 @@
             </w:pPr>
             <w:r>
               <w:rPr/>
-              <w:t>Build a tailored, completely offline voyage almanac and calculator-complete paper backup as a PDF.</w:t>
+              <w:t>Build a tailored, completely offline planning, calculator-complete or calculator-free paper almanac as a PDF.</w:t>
             </w:r>
           </w:p>
         </w:tc>
@@ -4642,11 +4642,11 @@
         <w:rPr>
           <w:rStyle w:val="Strong"/>
         </w:rPr>
-        <w:t>Celestial Navigator</w:t>
-      </w:r>
-      <w:r>
-        <w:rPr/>
-        <w:t xml:space="preserve"> provides more forms and fuller planning material. </w:t>
+        <w:t>Calculator-free Voyage</w:t>
+      </w:r>
+      <w:r>
+        <w:rPr/>
+        <w:t xml:space="preserve"> adds all paper interpolation, correction and reduction dependencies, including direct Hc/Zn and universal Ageton tables. </w:t>
       </w:r>
     </w:p>
     <w:p>
@@ -4661,6 +4661,7 @@
           <w:tab w:val="left" w:pos="709" w:leader="none"/>
         </w:tabs>
         <w:bidi w:val="0"/>
+        <w:spacing w:before="0" w:after="0"/>
         <w:ind w:hanging="283" w:start="709"/>
         <w:jc w:val="start"/>
         <w:rPr/>
@@ -4669,6 +4670,61 @@
         <w:rPr>
           <w:rStyle w:val="Strong"/>
         </w:rPr>
+        <w:t>Celestial Navigator</w:t>
+      </w:r>
+      <w:r>
+        <w:rPr/>
+        <w:t xml:space="preserve"> provides more forms and fuller planning material. </w:t>
+      </w:r>
+    </w:p>
+    <w:p>
+      <w:pPr>
+        <w:pStyle w:val="BodyText"/>
+        <w:numPr>
+          <w:ilvl w:val="0"/>
+          <w:numId w:val="8"/>
+        </w:numPr>
+        <w:tabs>
+          <w:tab w:val="clear" w:pos="1134"/>
+          <w:tab w:val="left" w:pos="709" w:leader="none"/>
+        </w:tabs>
+        <w:bidi w:val="0"/>
+        <w:spacing w:before="0" w:after="0"/>
+        <w:ind w:hanging="283" w:start="709"/>
+        <w:jc w:val="start"/>
+        <w:rPr/>
+      </w:pPr>
+      <w:r>
+        <w:rPr>
+          <w:rStyle w:val="Strong"/>
+        </w:rPr>
+        <w:t>Full Global Annual</w:t>
+      </w:r>
+      <w:r>
+        <w:rPr/>
+        <w:t xml:space="preserve"> selects a complete calendar year, global coverage, monthly star data and the deliberately very large full-declination direct-table option. </w:t>
+      </w:r>
+    </w:p>
+    <w:p>
+      <w:pPr>
+        <w:pStyle w:val="BodyText"/>
+        <w:numPr>
+          <w:ilvl w:val="0"/>
+          <w:numId w:val="8"/>
+        </w:numPr>
+        <w:tabs>
+          <w:tab w:val="clear" w:pos="1134"/>
+          <w:tab w:val="left" w:pos="709" w:leader="none"/>
+        </w:tabs>
+        <w:bidi w:val="0"/>
+        <w:ind w:hanging="283" w:start="709"/>
+        <w:jc w:val="start"/>
+        <w:rPr/>
+      </w:pPr>
+      <w:r>
+        <w:rPr>
+          <w:rStyle w:val="Strong"/>
+        </w:rPr>
         <w:t>Custom</w:t>
       </w:r>
       <w:r>
@@ -4691,31 +4747,25 @@
       </w:r>
       <w:r>
         <w:rPr/>
-        <w:t xml:space="preserve"> means that the PDF includes hourly Sun, Moon, Aries and navigational-planet data, the 57 navigational stars, corrections, formulae, procedures and forms needed to perform reductions with an ordinary scientific calculator. It does not mean that sextant, accurate time, plotting tools, training or judgement are no longer needed. Gate-6 output does not contain the many volumes of global precomputed sight-reduction tables needed for calculator-free tabular work.</w:t>
-      </w:r>
-    </w:p>
-    <w:p>
-      <w:pPr>
-        <w:pStyle w:val="Heading3"/>
-        <w:bidi w:val="0"/>
-        <w:jc w:val="start"/>
-        <w:rPr/>
-      </w:pPr>
-      <w:r>
-        <w:rPr/>
-        <w:t>Coverage</w:t>
-      </w:r>
-    </w:p>
-    <w:p>
-      <w:pPr>
-        <w:pStyle w:val="BodyText"/>
-        <w:bidi w:val="0"/>
-        <w:jc w:val="start"/>
-        <w:rPr/>
-      </w:pPr>
-      <w:r>
-        <w:rPr/>
-        <w:t>The hourly geocentric ephemeris for every included body remains usable independently of the route. Coverage and observability choices compact the location-dependent suggestions and planning pages, not the universal data needed if the vessel leaves the expected track:</w:t>
+        <w:t xml:space="preserve"> means that the PDF includes hourly Sun, Moon, Aries and navigational-planet data, the 57 navigational stars, corrections, formulae, procedures and forms needed to perform reductions with an ordinary scientific calculator.</w:t>
+      </w:r>
+    </w:p>
+    <w:p>
+      <w:pPr>
+        <w:pStyle w:val="BodyText"/>
+        <w:bidi w:val="0"/>
+        <w:jc w:val="start"/>
+        <w:rPr/>
+      </w:pPr>
+      <w:r>
+        <w:rPr>
+          <w:rStyle w:val="Strong"/>
+        </w:rPr>
+        <w:t>Self-contained calculator-free paper backup</w:t>
+      </w:r>
+      <w:r>
+        <w:rPr/>
+        <w:t xml:space="preserve"> enforces a stronger dependency manifest. After printing, no computer, internet service, trigonometric calculator or external almanac is needed. The document includes:</w:t>
       </w:r>
     </w:p>
     <w:p>
@@ -4736,14 +4786,8 @@
         <w:rPr/>
       </w:pPr>
       <w:r>
-        <w:rPr>
-          <w:rStyle w:val="Strong"/>
-        </w:rPr>
-        <w:t>Planned OpenCPN route:</w:t>
-      </w:r>
-      <w:r>
-        <w:rPr/>
-        <w:t xml:space="preserve"> begins at the first waypoint on the From date and advances along cumulative route distance at the selected fallback speed. The corridor states the planning uncertainty; it does not alter universal GHA/declination data. </w:t>
+        <w:rPr/>
+        <w:t xml:space="preserve">hourly GHA, declination, v, d, HP and semidiameter as applicable; </w:t>
       </w:r>
     </w:p>
     <w:p>
@@ -4764,14 +4808,8 @@
         <w:rPr/>
       </w:pPr>
       <w:r>
-        <w:rPr>
-          <w:rStyle w:val="Strong"/>
-        </w:rPr>
-        <w:t>Fixed position:</w:t>
-      </w:r>
-      <w:r>
-        <w:rPr/>
-        <w:t xml:space="preserve"> produces events and recommendations for one latitude/longitude. </w:t>
+        <w:rPr/>
+        <w:t xml:space="preserve">60 minute pages with second-specific Sun/planet, Aries and Moon increments and v/d proportional corrections; </w:t>
       </w:r>
     </w:p>
     <w:p>
@@ -4792,14 +4830,8 @@
         <w:rPr/>
       </w:pPr>
       <w:r>
-        <w:rPr>
-          <w:rStyle w:val="Strong"/>
-        </w:rPr>
-        <w:t>Latitude band:</w:t>
-      </w:r>
-      <w:r>
-        <w:rPr/>
-        <w:t xml:space="preserve"> uses the middle of the band for the present Gate-6 planning page while retaining the band on the manifest. Do not interpret that sample as valid at every longitude. </w:t>
+        <w:rPr/>
+        <w:t xml:space="preserve">dip, refraction, atmospheric and Moon limb/parallax correction tables; </w:t>
       </w:r>
     </w:p>
     <w:p>
@@ -4814,14 +4846,287 @@
           <w:tab w:val="left" w:pos="709" w:leader="none"/>
         </w:tabs>
         <w:bidi w:val="0"/>
+        <w:spacing w:before="0" w:after="0"/>
         <w:ind w:hanging="283" w:start="709"/>
         <w:jc w:val="start"/>
         <w:rPr/>
       </w:pPr>
       <w:r>
+        <w:rPr/>
+        <w:t xml:space="preserve">half-minute Ageton log-cosecant/log-secant tables for universal calculator-free Hc/Zn reduction; </w:t>
+      </w:r>
+    </w:p>
+    <w:p>
+      <w:pPr>
+        <w:pStyle w:val="BodyText"/>
+        <w:numPr>
+          <w:ilvl w:val="0"/>
+          <w:numId w:val="9"/>
+        </w:numPr>
+        <w:tabs>
+          <w:tab w:val="clear" w:pos="1134"/>
+          <w:tab w:val="left" w:pos="709" w:leader="none"/>
+        </w:tabs>
+        <w:bidi w:val="0"/>
+        <w:spacing w:before="0" w:after="0"/>
+        <w:ind w:hanging="283" w:start="709"/>
+        <w:jc w:val="start"/>
+        <w:rPr/>
+      </w:pPr>
+      <w:r>
+        <w:rPr/>
+        <w:t xml:space="preserve">optional precomputed direct Hc/Zn tables for the selected latitude and date/body scope; </w:t>
+      </w:r>
+    </w:p>
+    <w:p>
+      <w:pPr>
+        <w:pStyle w:val="BodyText"/>
+        <w:numPr>
+          <w:ilvl w:val="0"/>
+          <w:numId w:val="9"/>
+        </w:numPr>
+        <w:tabs>
+          <w:tab w:val="clear" w:pos="1134"/>
+          <w:tab w:val="left" w:pos="709" w:leader="none"/>
+        </w:tabs>
+        <w:bidi w:val="0"/>
+        <w:ind w:hanging="283" w:start="709"/>
+        <w:jc w:val="start"/>
+        <w:rPr/>
+      </w:pPr>
+      <w:r>
+        <w:rPr/>
+        <w:t xml:space="preserve">procedures, worked workflow and plotting/record forms. </w:t>
+      </w:r>
+    </w:p>
+    <w:p>
+      <w:pPr>
+        <w:pStyle w:val="BodyText"/>
+        <w:bidi w:val="0"/>
+        <w:jc w:val="start"/>
+        <w:rPr/>
+      </w:pPr>
+      <w:r>
+        <w:rPr/>
+        <w:t xml:space="preserve">The cover must state </w:t>
+      </w:r>
+      <w:r>
         <w:rPr>
           <w:rStyle w:val="Strong"/>
         </w:rPr>
+        <w:t>COMPLETE: CALCULATOR-FREE</w:t>
+      </w:r>
+      <w:r>
+        <w:rPr/>
+        <w:t xml:space="preserve"> before the document is treated as a paper-only backup. A sextant, accurate watch, pencil, ruler/dividers, plotting sheets, training and judgement are still required.</w:t>
+      </w:r>
+    </w:p>
+    <w:p>
+      <w:pPr>
+        <w:pStyle w:val="Heading3"/>
+        <w:bidi w:val="0"/>
+        <w:jc w:val="start"/>
+        <w:rPr/>
+      </w:pPr>
+      <w:r>
+        <w:rPr/>
+        <w:t>Direct and universal reduction tables</w:t>
+      </w:r>
+    </w:p>
+    <w:p>
+      <w:pPr>
+        <w:pStyle w:val="BodyText"/>
+        <w:bidi w:val="0"/>
+        <w:jc w:val="start"/>
+        <w:rPr/>
+      </w:pPr>
+      <w:r>
+        <w:rPr/>
+        <w:t>The direct Hc/Zn option precomputes whole-degree latitude, declination and meridian-angle solutions. It is the quickest and least error-prone paper workflow within the chosen scope: enter the nearest rows and interpolate. Voyage/date-aware mode includes declinations actually occupied by selected bodies and latitude implied by a fixed position, band or route corridor.</w:t>
+      </w:r>
+    </w:p>
+    <w:p>
+      <w:pPr>
+        <w:pStyle w:val="BodyText"/>
+        <w:bidi w:val="0"/>
+        <w:jc w:val="start"/>
+        <w:rPr/>
+      </w:pPr>
+      <w:r>
+        <w:rPr>
+          <w:rStyle w:val="Strong"/>
+        </w:rPr>
+        <w:t>Direct tables for every declination</w:t>
+      </w:r>
+      <w:r>
+        <w:rPr/>
+        <w:t xml:space="preserve"> deliberately expands the output and can create tens of thousands of pages with global latitude coverage. The live estimate makes this cost visible. Direct-table pruning is never a safety dependency: calculator-free output also retains the compact universal Ageton tables, so an off-track navigator can reduce a sight without extrapolating a route-specific direct table.</w:t>
+      </w:r>
+    </w:p>
+    <w:p>
+      <w:pPr>
+        <w:pStyle w:val="BodyText"/>
+        <w:bidi w:val="0"/>
+        <w:jc w:val="start"/>
+        <w:rPr/>
+      </w:pPr>
+      <w:r>
+        <w:rPr/>
+        <w:t>The tables are newly computed, not reproduced pages. The universal compact method follows Arthur A. Ageton's public 1931 secant-cosecant construction; the direct Hc/Zn layer serves the practical purpose of NGA Pub. 229 in a voyage-aware layout. Hourly quantities and v/d notation follow conventional Nautical Almanac practice. The generated document remains an independent, non-official publication.</w:t>
+      </w:r>
+    </w:p>
+    <w:p>
+      <w:pPr>
+        <w:pStyle w:val="Heading3"/>
+        <w:bidi w:val="0"/>
+        <w:jc w:val="start"/>
+        <w:rPr/>
+      </w:pPr>
+      <w:r>
+        <w:rPr/>
+        <w:t>Planning cadence and visual aids</w:t>
+      </w:r>
+    </w:p>
+    <w:p>
+      <w:pPr>
+        <w:pStyle w:val="BodyText"/>
+        <w:bidi w:val="0"/>
+        <w:jc w:val="start"/>
+        <w:rPr/>
+      </w:pPr>
+      <w:r>
+        <w:rPr/>
+        <w:t>Hourly body ephemerides remain daily. The planning-page cadence can be daily, every 2/7/14/30 days, or disabled; this is a safe way to compact a long edition because it removes only duplicated location-aware planning material. Optional curves show expected body altitude, lunar distance and rate through the day, plus dip/refraction sensitivity. Curves are planning and gross-error aids. Wherever tenths of a minute matter, the familiar printed table remains authoritative.</w:t>
+      </w:r>
+    </w:p>
+    <w:p>
+      <w:pPr>
+        <w:pStyle w:val="Heading3"/>
+        <w:bidi w:val="0"/>
+        <w:jc w:val="start"/>
+        <w:rPr/>
+      </w:pPr>
+      <w:r>
+        <w:rPr/>
+        <w:t>Coverage</w:t>
+      </w:r>
+    </w:p>
+    <w:p>
+      <w:pPr>
+        <w:pStyle w:val="BodyText"/>
+        <w:bidi w:val="0"/>
+        <w:jc w:val="start"/>
+        <w:rPr/>
+      </w:pPr>
+      <w:r>
+        <w:rPr/>
+        <w:t>The hourly geocentric ephemeris for every included body remains usable independently of the route. Coverage and observability choices compact the location-dependent suggestions and planning pages, not the universal data needed if the vessel leaves the expected track:</w:t>
+      </w:r>
+    </w:p>
+    <w:p>
+      <w:pPr>
+        <w:pStyle w:val="BodyText"/>
+        <w:numPr>
+          <w:ilvl w:val="0"/>
+          <w:numId w:val="10"/>
+        </w:numPr>
+        <w:tabs>
+          <w:tab w:val="clear" w:pos="1134"/>
+          <w:tab w:val="left" w:pos="709" w:leader="none"/>
+        </w:tabs>
+        <w:bidi w:val="0"/>
+        <w:spacing w:before="0" w:after="0"/>
+        <w:ind w:hanging="283" w:start="709"/>
+        <w:jc w:val="start"/>
+        <w:rPr/>
+      </w:pPr>
+      <w:r>
+        <w:rPr>
+          <w:rStyle w:val="Strong"/>
+        </w:rPr>
+        <w:t>Planned OpenCPN route:</w:t>
+      </w:r>
+      <w:r>
+        <w:rPr/>
+        <w:t xml:space="preserve"> begins at the first waypoint on the From date and advances along cumulative route distance at the selected fallback speed. The corridor states the planning uncertainty; it does not alter universal GHA/declination data. </w:t>
+      </w:r>
+    </w:p>
+    <w:p>
+      <w:pPr>
+        <w:pStyle w:val="BodyText"/>
+        <w:numPr>
+          <w:ilvl w:val="0"/>
+          <w:numId w:val="10"/>
+        </w:numPr>
+        <w:tabs>
+          <w:tab w:val="clear" w:pos="1134"/>
+          <w:tab w:val="left" w:pos="709" w:leader="none"/>
+        </w:tabs>
+        <w:bidi w:val="0"/>
+        <w:spacing w:before="0" w:after="0"/>
+        <w:ind w:hanging="283" w:start="709"/>
+        <w:jc w:val="start"/>
+        <w:rPr/>
+      </w:pPr>
+      <w:r>
+        <w:rPr>
+          <w:rStyle w:val="Strong"/>
+        </w:rPr>
+        <w:t>Fixed position:</w:t>
+      </w:r>
+      <w:r>
+        <w:rPr/>
+        <w:t xml:space="preserve"> produces events and recommendations for one latitude/longitude. </w:t>
+      </w:r>
+    </w:p>
+    <w:p>
+      <w:pPr>
+        <w:pStyle w:val="BodyText"/>
+        <w:numPr>
+          <w:ilvl w:val="0"/>
+          <w:numId w:val="10"/>
+        </w:numPr>
+        <w:tabs>
+          <w:tab w:val="clear" w:pos="1134"/>
+          <w:tab w:val="left" w:pos="709" w:leader="none"/>
+        </w:tabs>
+        <w:bidi w:val="0"/>
+        <w:spacing w:before="0" w:after="0"/>
+        <w:ind w:hanging="283" w:start="709"/>
+        <w:jc w:val="start"/>
+        <w:rPr/>
+      </w:pPr>
+      <w:r>
+        <w:rPr>
+          <w:rStyle w:val="Strong"/>
+        </w:rPr>
+        <w:t>Latitude band:</w:t>
+      </w:r>
+      <w:r>
+        <w:rPr/>
+        <w:t xml:space="preserve"> uses the middle of the band for sample planning pages while direct reduction tables span the selected integer latitudes. Do not interpret the planning sample as valid at every longitude. </w:t>
+      </w:r>
+    </w:p>
+    <w:p>
+      <w:pPr>
+        <w:pStyle w:val="BodyText"/>
+        <w:numPr>
+          <w:ilvl w:val="0"/>
+          <w:numId w:val="10"/>
+        </w:numPr>
+        <w:tabs>
+          <w:tab w:val="clear" w:pos="1134"/>
+          <w:tab w:val="left" w:pos="709" w:leader="none"/>
+        </w:tabs>
+        <w:bidi w:val="0"/>
+        <w:ind w:hanging="283" w:start="709"/>
+        <w:jc w:val="start"/>
+        <w:rPr/>
+      </w:pPr>
+      <w:r>
+        <w:rPr>
+          <w:rStyle w:val="Strong"/>
+        </w:rPr>
         <w:t>Global:</w:t>
       </w:r>
       <w:r>
@@ -4885,6 +5190,24 @@
       <w:r>
         <w:rPr/>
         <w:t xml:space="preserve"> shows the cover, manifest and opening pages from the same semantic document model used by the PDF renderer. Output is first completed as a sibling temporary file and then renamed, so a failed calculation does not leave a plausible but partial final PDF.</w:t>
+      </w:r>
+    </w:p>
+    <w:p>
+      <w:pPr>
+        <w:pStyle w:val="BodyText"/>
+        <w:bidi w:val="0"/>
+        <w:jc w:val="start"/>
+        <w:rPr/>
+      </w:pPr>
+      <w:r>
+        <w:rPr>
+          <w:rStyle w:val="Strong"/>
+        </w:rPr>
+        <w:t>Booklet imposition</w:t>
+      </w:r>
+      <w:r>
+        <w:rPr/>
+        <w:t xml:space="preserve"> places two logical pages on each landscape PDF page and orders them in independently foldable signatures of 4-64 logical pages. The summary distinguishes logical pages, physical PDF pages and printed sheets. Print a trial signature and confirm the printer's duplex flip-edge setting before relying on a long run.</w:t>
       </w:r>
     </w:p>
     <w:p>
@@ -5034,7 +5357,7 @@
         <w:pStyle w:val="BodyText"/>
         <w:numPr>
           <w:ilvl w:val="0"/>
-          <w:numId w:val="10"/>
+          <w:numId w:val="11"/>
         </w:numPr>
         <w:tabs>
           <w:tab w:val="clear" w:pos="1134"/>
@@ -5056,7 +5379,7 @@
         <w:pStyle w:val="BodyText"/>
         <w:numPr>
           <w:ilvl w:val="0"/>
-          <w:numId w:val="10"/>
+          <w:numId w:val="11"/>
         </w:numPr>
         <w:tabs>
           <w:tab w:val="clear" w:pos="1134"/>
@@ -5078,7 +5401,7 @@
         <w:pStyle w:val="BodyText"/>
         <w:numPr>
           <w:ilvl w:val="0"/>
-          <w:numId w:val="10"/>
+          <w:numId w:val="11"/>
         </w:numPr>
         <w:tabs>
           <w:tab w:val="clear" w:pos="1134"/>
@@ -5100,7 +5423,7 @@
         <w:pStyle w:val="BodyText"/>
         <w:numPr>
           <w:ilvl w:val="0"/>
-          <w:numId w:val="10"/>
+          <w:numId w:val="11"/>
         </w:numPr>
         <w:tabs>
           <w:tab w:val="clear" w:pos="1134"/>
@@ -5346,7 +5669,7 @@
         <w:pStyle w:val="BodyText"/>
         <w:numPr>
           <w:ilvl w:val="0"/>
-          <w:numId w:val="11"/>
+          <w:numId w:val="12"/>
         </w:numPr>
         <w:tabs>
           <w:tab w:val="clear" w:pos="1134"/>
@@ -5361,139 +5684,6 @@
       <w:r>
         <w:rPr/>
         <w:t xml:space="preserve">The lunar distance LDOpc from the selected Moon limb/contact to the second body. </w:t>
-      </w:r>
-    </w:p>
-    <w:p>
-      <w:pPr>
-        <w:pStyle w:val="BodyText"/>
-        <w:numPr>
-          <w:ilvl w:val="0"/>
-          <w:numId w:val="11"/>
-        </w:numPr>
-        <w:tabs>
-          <w:tab w:val="clear" w:pos="1134"/>
-          <w:tab w:val="left" w:pos="709" w:leader="none"/>
-        </w:tabs>
-        <w:bidi w:val="0"/>
-        <w:spacing w:before="0" w:after="0"/>
-        <w:ind w:hanging="283" w:start="709"/>
-        <w:jc w:val="start"/>
-        <w:rPr/>
-      </w:pPr>
-      <w:r>
-        <w:rPr/>
-        <w:t xml:space="preserve">The Moon altitude above the horizon. </w:t>
-      </w:r>
-    </w:p>
-    <w:p>
-      <w:pPr>
-        <w:pStyle w:val="BodyText"/>
-        <w:numPr>
-          <w:ilvl w:val="0"/>
-          <w:numId w:val="11"/>
-        </w:numPr>
-        <w:tabs>
-          <w:tab w:val="clear" w:pos="1134"/>
-          <w:tab w:val="left" w:pos="709" w:leader="none"/>
-        </w:tabs>
-        <w:bidi w:val="0"/>
-        <w:spacing w:before="0" w:after="0"/>
-        <w:ind w:hanging="283" w:start="709"/>
-        <w:jc w:val="start"/>
-        <w:rPr/>
-      </w:pPr>
-      <w:r>
-        <w:rPr/>
-        <w:t xml:space="preserve">The second-body altitude above the horizon. </w:t>
-      </w:r>
-    </w:p>
-    <w:p>
-      <w:pPr>
-        <w:pStyle w:val="BodyText"/>
-        <w:numPr>
-          <w:ilvl w:val="0"/>
-          <w:numId w:val="11"/>
-        </w:numPr>
-        <w:tabs>
-          <w:tab w:val="clear" w:pos="1134"/>
-          <w:tab w:val="left" w:pos="709" w:leader="none"/>
-        </w:tabs>
-        <w:bidi w:val="0"/>
-        <w:ind w:hanging="283" w:start="709"/>
-        <w:jc w:val="start"/>
-        <w:rPr/>
-      </w:pPr>
-      <w:r>
-        <w:rPr/>
-        <w:t xml:space="preserve">The watch time of every reading, plus index error, limb/contact and uncertainty. </w:t>
-      </w:r>
-    </w:p>
-    <w:p>
-      <w:pPr>
-        <w:pStyle w:val="Heading2"/>
-        <w:bidi w:val="0"/>
-        <w:jc w:val="start"/>
-        <w:rPr/>
-      </w:pPr>
-      <w:r>
-        <w:rPr/>
-        <w:t>12.2 Sequential observations</w:t>
-      </w:r>
-    </w:p>
-    <w:p>
-      <w:pPr>
-        <w:pStyle w:val="BodyText"/>
-        <w:bidi w:val="0"/>
-        <w:jc w:val="start"/>
-        <w:rPr/>
-      </w:pPr>
-      <w:r>
-        <w:rPr/>
-        <w:t xml:space="preserve">Enable </w:t>
-      </w:r>
-      <w:r>
-        <w:rPr>
-          <w:rStyle w:val="Strong"/>
-        </w:rPr>
-        <w:t>The three angles have separate watch times</w:t>
-      </w:r>
-      <w:r>
-        <w:rPr/>
-        <w:t xml:space="preserve"> when the readings were not simultaneous. The lunar-distance date/time is the reference epoch. Enter Moon-altitude and body-altitude watch times separately. Times near midnight are interpreted as the nearest occurrence within twelve hours of the reference reading.</w:t>
-      </w:r>
-    </w:p>
-    <w:p>
-      <w:pPr>
-        <w:pStyle w:val="BodyText"/>
-        <w:bidi w:val="0"/>
-        <w:jc w:val="start"/>
-        <w:rPr/>
-      </w:pPr>
-      <w:r>
-        <w:rPr/>
-        <w:t xml:space="preserve">If the vessel moved materially, enable </w:t>
-      </w:r>
-      <w:r>
-        <w:rPr>
-          <w:rStyle w:val="Strong"/>
-        </w:rPr>
-        <w:t>Advance vessel between readings</w:t>
-      </w:r>
-      <w:r>
-        <w:rPr/>
-        <w:t xml:space="preserve"> and enter true COG and SOG. The same unknown constant watch correction is applied to all three watch times; the intervals between them are preserved.</w:t>
-      </w:r>
-    </w:p>
-    <w:p>
-      <w:pPr>
-        <w:pStyle w:val="Heading2"/>
-        <w:bidi w:val="0"/>
-        <w:jc w:val="start"/>
-        <w:rPr/>
-      </w:pPr>
-      <w:r>
-        <w:rPr/>
-        <w:t>12.3 Solving</w:t>
       </w:r>
     </w:p>
     <w:p>
@@ -5515,17 +5705,7 @@
       </w:pPr>
       <w:r>
         <w:rPr/>
-        <w:t xml:space="preserve">Create a </w:t>
-      </w:r>
-      <w:r>
-        <w:rPr>
-          <w:rStyle w:val="Strong"/>
-        </w:rPr>
-        <w:t>Lunar</w:t>
-      </w:r>
-      <w:r>
-        <w:rPr/>
-        <w:t xml:space="preserve"> sight and select the second body. </w:t>
+        <w:t xml:space="preserve">The Moon altitude above the horizon. </w:t>
       </w:r>
     </w:p>
     <w:p>
@@ -5547,7 +5727,7 @@
       </w:pPr>
       <w:r>
         <w:rPr/>
-        <w:t xml:space="preserve">Enter LDOpc, near/centre/far contact and both body altitudes with correct limbs. </w:t>
+        <w:t xml:space="preserve">The second-body altitude above the horizon. </w:t>
       </w:r>
     </w:p>
     <w:p>
@@ -5562,111 +5742,69 @@
           <w:tab w:val="left" w:pos="709" w:leader="none"/>
         </w:tabs>
         <w:bidi w:val="0"/>
-        <w:spacing w:before="0" w:after="0"/>
         <w:ind w:hanging="283" w:start="709"/>
         <w:jc w:val="start"/>
         <w:rPr/>
       </w:pPr>
       <w:r>
         <w:rPr/>
-        <w:t xml:space="preserve">Enter one time or enable separate times as actually observed. </w:t>
-      </w:r>
-    </w:p>
-    <w:p>
-      <w:pPr>
-        <w:pStyle w:val="BodyText"/>
-        <w:numPr>
-          <w:ilvl w:val="0"/>
-          <w:numId w:val="12"/>
-        </w:numPr>
-        <w:tabs>
-          <w:tab w:val="clear" w:pos="1134"/>
-          <w:tab w:val="left" w:pos="709" w:leader="none"/>
-        </w:tabs>
-        <w:bidi w:val="0"/>
-        <w:spacing w:before="0" w:after="0"/>
-        <w:ind w:hanging="283" w:start="709"/>
-        <w:jc w:val="start"/>
-        <w:rPr/>
-      </w:pPr>
-      <w:r>
-        <w:rPr/>
-        <w:t xml:space="preserve">Set a plausible total UTC search span around the watch time. </w:t>
-      </w:r>
-    </w:p>
-    <w:p>
-      <w:pPr>
-        <w:pStyle w:val="BodyText"/>
-        <w:numPr>
-          <w:ilvl w:val="0"/>
-          <w:numId w:val="12"/>
-        </w:numPr>
-        <w:tabs>
-          <w:tab w:val="clear" w:pos="1134"/>
-          <w:tab w:val="left" w:pos="709" w:leader="none"/>
-        </w:tabs>
-        <w:bidi w:val="0"/>
-        <w:spacing w:before="0" w:after="0"/>
-        <w:ind w:hanging="283" w:start="709"/>
-        <w:jc w:val="start"/>
-        <w:rPr/>
-      </w:pPr>
-      <w:r>
-        <w:rPr/>
-        <w:t xml:space="preserve">Select </w:t>
+        <w:t xml:space="preserve">The watch time of every reading, plus index error, limb/contact and uncertainty. </w:t>
+      </w:r>
+    </w:p>
+    <w:p>
+      <w:pPr>
+        <w:pStyle w:val="Heading2"/>
+        <w:bidi w:val="0"/>
+        <w:jc w:val="start"/>
+        <w:rPr/>
+      </w:pPr>
+      <w:r>
+        <w:rPr/>
+        <w:t>12.2 Sequential observations</w:t>
+      </w:r>
+    </w:p>
+    <w:p>
+      <w:pPr>
+        <w:pStyle w:val="BodyText"/>
+        <w:bidi w:val="0"/>
+        <w:jc w:val="start"/>
+        <w:rPr/>
+      </w:pPr>
+      <w:r>
+        <w:rPr/>
+        <w:t xml:space="preserve">Enable </w:t>
       </w:r>
       <w:r>
         <w:rPr>
           <w:rStyle w:val="Strong"/>
         </w:rPr>
-        <w:t>Time</w:t>
-      </w:r>
-      <w:r>
-        <w:rPr/>
-        <w:t xml:space="preserve">. Review all matching time candidates, clock correction, uncertainty and position candidates. </w:t>
-      </w:r>
-    </w:p>
-    <w:p>
-      <w:pPr>
-        <w:pStyle w:val="BodyText"/>
-        <w:numPr>
-          <w:ilvl w:val="0"/>
-          <w:numId w:val="12"/>
-        </w:numPr>
-        <w:tabs>
-          <w:tab w:val="clear" w:pos="1134"/>
-          <w:tab w:val="left" w:pos="709" w:leader="none"/>
-        </w:tabs>
-        <w:bidi w:val="0"/>
-        <w:ind w:hanging="283" w:start="709"/>
-        <w:jc w:val="start"/>
-        <w:rPr/>
-      </w:pPr>
-      <w:r>
-        <w:rPr/>
-        <w:t xml:space="preserve">Use rough DR, hemisphere, an additional altitude sight or independent evidence to select the physical solution. </w:t>
-      </w:r>
-    </w:p>
-    <w:p>
-      <w:pPr>
-        <w:pStyle w:val="BodyText"/>
-        <w:bidi w:val="0"/>
-        <w:ind w:hanging="0" w:start="0" w:end="0"/>
-        <w:jc w:val="start"/>
-        <w:rPr/>
-      </w:pPr>
+        <w:t>The three angles have separate watch times</w:t>
+      </w:r>
+      <w:r>
+        <w:rPr/>
+        <w:t xml:space="preserve"> when the readings were not simultaneous. The lunar-distance date/time is the reference epoch. Enter Moon-altitude and body-altitude watch times separately. Times near midnight are interpreted as the nearest occurrence within twelve hours of the reference reading.</w:t>
+      </w:r>
+    </w:p>
+    <w:p>
+      <w:pPr>
+        <w:pStyle w:val="BodyText"/>
+        <w:bidi w:val="0"/>
+        <w:jc w:val="start"/>
+        <w:rPr/>
+      </w:pPr>
+      <w:r>
+        <w:rPr/>
+        <w:t xml:space="preserve">If the vessel moved materially, enable </w:t>
+      </w:r>
       <w:r>
         <w:rPr>
           <w:rStyle w:val="Strong"/>
-          <w:shd w:fill="FFF0F0" w:val="clear"/>
-        </w:rPr>
-        <w:t>Lunar accuracy is demanding.</w:t>
-      </w:r>
-      <w:r>
-        <w:rPr>
-          <w:shd w:fill="FFF0F0" w:val="clear"/>
-        </w:rPr>
-        <w:t xml:space="preserve"> A lunar distance changes slowly enough that a small angular error can become a large time error. Sextant adjustment, side error, limb contact, refraction/parallax clearing and repeated observations matter substantially more than in an ordinary altitude sight.</w:t>
+        </w:rPr>
+        <w:t>Advance vessel between readings</w:t>
+      </w:r>
+      <w:r>
+        <w:rPr/>
+        <w:t xml:space="preserve"> and enter true COG and SOG. The same unknown constant watch correction is applied to all three watch times; the intervals between them are preserved.</w:t>
       </w:r>
     </w:p>
     <w:p>
@@ -5678,43 +5816,7 @@
       </w:pPr>
       <w:r>
         <w:rPr/>
-        <w:t>12.4 Unknown UTC and longitude</w:t>
-      </w:r>
-    </w:p>
-    <w:p>
-      <w:pPr>
-        <w:pStyle w:val="BodyText"/>
-        <w:bidi w:val="0"/>
-        <w:jc w:val="start"/>
-        <w:rPr/>
-      </w:pPr>
-      <w:r>
-        <w:rPr/>
-        <w:t>The solver does not use the crude “15 degrees per hour” shortcut as a longitude answer. It searches clock correction and reference position jointly against the lunar distance and altitude constraints. More than one physical candidate can remain. Reported numerical convergence does not remove geometric ambiguity or observational uncertainty.</w:t>
-      </w:r>
-    </w:p>
-    <w:p>
-      <w:pPr>
-        <w:pStyle w:val="Heading2"/>
-        <w:bidi w:val="0"/>
-        <w:jc w:val="start"/>
-        <w:rPr/>
-      </w:pPr>
-      <w:r>
-        <w:rPr/>
-        <w:t>12.5 Joint lunar-sequence estimation</w:t>
-      </w:r>
-    </w:p>
-    <w:p>
-      <w:pPr>
-        <w:pStyle w:val="BodyText"/>
-        <w:bidi w:val="0"/>
-        <w:jc w:val="start"/>
-        <w:rPr/>
-      </w:pPr>
-      <w:r>
-        <w:rPr/>
-        <w:t>One lunar triple contains three measured angles and can solve three primary unknowns—constant watch correction, latitude and longitude—but it supplies almost no redundancy. Several timed triples are much more useful: one shared solution can reveal scatter, weak geometry, a competing time/position minimum or a reading that disagrees with the others.</w:t>
+        <w:t>12.3 Solving</w:t>
       </w:r>
     </w:p>
     <w:p>
@@ -5736,7 +5838,7 @@
       </w:pPr>
       <w:r>
         <w:rPr/>
-        <w:t xml:space="preserve">Save at least two complete </w:t>
+        <w:t xml:space="preserve">Create a </w:t>
       </w:r>
       <w:r>
         <w:rPr>
@@ -5746,7 +5848,7 @@
       </w:r>
       <w:r>
         <w:rPr/>
-        <w:t xml:space="preserve"> sights. Use each sight's separate-time controls whenever the three angles were not simultaneous. </w:t>
+        <w:t xml:space="preserve"> sight and select the second body. </w:t>
       </w:r>
     </w:p>
     <w:p>
@@ -5768,17 +5870,7 @@
       </w:pPr>
       <w:r>
         <w:rPr/>
-        <w:t xml:space="preserve">Select </w:t>
-      </w:r>
-      <w:r>
-        <w:rPr>
-          <w:rStyle w:val="Strong"/>
-        </w:rPr>
-        <w:t>Lunar Tools… → Lunar sequence</w:t>
-      </w:r>
-      <w:r>
-        <w:rPr/>
-        <w:t xml:space="preserve"> and tick the observations belonging to one watch/session. </w:t>
+        <w:t xml:space="preserve">Enter LDOpc, near/centre/far contact and both body altitudes with correct limbs. </w:t>
       </w:r>
     </w:p>
     <w:p>
@@ -5800,27 +5892,7 @@
       </w:pPr>
       <w:r>
         <w:rPr/>
-        <w:t xml:space="preserve">Choose </w:t>
-      </w:r>
-      <w:r>
-        <w:rPr>
-          <w:rStyle w:val="Strong"/>
-        </w:rPr>
-        <w:t>Recover time and position</w:t>
-      </w:r>
-      <w:r>
-        <w:rPr/>
-        <w:t xml:space="preserve">, or </w:t>
-      </w:r>
-      <w:r>
-        <w:rPr>
-          <w:rStyle w:val="Strong"/>
-        </w:rPr>
-        <w:t>Recover time at known position</w:t>
-      </w:r>
-      <w:r>
-        <w:rPr/>
-        <w:t xml:space="preserve"> for a clock check at a trustworthy position. </w:t>
+        <w:t xml:space="preserve">Enter one time or enable separate times as actually observed. </w:t>
       </w:r>
     </w:p>
     <w:p>
@@ -5842,7 +5914,7 @@
       </w:pPr>
       <w:r>
         <w:rPr/>
-        <w:t xml:space="preserve">Enter an initial/known position and a physically justified watch-correction search span. If the vessel moved over the session, enter true COG and SOG. </w:t>
+        <w:t xml:space="preserve">Set a plausible total UTC search span around the watch time. </w:t>
       </w:r>
     </w:p>
     <w:p>
@@ -5864,17 +5936,17 @@
       </w:pPr>
       <w:r>
         <w:rPr/>
-        <w:t xml:space="preserve">Normally retain </w:t>
+        <w:t xml:space="preserve">Select </w:t>
       </w:r>
       <w:r>
         <w:rPr>
           <w:rStyle w:val="Strong"/>
         </w:rPr>
-        <w:t>Robust fit</w:t>
-      </w:r>
-      <w:r>
-        <w:rPr/>
-        <w:t xml:space="preserve">. It reduces the leverage of a discrepant reading but still displays and flags every residual; it never deletes evidence. </w:t>
+        <w:t>Time</w:t>
+      </w:r>
+      <w:r>
+        <w:rPr/>
+        <w:t xml:space="preserve">. Review all matching time candidates, clock correction, uncertainty and position candidates. </w:t>
       </w:r>
     </w:p>
     <w:p>
@@ -5895,29 +5967,7 @@
       </w:pPr>
       <w:r>
         <w:rPr/>
-        <w:t xml:space="preserve">Solve, inspect all competitive candidates, angular and weighted RMS, formal uncertainties and every component residual before applying a watch correction. </w:t>
-      </w:r>
-    </w:p>
-    <w:p>
-      <w:pPr>
-        <w:pStyle w:val="BodyText"/>
-        <w:bidi w:val="0"/>
-        <w:jc w:val="start"/>
-        <w:rPr/>
-      </w:pPr>
-      <w:r>
-        <w:rPr/>
-        <w:t xml:space="preserve">The reported correction is additional to the correction already displayed by the plugin. </w:t>
-      </w:r>
-      <w:r>
-        <w:rPr>
-          <w:rStyle w:val="Strong"/>
-        </w:rPr>
-        <w:t>Apply watch correction</w:t>
-      </w:r>
-      <w:r>
-        <w:rPr/>
-        <w:t xml:space="preserve"> explicitly shows the resulting total and asks for confirmation. Raw watch timestamps remain in the observation record.</w:t>
+        <w:t xml:space="preserve">Use rough DR, hemisphere, an additional altitude sight or independent evidence to select the physical solution. </w:t>
       </w:r>
     </w:p>
     <w:p>
@@ -5933,13 +5983,13 @@
           <w:rStyle w:val="Strong"/>
           <w:shd w:fill="FFF0F0" w:val="clear"/>
         </w:rPr>
-        <w:t>Do not select a pleasing minimum merely because it is numerical.</w:t>
+        <w:t>Lunar accuracy is demanding.</w:t>
       </w:r>
       <w:r>
         <w:rPr>
           <w:shd w:fill="FFF0F0" w:val="clear"/>
         </w:rPr>
-        <w:t xml:space="preserve"> A high condition number, large uncertainty, competitive alternate solution or residual beyond three stated standard uncertainties requires more evidence. The optional common residual index-bias parameter is an advanced diagnostic; with too few observations it can trade against clock correction and should not be treated as a sextant calibration.</w:t>
+        <w:t xml:space="preserve"> A lunar distance changes slowly enough that a small angular error can become a large time error. Sextant adjustment, side error, limb contact, refraction/parallax clearing and repeated observations matter substantially more than in an ordinary altitude sight.</w:t>
       </w:r>
     </w:p>
     <w:p>
@@ -5951,37 +6001,19 @@
       </w:pPr>
       <w:r>
         <w:rPr/>
-        <w:t>12.6 Lunar pair planner</w:t>
-      </w:r>
-    </w:p>
-    <w:p>
-      <w:pPr>
-        <w:pStyle w:val="BodyText"/>
-        <w:bidi w:val="0"/>
-        <w:jc w:val="start"/>
-        <w:rPr/>
-      </w:pPr>
-      <w:r>
-        <w:rPr>
-          <w:rStyle w:val="Strong"/>
-        </w:rPr>
-        <w:t>Lunar Tools… → Lunar planner</w:t>
-      </w:r>
-      <w:r>
-        <w:rPr/>
-        <w:t xml:space="preserve"> ranks the offline body catalogue for a selected UTC and position. It displays Moon and body altitude, centre separation, distance rate in arcminutes per hour and the approximate time change corresponding to 0.1′ of distance. A small time value means useful time sensitivity. The quality text also penalises hidden/low bodies, awkward sextant angles, very unequal altitudes and faint stars.</w:t>
-      </w:r>
-    </w:p>
-    <w:p>
-      <w:pPr>
-        <w:pStyle w:val="BodyText"/>
-        <w:bidi w:val="0"/>
-        <w:jc w:val="start"/>
-        <w:rPr/>
-      </w:pPr>
-      <w:r>
-        <w:rPr/>
-        <w:t>The ranking is a planning aid, not a visibility guarantee. Cloud, Moon phase/glare, twilight, haze, telescope field, the chosen limb/contact and the observer's ability remain decisive. Recalculate at candidate times and choose a pair you can identify unambiguously.</w:t>
+        <w:t>12.4 Unknown UTC and longitude</w:t>
+      </w:r>
+    </w:p>
+    <w:p>
+      <w:pPr>
+        <w:pStyle w:val="BodyText"/>
+        <w:bidi w:val="0"/>
+        <w:jc w:val="start"/>
+        <w:rPr/>
+      </w:pPr>
+      <w:r>
+        <w:rPr/>
+        <w:t>The solver does not use the crude “15 degrees per hour” shortcut as a longitude answer. It searches clock correction and reference position jointly against the lunar distance and altitude constraints. More than one physical candidate can remain. Reported numerical convergence does not remove geometric ambiguity or observational uncertainty.</w:t>
       </w:r>
     </w:p>
     <w:p>
@@ -5993,114 +6025,19 @@
       </w:pPr>
       <w:r>
         <w:rPr/>
-        <w:t>12.7 Sextant observational checks and correction profiles</w:t>
-      </w:r>
-    </w:p>
-    <w:p>
-      <w:pPr>
-        <w:pStyle w:val="BodyText"/>
-        <w:bidi w:val="0"/>
-        <w:jc w:val="start"/>
-        <w:rPr/>
-      </w:pPr>
-      <w:r>
-        <w:rPr>
-          <w:rStyle w:val="Strong"/>
-        </w:rPr>
-        <w:t>Lunar Tools… → Sextant check</w:t>
-      </w:r>
-      <w:r>
-        <w:rPr/>
-        <w:t xml:space="preserve"> predicts the topocentric, refracted, apparent distance between two selected bodies for a stated UTC, position, pressure and temperature. Select centre-to-centre, near contact or far contact to match what was actually observed; limb contacts include the applicable semidiameters. Record repeated sextant readings, their uncertainty and any shade/note. The displayed correction is </w:t>
-      </w:r>
-      <w:r>
-        <w:rPr>
-          <w:rStyle w:val="Emphasis"/>
-        </w:rPr>
-        <w:t>predicted minus observed</w:t>
-      </w:r>
-      <w:r>
-        <w:rPr/>
-        <w:t>: add it to the raw reading.</w:t>
-      </w:r>
-    </w:p>
-    <w:p>
-      <w:pPr>
-        <w:pStyle w:val="BodyText"/>
-        <w:bidi w:val="0"/>
-        <w:jc w:val="start"/>
-        <w:rPr/>
-      </w:pPr>
-      <w:r>
-        <w:rPr/>
-        <w:t>For checking scale or centering behaviour, prefer well-identified stars at similar, comfortable altitudes and away from the horizon. Star–star checks largely avoid limb and parallax ambiguity. Moon–star, Moon–planet and Sun/Moon pairs are valuable end-to-end checks, but incorrect UTC, position, limb choice or atmospheric conditions can masquerade as instrument error.</w:t>
-      </w:r>
-    </w:p>
-    <w:p>
-      <w:pPr>
-        <w:pStyle w:val="BodyText"/>
-        <w:bidi w:val="0"/>
-        <w:jc w:val="start"/>
-        <w:rPr/>
-      </w:pPr>
-      <w:r>
-        <w:rPr>
-          <w:rStyle w:val="Strong"/>
-        </w:rPr>
-        <w:t>Build / save profile</w:t>
-      </w:r>
-      <w:r>
-        <w:rPr/>
-        <w:t xml:space="preserve"> groups repeated checks by angular range and stores correction points, uncertainty, repeatability, instrument name and serial number in the plugin configuration. Select a saved profile to display its interpolated correction at the currently entered observed angle. Between tested angles the plugin uses straight-line interpolation; beyond the tested range it clearly marks the nearest endpoint rather than inventing a polynomial trend. The table is advisory and does not alter saved sights automatically, preserving the raw record and its provenance.</w:t>
-      </w:r>
-    </w:p>
-    <w:p>
-      <w:pPr>
-        <w:pStyle w:val="BodyText"/>
-        <w:bidi w:val="0"/>
-        <w:ind w:hanging="0" w:start="0" w:end="0"/>
-        <w:jc w:val="start"/>
-        <w:rPr/>
-      </w:pPr>
-      <w:r>
-        <w:rPr>
-          <w:rStyle w:val="Strong"/>
-          <w:shd w:fill="FFF0F0" w:val="clear"/>
-        </w:rPr>
-        <w:t>A computed profile is not mechanical adjustment.</w:t>
-      </w:r>
-      <w:r>
-        <w:rPr>
-          <w:shd w:fill="FFF0F0" w:val="clear"/>
-        </w:rPr>
-        <w:t xml:space="preserve"> Follow the sextant maker's specified sequence—normally perpendicularity, side, collimation and index checks—before investigating graduation, centering or scale behaviour. A changing or irregular correction may indicate damage, technique, shades, temperature or an adjustment fault that software must not conceal.</w:t>
-      </w:r>
-    </w:p>
-    <w:p>
-      <w:pPr>
-        <w:pStyle w:val="Heading1"/>
-        <w:bidi w:val="0"/>
-        <w:ind w:hanging="0" w:start="0" w:end="0"/>
-        <w:jc w:val="start"/>
-        <w:rPr/>
-      </w:pPr>
-      <w:bookmarkStart w:id="18" w:name="horizon"/>
-      <w:bookmarkEnd w:id="18"/>
-      <w:r>
-        <w:rPr/>
-        <w:t>13. Sunrise and sunset horizon events</w:t>
-      </w:r>
-    </w:p>
-    <w:p>
-      <w:pPr>
-        <w:pStyle w:val="BodyText"/>
-        <w:bidi w:val="0"/>
-        <w:jc w:val="start"/>
-        <w:rPr/>
-      </w:pPr>
-      <w:r>
-        <w:rPr/>
-        <w:t>The Horizon Event workflow records first upper-limb appearance at sunrise or final upper-limb disappearance at sunset. Timing gives an approximate altitude constraint. An optional bearing adds a rough directional constraint.</w:t>
+        <w:t>12.5 Joint lunar-sequence estimation</w:t>
+      </w:r>
+    </w:p>
+    <w:p>
+      <w:pPr>
+        <w:pStyle w:val="BodyText"/>
+        <w:bidi w:val="0"/>
+        <w:jc w:val="start"/>
+        <w:rPr/>
+      </w:pPr>
+      <w:r>
+        <w:rPr/>
+        <w:t>One lunar triple contains three measured angles and can solve three primary unknowns—constant watch correction, latitude and longitude—but it supplies almost no redundancy. Several timed triples are much more useful: one shared solution can reveal scatter, weak geometry, a competing time/position minimum or a reading that disagrees with the others.</w:t>
       </w:r>
     </w:p>
     <w:p>
@@ -6122,7 +6059,17 @@
       </w:pPr>
       <w:r>
         <w:rPr/>
-        <w:t xml:space="preserve">Select sunrise or sunset and enter/capture the UTC date and time. </w:t>
+        <w:t xml:space="preserve">Save at least two complete </w:t>
+      </w:r>
+      <w:r>
+        <w:rPr>
+          <w:rStyle w:val="Strong"/>
+        </w:rPr>
+        <w:t>Lunar</w:t>
+      </w:r>
+      <w:r>
+        <w:rPr/>
+        <w:t xml:space="preserve"> sights. Use each sight's separate-time controls whenever the three angles were not simultaneous. </w:t>
       </w:r>
     </w:p>
     <w:p>
@@ -6144,7 +6091,17 @@
       </w:pPr>
       <w:r>
         <w:rPr/>
-        <w:t xml:space="preserve">Record time uncertainty and identify the time source. </w:t>
+        <w:t xml:space="preserve">Select </w:t>
+      </w:r>
+      <w:r>
+        <w:rPr>
+          <w:rStyle w:val="Strong"/>
+        </w:rPr>
+        <w:t>Lunar Tools… → Lunar sequence</w:t>
+      </w:r>
+      <w:r>
+        <w:rPr/>
+        <w:t xml:space="preserve"> and tick the observations belonging to one watch/session. </w:t>
       </w:r>
     </w:p>
     <w:p>
@@ -6166,7 +6123,27 @@
       </w:pPr>
       <w:r>
         <w:rPr/>
-        <w:t xml:space="preserve">If a bearing was taken, select magnetic compass or true bearing. </w:t>
+        <w:t xml:space="preserve">Choose </w:t>
+      </w:r>
+      <w:r>
+        <w:rPr>
+          <w:rStyle w:val="Strong"/>
+        </w:rPr>
+        <w:t>Recover time and position</w:t>
+      </w:r>
+      <w:r>
+        <w:rPr/>
+        <w:t xml:space="preserve">, or </w:t>
+      </w:r>
+      <w:r>
+        <w:rPr>
+          <w:rStyle w:val="Strong"/>
+        </w:rPr>
+        <w:t>Recover time at known position</w:t>
+      </w:r>
+      <w:r>
+        <w:rPr/>
+        <w:t xml:space="preserve"> for a clock check at a trustworthy position. </w:t>
       </w:r>
     </w:p>
     <w:p>
@@ -6188,7 +6165,7 @@
       </w:pPr>
       <w:r>
         <w:rPr/>
-        <w:t xml:space="preserve">For a magnetic observation, enter magnetic variation and compass deviation using the displayed E+/W− convention. </w:t>
+        <w:t xml:space="preserve">Enter an initial/known position and a physically justified watch-correction search span. If the vessel moved over the session, enter true COG and SOG. </w:t>
       </w:r>
     </w:p>
     <w:p>
@@ -6210,7 +6187,17 @@
       </w:pPr>
       <w:r>
         <w:rPr/>
-        <w:t xml:space="preserve">Enter bearing uncertainty, height of eye, pressure, temperature, horizon quality and horizon/refraction uncertainty. </w:t>
+        <w:t xml:space="preserve">Normally retain </w:t>
+      </w:r>
+      <w:r>
+        <w:rPr>
+          <w:rStyle w:val="Strong"/>
+        </w:rPr>
+        <w:t>Robust fit</w:t>
+      </w:r>
+      <w:r>
+        <w:rPr/>
+        <w:t xml:space="preserve">. It reduces the leverage of a discrepant reading but still displays and flags every residual; it never deletes evidence. </w:t>
       </w:r>
     </w:p>
     <w:p>
@@ -6219,6 +6206,342 @@
         <w:numPr>
           <w:ilvl w:val="0"/>
           <w:numId w:val="14"/>
+        </w:numPr>
+        <w:tabs>
+          <w:tab w:val="clear" w:pos="1134"/>
+          <w:tab w:val="left" w:pos="709" w:leader="none"/>
+        </w:tabs>
+        <w:bidi w:val="0"/>
+        <w:ind w:hanging="283" w:start="709"/>
+        <w:jc w:val="start"/>
+        <w:rPr/>
+      </w:pPr>
+      <w:r>
+        <w:rPr/>
+        <w:t xml:space="preserve">Solve, inspect all competitive candidates, angular and weighted RMS, formal uncertainties and every component residual before applying a watch correction. </w:t>
+      </w:r>
+    </w:p>
+    <w:p>
+      <w:pPr>
+        <w:pStyle w:val="BodyText"/>
+        <w:bidi w:val="0"/>
+        <w:jc w:val="start"/>
+        <w:rPr/>
+      </w:pPr>
+      <w:r>
+        <w:rPr/>
+        <w:t xml:space="preserve">The reported correction is additional to the correction already displayed by the plugin. </w:t>
+      </w:r>
+      <w:r>
+        <w:rPr>
+          <w:rStyle w:val="Strong"/>
+        </w:rPr>
+        <w:t>Apply watch correction</w:t>
+      </w:r>
+      <w:r>
+        <w:rPr/>
+        <w:t xml:space="preserve"> explicitly shows the resulting total and asks for confirmation. Raw watch timestamps remain in the observation record.</w:t>
+      </w:r>
+    </w:p>
+    <w:p>
+      <w:pPr>
+        <w:pStyle w:val="BodyText"/>
+        <w:bidi w:val="0"/>
+        <w:ind w:hanging="0" w:start="0" w:end="0"/>
+        <w:jc w:val="start"/>
+        <w:rPr/>
+      </w:pPr>
+      <w:r>
+        <w:rPr>
+          <w:rStyle w:val="Strong"/>
+          <w:shd w:fill="FFF0F0" w:val="clear"/>
+        </w:rPr>
+        <w:t>Do not select a pleasing minimum merely because it is numerical.</w:t>
+      </w:r>
+      <w:r>
+        <w:rPr>
+          <w:shd w:fill="FFF0F0" w:val="clear"/>
+        </w:rPr>
+        <w:t xml:space="preserve"> A high condition number, large uncertainty, competitive alternate solution or residual beyond three stated standard uncertainties requires more evidence. The optional common residual index-bias parameter is an advanced diagnostic; with too few observations it can trade against clock correction and should not be treated as a sextant calibration.</w:t>
+      </w:r>
+    </w:p>
+    <w:p>
+      <w:pPr>
+        <w:pStyle w:val="Heading2"/>
+        <w:bidi w:val="0"/>
+        <w:jc w:val="start"/>
+        <w:rPr/>
+      </w:pPr>
+      <w:r>
+        <w:rPr/>
+        <w:t>12.6 Lunar pair planner</w:t>
+      </w:r>
+    </w:p>
+    <w:p>
+      <w:pPr>
+        <w:pStyle w:val="BodyText"/>
+        <w:bidi w:val="0"/>
+        <w:jc w:val="start"/>
+        <w:rPr/>
+      </w:pPr>
+      <w:r>
+        <w:rPr>
+          <w:rStyle w:val="Strong"/>
+        </w:rPr>
+        <w:t>Lunar Tools… → Lunar planner</w:t>
+      </w:r>
+      <w:r>
+        <w:rPr/>
+        <w:t xml:space="preserve"> ranks the offline body catalogue for a selected UTC and position. It displays Moon and body altitude, centre separation, distance rate in arcminutes per hour and the approximate time change corresponding to 0.1′ of distance. A small time value means useful time sensitivity. The quality text also penalises hidden/low bodies, awkward sextant angles, very unequal altitudes and faint stars.</w:t>
+      </w:r>
+    </w:p>
+    <w:p>
+      <w:pPr>
+        <w:pStyle w:val="BodyText"/>
+        <w:bidi w:val="0"/>
+        <w:jc w:val="start"/>
+        <w:rPr/>
+      </w:pPr>
+      <w:r>
+        <w:rPr/>
+        <w:t>The ranking is a planning aid, not a visibility guarantee. Cloud, Moon phase/glare, twilight, haze, telescope field, the chosen limb/contact and the observer's ability remain decisive. Recalculate at candidate times and choose a pair you can identify unambiguously.</w:t>
+      </w:r>
+    </w:p>
+    <w:p>
+      <w:pPr>
+        <w:pStyle w:val="Heading2"/>
+        <w:bidi w:val="0"/>
+        <w:jc w:val="start"/>
+        <w:rPr/>
+      </w:pPr>
+      <w:r>
+        <w:rPr/>
+        <w:t>12.7 Sextant observational checks and correction profiles</w:t>
+      </w:r>
+    </w:p>
+    <w:p>
+      <w:pPr>
+        <w:pStyle w:val="BodyText"/>
+        <w:bidi w:val="0"/>
+        <w:jc w:val="start"/>
+        <w:rPr/>
+      </w:pPr>
+      <w:r>
+        <w:rPr>
+          <w:rStyle w:val="Strong"/>
+        </w:rPr>
+        <w:t>Lunar Tools… → Sextant check</w:t>
+      </w:r>
+      <w:r>
+        <w:rPr/>
+        <w:t xml:space="preserve"> predicts the topocentric, refracted, apparent distance between two selected bodies for a stated UTC, position, pressure and temperature. Select centre-to-centre, near contact or far contact to match what was actually observed; limb contacts include the applicable semidiameters. Record repeated sextant readings, their uncertainty and any shade/note. The displayed correction is </w:t>
+      </w:r>
+      <w:r>
+        <w:rPr>
+          <w:rStyle w:val="Emphasis"/>
+        </w:rPr>
+        <w:t>predicted minus observed</w:t>
+      </w:r>
+      <w:r>
+        <w:rPr/>
+        <w:t>: add it to the raw reading.</w:t>
+      </w:r>
+    </w:p>
+    <w:p>
+      <w:pPr>
+        <w:pStyle w:val="BodyText"/>
+        <w:bidi w:val="0"/>
+        <w:jc w:val="start"/>
+        <w:rPr/>
+      </w:pPr>
+      <w:r>
+        <w:rPr/>
+        <w:t>For checking scale or centering behaviour, prefer well-identified stars at similar, comfortable altitudes and away from the horizon. Star–star checks largely avoid limb and parallax ambiguity. Moon–star, Moon–planet and Sun/Moon pairs are valuable end-to-end checks, but incorrect UTC, position, limb choice or atmospheric conditions can masquerade as instrument error.</w:t>
+      </w:r>
+    </w:p>
+    <w:p>
+      <w:pPr>
+        <w:pStyle w:val="BodyText"/>
+        <w:bidi w:val="0"/>
+        <w:jc w:val="start"/>
+        <w:rPr/>
+      </w:pPr>
+      <w:r>
+        <w:rPr>
+          <w:rStyle w:val="Strong"/>
+        </w:rPr>
+        <w:t>Build / save profile</w:t>
+      </w:r>
+      <w:r>
+        <w:rPr/>
+        <w:t xml:space="preserve"> groups repeated checks by angular range and stores correction points, uncertainty, repeatability, instrument name and serial number in the plugin configuration. Select a saved profile to display its interpolated correction at the currently entered observed angle. Between tested angles the plugin uses straight-line interpolation; beyond the tested range it clearly marks the nearest endpoint rather than inventing a polynomial trend. The table is advisory and does not alter saved sights automatically, preserving the raw record and its provenance.</w:t>
+      </w:r>
+    </w:p>
+    <w:p>
+      <w:pPr>
+        <w:pStyle w:val="BodyText"/>
+        <w:bidi w:val="0"/>
+        <w:ind w:hanging="0" w:start="0" w:end="0"/>
+        <w:jc w:val="start"/>
+        <w:rPr/>
+      </w:pPr>
+      <w:r>
+        <w:rPr>
+          <w:rStyle w:val="Strong"/>
+          <w:shd w:fill="FFF0F0" w:val="clear"/>
+        </w:rPr>
+        <w:t>A computed profile is not mechanical adjustment.</w:t>
+      </w:r>
+      <w:r>
+        <w:rPr>
+          <w:shd w:fill="FFF0F0" w:val="clear"/>
+        </w:rPr>
+        <w:t xml:space="preserve"> Follow the sextant maker's specified sequence—normally perpendicularity, side, collimation and index checks—before investigating graduation, centering or scale behaviour. A changing or irregular correction may indicate damage, technique, shades, temperature or an adjustment fault that software must not conceal.</w:t>
+      </w:r>
+    </w:p>
+    <w:p>
+      <w:pPr>
+        <w:pStyle w:val="Heading1"/>
+        <w:bidi w:val="0"/>
+        <w:ind w:hanging="0" w:start="0" w:end="0"/>
+        <w:jc w:val="start"/>
+        <w:rPr/>
+      </w:pPr>
+      <w:bookmarkStart w:id="18" w:name="horizon"/>
+      <w:bookmarkEnd w:id="18"/>
+      <w:r>
+        <w:rPr/>
+        <w:t>13. Sunrise and sunset horizon events</w:t>
+      </w:r>
+    </w:p>
+    <w:p>
+      <w:pPr>
+        <w:pStyle w:val="BodyText"/>
+        <w:bidi w:val="0"/>
+        <w:jc w:val="start"/>
+        <w:rPr/>
+      </w:pPr>
+      <w:r>
+        <w:rPr/>
+        <w:t>The Horizon Event workflow records first upper-limb appearance at sunrise or final upper-limb disappearance at sunset. Timing gives an approximate altitude constraint. An optional bearing adds a rough directional constraint.</w:t>
+      </w:r>
+    </w:p>
+    <w:p>
+      <w:pPr>
+        <w:pStyle w:val="BodyText"/>
+        <w:numPr>
+          <w:ilvl w:val="0"/>
+          <w:numId w:val="15"/>
+        </w:numPr>
+        <w:tabs>
+          <w:tab w:val="clear" w:pos="1134"/>
+          <w:tab w:val="left" w:pos="709" w:leader="none"/>
+        </w:tabs>
+        <w:bidi w:val="0"/>
+        <w:spacing w:before="0" w:after="0"/>
+        <w:ind w:hanging="283" w:start="709"/>
+        <w:jc w:val="start"/>
+        <w:rPr/>
+      </w:pPr>
+      <w:r>
+        <w:rPr/>
+        <w:t xml:space="preserve">Select sunrise or sunset and enter/capture the UTC date and time. </w:t>
+      </w:r>
+    </w:p>
+    <w:p>
+      <w:pPr>
+        <w:pStyle w:val="BodyText"/>
+        <w:numPr>
+          <w:ilvl w:val="0"/>
+          <w:numId w:val="15"/>
+        </w:numPr>
+        <w:tabs>
+          <w:tab w:val="clear" w:pos="1134"/>
+          <w:tab w:val="left" w:pos="709" w:leader="none"/>
+        </w:tabs>
+        <w:bidi w:val="0"/>
+        <w:spacing w:before="0" w:after="0"/>
+        <w:ind w:hanging="283" w:start="709"/>
+        <w:jc w:val="start"/>
+        <w:rPr/>
+      </w:pPr>
+      <w:r>
+        <w:rPr/>
+        <w:t xml:space="preserve">Record time uncertainty and identify the time source. </w:t>
+      </w:r>
+    </w:p>
+    <w:p>
+      <w:pPr>
+        <w:pStyle w:val="BodyText"/>
+        <w:numPr>
+          <w:ilvl w:val="0"/>
+          <w:numId w:val="15"/>
+        </w:numPr>
+        <w:tabs>
+          <w:tab w:val="clear" w:pos="1134"/>
+          <w:tab w:val="left" w:pos="709" w:leader="none"/>
+        </w:tabs>
+        <w:bidi w:val="0"/>
+        <w:spacing w:before="0" w:after="0"/>
+        <w:ind w:hanging="283" w:start="709"/>
+        <w:jc w:val="start"/>
+        <w:rPr/>
+      </w:pPr>
+      <w:r>
+        <w:rPr/>
+        <w:t xml:space="preserve">If a bearing was taken, select magnetic compass or true bearing. </w:t>
+      </w:r>
+    </w:p>
+    <w:p>
+      <w:pPr>
+        <w:pStyle w:val="BodyText"/>
+        <w:numPr>
+          <w:ilvl w:val="0"/>
+          <w:numId w:val="15"/>
+        </w:numPr>
+        <w:tabs>
+          <w:tab w:val="clear" w:pos="1134"/>
+          <w:tab w:val="left" w:pos="709" w:leader="none"/>
+        </w:tabs>
+        <w:bidi w:val="0"/>
+        <w:spacing w:before="0" w:after="0"/>
+        <w:ind w:hanging="283" w:start="709"/>
+        <w:jc w:val="start"/>
+        <w:rPr/>
+      </w:pPr>
+      <w:r>
+        <w:rPr/>
+        <w:t xml:space="preserve">For a magnetic observation, enter magnetic variation and compass deviation using the displayed E+/W− convention. </w:t>
+      </w:r>
+    </w:p>
+    <w:p>
+      <w:pPr>
+        <w:pStyle w:val="BodyText"/>
+        <w:numPr>
+          <w:ilvl w:val="0"/>
+          <w:numId w:val="15"/>
+        </w:numPr>
+        <w:tabs>
+          <w:tab w:val="clear" w:pos="1134"/>
+          <w:tab w:val="left" w:pos="709" w:leader="none"/>
+        </w:tabs>
+        <w:bidi w:val="0"/>
+        <w:spacing w:before="0" w:after="0"/>
+        <w:ind w:hanging="283" w:start="709"/>
+        <w:jc w:val="start"/>
+        <w:rPr/>
+      </w:pPr>
+      <w:r>
+        <w:rPr/>
+        <w:t xml:space="preserve">Enter bearing uncertainty, height of eye, pressure, temperature, horizon quality and horizon/refraction uncertainty. </w:t>
+      </w:r>
+    </w:p>
+    <w:p>
+      <w:pPr>
+        <w:pStyle w:val="BodyText"/>
+        <w:numPr>
+          <w:ilvl w:val="0"/>
+          <w:numId w:val="15"/>
         </w:numPr>
         <w:tabs>
           <w:tab w:val="clear" w:pos="1134"/>
@@ -6482,7 +6805,7 @@
         <w:pStyle w:val="BodyText"/>
         <w:numPr>
           <w:ilvl w:val="0"/>
-          <w:numId w:val="15"/>
+          <w:numId w:val="16"/>
         </w:numPr>
         <w:tabs>
           <w:tab w:val="clear" w:pos="1134"/>
@@ -6503,73 +6826,6 @@
       <w:r>
         <w:rPr/>
         <w:t xml:space="preserve"> required for eclipse searching, paths and local circumstances. </w:t>
-      </w:r>
-    </w:p>
-    <w:p>
-      <w:pPr>
-        <w:pStyle w:val="BodyText"/>
-        <w:numPr>
-          <w:ilvl w:val="0"/>
-          <w:numId w:val="15"/>
-        </w:numPr>
-        <w:tabs>
-          <w:tab w:val="clear" w:pos="1134"/>
-          <w:tab w:val="left" w:pos="709" w:leader="none"/>
-        </w:tabs>
-        <w:bidi w:val="0"/>
-        <w:spacing w:before="0" w:after="0"/>
-        <w:ind w:hanging="283" w:start="709"/>
-        <w:jc w:val="start"/>
-        <w:rPr/>
-      </w:pPr>
-      <w:r>
-        <w:rPr>
-          <w:rStyle w:val="Strong"/>
-        </w:rPr>
-        <w:t>Lunar orientation:</w:t>
-      </w:r>
-      <w:r>
-        <w:rPr/>
-        <w:t xml:space="preserve"> optional orientation support for refined limb work. </w:t>
-      </w:r>
-    </w:p>
-    <w:p>
-      <w:pPr>
-        <w:pStyle w:val="BodyText"/>
-        <w:numPr>
-          <w:ilvl w:val="0"/>
-          <w:numId w:val="15"/>
-        </w:numPr>
-        <w:tabs>
-          <w:tab w:val="clear" w:pos="1134"/>
-          <w:tab w:val="left" w:pos="709" w:leader="none"/>
-        </w:tabs>
-        <w:bidi w:val="0"/>
-        <w:ind w:hanging="283" w:start="709"/>
-        <w:jc w:val="start"/>
-        <w:rPr/>
-      </w:pPr>
-      <w:r>
-        <w:rPr>
-          <w:rStyle w:val="Strong"/>
-        </w:rPr>
-        <w:t>LOLA pack:</w:t>
-      </w:r>
-      <w:r>
-        <w:rPr/>
-        <w:t xml:space="preserve"> optional lunar-topography refinement of contact timing; not required for ordinary eclipse use. </w:t>
-      </w:r>
-    </w:p>
-    <w:p>
-      <w:pPr>
-        <w:pStyle w:val="Heading2"/>
-        <w:bidi w:val="0"/>
-        <w:jc w:val="start"/>
-        <w:rPr/>
-      </w:pPr>
-      <w:r>
-        <w:rPr/>
-        <w:t>15.2 Find and plot an eclipse</w:t>
       </w:r>
     </w:p>
     <w:p>
@@ -6590,18 +6846,14 @@
         <w:rPr/>
       </w:pPr>
       <w:r>
-        <w:rPr/>
-        <w:t xml:space="preserve">Open </w:t>
-      </w:r>
-      <w:r>
         <w:rPr>
           <w:rStyle w:val="Strong"/>
         </w:rPr>
-        <w:t>Eclipses…</w:t>
-      </w:r>
-      <w:r>
-        <w:rPr/>
-        <w:t xml:space="preserve"> and confirm the data status. </w:t>
+        <w:t>Lunar orientation:</w:t>
+      </w:r>
+      <w:r>
+        <w:rPr/>
+        <w:t xml:space="preserve"> optional orientation support for refined limb work. </w:t>
       </w:r>
     </w:p>
     <w:p>
@@ -6616,6 +6868,45 @@
           <w:tab w:val="left" w:pos="709" w:leader="none"/>
         </w:tabs>
         <w:bidi w:val="0"/>
+        <w:ind w:hanging="283" w:start="709"/>
+        <w:jc w:val="start"/>
+        <w:rPr/>
+      </w:pPr>
+      <w:r>
+        <w:rPr>
+          <w:rStyle w:val="Strong"/>
+        </w:rPr>
+        <w:t>LOLA pack:</w:t>
+      </w:r>
+      <w:r>
+        <w:rPr/>
+        <w:t xml:space="preserve"> optional lunar-topography refinement of contact timing; not required for ordinary eclipse use. </w:t>
+      </w:r>
+    </w:p>
+    <w:p>
+      <w:pPr>
+        <w:pStyle w:val="Heading2"/>
+        <w:bidi w:val="0"/>
+        <w:jc w:val="start"/>
+        <w:rPr/>
+      </w:pPr>
+      <w:r>
+        <w:rPr/>
+        <w:t>15.2 Find and plot an eclipse</w:t>
+      </w:r>
+    </w:p>
+    <w:p>
+      <w:pPr>
+        <w:pStyle w:val="BodyText"/>
+        <w:numPr>
+          <w:ilvl w:val="0"/>
+          <w:numId w:val="17"/>
+        </w:numPr>
+        <w:tabs>
+          <w:tab w:val="clear" w:pos="1134"/>
+          <w:tab w:val="left" w:pos="709" w:leader="none"/>
+        </w:tabs>
+        <w:bidi w:val="0"/>
         <w:spacing w:before="0" w:after="0"/>
         <w:ind w:hanging="283" w:start="709"/>
         <w:jc w:val="start"/>
@@ -6623,17 +6914,17 @@
       </w:pPr>
       <w:r>
         <w:rPr/>
-        <w:t xml:space="preserve">Choose search years (the UI intentionally limits searches to 2100) and select </w:t>
+        <w:t xml:space="preserve">Open </w:t>
       </w:r>
       <w:r>
         <w:rPr>
           <w:rStyle w:val="Strong"/>
         </w:rPr>
-        <w:t>Find eclipses</w:t>
-      </w:r>
-      <w:r>
-        <w:rPr/>
-        <w:t xml:space="preserve">. </w:t>
+        <w:t>Eclipses…</w:t>
+      </w:r>
+      <w:r>
+        <w:rPr/>
+        <w:t xml:space="preserve"> and confirm the data status. </w:t>
       </w:r>
     </w:p>
     <w:p>
@@ -6641,7 +6932,7 @@
         <w:pStyle w:val="BodyText"/>
         <w:numPr>
           <w:ilvl w:val="0"/>
-          <w:numId w:val="16"/>
+          <w:numId w:val="17"/>
         </w:numPr>
         <w:tabs>
           <w:tab w:val="clear" w:pos="1134"/>
@@ -6655,7 +6946,17 @@
       </w:pPr>
       <w:r>
         <w:rPr/>
-        <w:t xml:space="preserve">Select an event. Enable the central line and totality/annularity limits and, if desired, partial-magnitude contours. </w:t>
+        <w:t xml:space="preserve">Choose search years (the UI intentionally limits searches to 2100) and select </w:t>
+      </w:r>
+      <w:r>
+        <w:rPr>
+          <w:rStyle w:val="Strong"/>
+        </w:rPr>
+        <w:t>Find eclipses</w:t>
+      </w:r>
+      <w:r>
+        <w:rPr/>
+        <w:t xml:space="preserve">. </w:t>
       </w:r>
     </w:p>
     <w:p>
@@ -6663,7 +6964,7 @@
         <w:pStyle w:val="BodyText"/>
         <w:numPr>
           <w:ilvl w:val="0"/>
-          <w:numId w:val="16"/>
+          <w:numId w:val="17"/>
         </w:numPr>
         <w:tabs>
           <w:tab w:val="clear" w:pos="1134"/>
@@ -6677,27 +6978,7 @@
       </w:pPr>
       <w:r>
         <w:rPr/>
-        <w:t xml:space="preserve">Select </w:t>
-      </w:r>
-      <w:r>
-        <w:rPr>
-          <w:rStyle w:val="Strong"/>
-        </w:rPr>
-        <w:t>Plot selected</w:t>
-      </w:r>
-      <w:r>
-        <w:rPr/>
-        <w:t xml:space="preserve">. Use </w:t>
-      </w:r>
-      <w:r>
-        <w:rPr>
-          <w:rStyle w:val="Strong"/>
-        </w:rPr>
-        <w:t>Clear plot</w:t>
-      </w:r>
-      <w:r>
-        <w:rPr/>
-        <w:t xml:space="preserve"> to remove overlays. </w:t>
+        <w:t xml:space="preserve">Select an event. Enable the central line and totality/annularity limits and, if desired, partial-magnitude contours. </w:t>
       </w:r>
     </w:p>
     <w:p>
@@ -6705,7 +6986,7 @@
         <w:pStyle w:val="BodyText"/>
         <w:numPr>
           <w:ilvl w:val="0"/>
-          <w:numId w:val="16"/>
+          <w:numId w:val="17"/>
         </w:numPr>
         <w:tabs>
           <w:tab w:val="clear" w:pos="1134"/>
@@ -6719,17 +7000,27 @@
       </w:pPr>
       <w:r>
         <w:rPr/>
-        <w:t xml:space="preserve">For local circumstances, enter coordinates or use boat position, then select </w:t>
+        <w:t xml:space="preserve">Select </w:t>
       </w:r>
       <w:r>
         <w:rPr>
           <w:rStyle w:val="Strong"/>
         </w:rPr>
-        <w:t>Calculate</w:t>
-      </w:r>
-      <w:r>
-        <w:rPr/>
-        <w:t xml:space="preserve">. </w:t>
+        <w:t>Plot selected</w:t>
+      </w:r>
+      <w:r>
+        <w:rPr/>
+        <w:t xml:space="preserve">. Use </w:t>
+      </w:r>
+      <w:r>
+        <w:rPr>
+          <w:rStyle w:val="Strong"/>
+        </w:rPr>
+        <w:t>Clear plot</w:t>
+      </w:r>
+      <w:r>
+        <w:rPr/>
+        <w:t xml:space="preserve"> to remove overlays. </w:t>
       </w:r>
     </w:p>
     <w:p>
@@ -6737,7 +7028,39 @@
         <w:pStyle w:val="BodyText"/>
         <w:numPr>
           <w:ilvl w:val="0"/>
-          <w:numId w:val="16"/>
+          <w:numId w:val="17"/>
+        </w:numPr>
+        <w:tabs>
+          <w:tab w:val="clear" w:pos="1134"/>
+          <w:tab w:val="left" w:pos="709" w:leader="none"/>
+        </w:tabs>
+        <w:bidi w:val="0"/>
+        <w:spacing w:before="0" w:after="0"/>
+        <w:ind w:hanging="283" w:start="709"/>
+        <w:jc w:val="start"/>
+        <w:rPr/>
+      </w:pPr>
+      <w:r>
+        <w:rPr/>
+        <w:t xml:space="preserve">For local circumstances, enter coordinates or use boat position, then select </w:t>
+      </w:r>
+      <w:r>
+        <w:rPr>
+          <w:rStyle w:val="Strong"/>
+        </w:rPr>
+        <w:t>Calculate</w:t>
+      </w:r>
+      <w:r>
+        <w:rPr/>
+        <w:t xml:space="preserve">. </w:t>
+      </w:r>
+    </w:p>
+    <w:p>
+      <w:pPr>
+        <w:pStyle w:val="BodyText"/>
+        <w:numPr>
+          <w:ilvl w:val="0"/>
+          <w:numId w:val="17"/>
         </w:numPr>
         <w:tabs>
           <w:tab w:val="clear" w:pos="1134"/>
@@ -7464,7 +7787,7 @@
         <w:pStyle w:val="BodyText"/>
         <w:numPr>
           <w:ilvl w:val="0"/>
-          <w:numId w:val="17"/>
+          <w:numId w:val="18"/>
         </w:numPr>
         <w:tabs>
           <w:tab w:val="clear" w:pos="1134"/>
@@ -7486,7 +7809,7 @@
         <w:pStyle w:val="BodyText"/>
         <w:numPr>
           <w:ilvl w:val="0"/>
-          <w:numId w:val="17"/>
+          <w:numId w:val="18"/>
         </w:numPr>
         <w:tabs>
           <w:tab w:val="clear" w:pos="1134"/>
@@ -7508,7 +7831,7 @@
         <w:pStyle w:val="BodyText"/>
         <w:numPr>
           <w:ilvl w:val="0"/>
-          <w:numId w:val="17"/>
+          <w:numId w:val="18"/>
         </w:numPr>
         <w:tabs>
           <w:tab w:val="clear" w:pos="1134"/>
@@ -7530,7 +7853,7 @@
         <w:pStyle w:val="BodyText"/>
         <w:numPr>
           <w:ilvl w:val="0"/>
-          <w:numId w:val="17"/>
+          <w:numId w:val="18"/>
         </w:numPr>
         <w:tabs>
           <w:tab w:val="clear" w:pos="1134"/>
@@ -7552,7 +7875,7 @@
         <w:pStyle w:val="BodyText"/>
         <w:numPr>
           <w:ilvl w:val="0"/>
-          <w:numId w:val="17"/>
+          <w:numId w:val="18"/>
         </w:numPr>
         <w:tabs>
           <w:tab w:val="clear" w:pos="1134"/>
@@ -10125,6 +10448,32 @@
         <w:rPr>
           <w:rStyle w:val="Strong"/>
         </w:rPr>
+        <w:t>Ageton table</w:t>
+      </w:r>
+    </w:p>
+    <w:p>
+      <w:pPr>
+        <w:pStyle w:val="ListContents"/>
+        <w:bidi w:val="0"/>
+        <w:jc w:val="start"/>
+        <w:rPr/>
+      </w:pPr>
+      <w:r>
+        <w:rPr/>
+        <w:t xml:space="preserve">A compact universal sight-reduction table using precomputed logarithms of cosecants and secants. It converts spherical-triangle reduction into lookup plus addition/subtraction and provides the off-track fallback when a tailored direct Hc/Zn table does not cover the actual geometry. </w:t>
+      </w:r>
+    </w:p>
+    <w:p>
+      <w:pPr>
+        <w:pStyle w:val="ListHeading"/>
+        <w:bidi w:val="0"/>
+        <w:jc w:val="start"/>
+        <w:rPr/>
+      </w:pPr>
+      <w:r>
+        <w:rPr>
+          <w:rStyle w:val="Strong"/>
+        </w:rPr>
         <w:t>Almanac</w:t>
       </w:r>
     </w:p>
@@ -10345,7 +10694,33 @@
       </w:pPr>
       <w:r>
         <w:rPr/>
-        <w:t xml:space="preserve">A document containing the ephemeris, corrections, formulae and procedures required to reduce its supported sights using a scientific calculator. It is not calculator-free and does not replace observation instruments, timekeeping, plotting tools or training. </w:t>
+        <w:t xml:space="preserve">A document containing the ephemeris, corrections, formulae and procedures required to reduce its supported sights using a scientific calculator. </w:t>
+      </w:r>
+    </w:p>
+    <w:p>
+      <w:pPr>
+        <w:pStyle w:val="ListHeading"/>
+        <w:bidi w:val="0"/>
+        <w:jc w:val="start"/>
+        <w:rPr/>
+      </w:pPr>
+      <w:r>
+        <w:rPr>
+          <w:rStyle w:val="Strong"/>
+        </w:rPr>
+        <w:t>Calculator-free backup</w:t>
+      </w:r>
+    </w:p>
+    <w:p>
+      <w:pPr>
+        <w:pStyle w:val="ListContents"/>
+        <w:bidi w:val="0"/>
+        <w:jc w:val="start"/>
+        <w:rPr/>
+      </w:pPr>
+      <w:r>
+        <w:rPr/>
+        <w:t xml:space="preserve">A dependency-checked paper document containing ephemeris, interpolation, altitude-correction and universal sight-reduction lookup tables, procedures and forms. Once printed, it requires no computer, internet connection, scientific calculator or external almanac, but still requires observation instruments, accurate time, plotting tools, competence and judgement. </w:t>
       </w:r>
     </w:p>
     <w:p>
@@ -12162,7 +12537,7 @@
         <w:pStyle w:val="BodyText"/>
         <w:numPr>
           <w:ilvl w:val="0"/>
-          <w:numId w:val="18"/>
+          <w:numId w:val="19"/>
         </w:numPr>
         <w:tabs>
           <w:tab w:val="clear" w:pos="1134"/>
@@ -12184,7 +12559,7 @@
         <w:pStyle w:val="BodyText"/>
         <w:numPr>
           <w:ilvl w:val="0"/>
-          <w:numId w:val="18"/>
+          <w:numId w:val="19"/>
         </w:numPr>
         <w:tabs>
           <w:tab w:val="clear" w:pos="1134"/>
@@ -12206,7 +12581,7 @@
         <w:pStyle w:val="BodyText"/>
         <w:numPr>
           <w:ilvl w:val="0"/>
-          <w:numId w:val="18"/>
+          <w:numId w:val="19"/>
         </w:numPr>
         <w:tabs>
           <w:tab w:val="clear" w:pos="1134"/>
@@ -12228,7 +12603,7 @@
         <w:pStyle w:val="BodyText"/>
         <w:numPr>
           <w:ilvl w:val="0"/>
-          <w:numId w:val="18"/>
+          <w:numId w:val="19"/>
         </w:numPr>
         <w:tabs>
           <w:tab w:val="clear" w:pos="1134"/>
@@ -12559,7 +12934,7 @@
         <w:pStyle w:val="BodyText"/>
         <w:numPr>
           <w:ilvl w:val="0"/>
-          <w:numId w:val="19"/>
+          <w:numId w:val="20"/>
         </w:numPr>
         <w:tabs>
           <w:tab w:val="clear" w:pos="1134"/>
@@ -12603,7 +12978,7 @@
         <w:pStyle w:val="BodyText"/>
         <w:numPr>
           <w:ilvl w:val="0"/>
-          <w:numId w:val="19"/>
+          <w:numId w:val="20"/>
         </w:numPr>
         <w:tabs>
           <w:tab w:val="clear" w:pos="1134"/>
@@ -12647,7 +13022,7 @@
         <w:pStyle w:val="BodyText"/>
         <w:numPr>
           <w:ilvl w:val="0"/>
-          <w:numId w:val="19"/>
+          <w:numId w:val="20"/>
         </w:numPr>
         <w:tabs>
           <w:tab w:val="clear" w:pos="1134"/>
@@ -12691,7 +13066,7 @@
         <w:pStyle w:val="BodyText"/>
         <w:numPr>
           <w:ilvl w:val="0"/>
-          <w:numId w:val="19"/>
+          <w:numId w:val="20"/>
         </w:numPr>
         <w:tabs>
           <w:tab w:val="clear" w:pos="1134"/>
@@ -12735,7 +13110,7 @@
         <w:pStyle w:val="BodyText"/>
         <w:numPr>
           <w:ilvl w:val="0"/>
-          <w:numId w:val="19"/>
+          <w:numId w:val="20"/>
         </w:numPr>
         <w:tabs>
           <w:tab w:val="clear" w:pos="1134"/>
@@ -12769,7 +13144,7 @@
         <w:pStyle w:val="BodyText"/>
         <w:numPr>
           <w:ilvl w:val="0"/>
-          <w:numId w:val="19"/>
+          <w:numId w:val="20"/>
         </w:numPr>
         <w:tabs>
           <w:tab w:val="clear" w:pos="1134"/>
@@ -13995,8 +14370,8 @@
   <w:abstractNum w:abstractNumId="10">
     <w:lvl w:ilvl="0">
       <w:start w:val="1"/>
-      <w:numFmt w:val="decimal"/>
-      <w:lvlText w:val="%1."/>
+      <w:numFmt w:val="bullet"/>
+      <w:lvlText w:val=""/>
       <w:lvlJc w:val="start"/>
       <w:pPr>
         <w:tabs>
@@ -14004,12 +14379,14 @@
         </w:tabs>
         <w:ind w:start="709" w:hanging="283"/>
       </w:pPr>
-      <w:rPr/>
+      <w:rPr>
+        <w:rFonts w:ascii="Symbol" w:hAnsi="Symbol" w:cs="Symbol" w:hint="default"/>
+      </w:rPr>
     </w:lvl>
     <w:lvl w:ilvl="1">
       <w:start w:val="1"/>
-      <w:numFmt w:val="decimal"/>
-      <w:lvlText w:val="%2."/>
+      <w:numFmt w:val="bullet"/>
+      <w:lvlText w:val=""/>
       <w:lvlJc w:val="start"/>
       <w:pPr>
         <w:tabs>
@@ -14017,12 +14394,14 @@
         </w:tabs>
         <w:ind w:start="1418" w:hanging="283"/>
       </w:pPr>
-      <w:rPr/>
+      <w:rPr>
+        <w:rFonts w:ascii="Symbol" w:hAnsi="Symbol" w:cs="Symbol" w:hint="default"/>
+      </w:rPr>
     </w:lvl>
     <w:lvl w:ilvl="2">
       <w:start w:val="1"/>
-      <w:numFmt w:val="decimal"/>
-      <w:lvlText w:val="%3."/>
+      <w:numFmt w:val="bullet"/>
+      <w:lvlText w:val=""/>
       <w:lvlJc w:val="start"/>
       <w:pPr>
         <w:tabs>
@@ -14030,12 +14409,14 @@
         </w:tabs>
         <w:ind w:start="2127" w:hanging="283"/>
       </w:pPr>
-      <w:rPr/>
+      <w:rPr>
+        <w:rFonts w:ascii="Symbol" w:hAnsi="Symbol" w:cs="Symbol" w:hint="default"/>
+      </w:rPr>
     </w:lvl>
     <w:lvl w:ilvl="3">
       <w:start w:val="1"/>
-      <w:numFmt w:val="decimal"/>
-      <w:lvlText w:val="%4."/>
+      <w:numFmt w:val="bullet"/>
+      <w:lvlText w:val=""/>
       <w:lvlJc w:val="start"/>
       <w:pPr>
         <w:tabs>
@@ -14043,12 +14424,14 @@
         </w:tabs>
         <w:ind w:start="2836" w:hanging="283"/>
       </w:pPr>
-      <w:rPr/>
+      <w:rPr>
+        <w:rFonts w:ascii="Symbol" w:hAnsi="Symbol" w:cs="Symbol" w:hint="default"/>
+      </w:rPr>
     </w:lvl>
     <w:lvl w:ilvl="4">
       <w:start w:val="1"/>
-      <w:numFmt w:val="decimal"/>
-      <w:lvlText w:val="%5."/>
+      <w:numFmt w:val="bullet"/>
+      <w:lvlText w:val=""/>
       <w:lvlJc w:val="start"/>
       <w:pPr>
         <w:tabs>
@@ -14056,12 +14439,14 @@
         </w:tabs>
         <w:ind w:start="3545" w:hanging="283"/>
       </w:pPr>
-      <w:rPr/>
+      <w:rPr>
+        <w:rFonts w:ascii="Symbol" w:hAnsi="Symbol" w:cs="Symbol" w:hint="default"/>
+      </w:rPr>
     </w:lvl>
     <w:lvl w:ilvl="5">
       <w:start w:val="1"/>
-      <w:numFmt w:val="decimal"/>
-      <w:lvlText w:val="%6."/>
+      <w:numFmt w:val="bullet"/>
+      <w:lvlText w:val=""/>
       <w:lvlJc w:val="start"/>
       <w:pPr>
         <w:tabs>
@@ -14069,12 +14454,14 @@
         </w:tabs>
         <w:ind w:start="4254" w:hanging="283"/>
       </w:pPr>
-      <w:rPr/>
+      <w:rPr>
+        <w:rFonts w:ascii="Symbol" w:hAnsi="Symbol" w:cs="Symbol" w:hint="default"/>
+      </w:rPr>
     </w:lvl>
     <w:lvl w:ilvl="6">
       <w:start w:val="1"/>
-      <w:numFmt w:val="decimal"/>
-      <w:lvlText w:val="%7."/>
+      <w:numFmt w:val="bullet"/>
+      <w:lvlText w:val=""/>
       <w:lvlJc w:val="start"/>
       <w:pPr>
         <w:tabs>
@@ -14082,12 +14469,14 @@
         </w:tabs>
         <w:ind w:start="4963" w:hanging="283"/>
       </w:pPr>
-      <w:rPr/>
+      <w:rPr>
+        <w:rFonts w:ascii="Symbol" w:hAnsi="Symbol" w:cs="Symbol" w:hint="default"/>
+      </w:rPr>
     </w:lvl>
     <w:lvl w:ilvl="7">
       <w:start w:val="1"/>
-      <w:numFmt w:val="decimal"/>
-      <w:lvlText w:val="%8."/>
+      <w:numFmt w:val="bullet"/>
+      <w:lvlText w:val=""/>
       <w:lvlJc w:val="start"/>
       <w:pPr>
         <w:tabs>
@@ -14095,12 +14484,14 @@
         </w:tabs>
         <w:ind w:start="5672" w:hanging="283"/>
       </w:pPr>
-      <w:rPr/>
+      <w:rPr>
+        <w:rFonts w:ascii="Symbol" w:hAnsi="Symbol" w:cs="Symbol" w:hint="default"/>
+      </w:rPr>
     </w:lvl>
     <w:lvl w:ilvl="8">
       <w:start w:val="1"/>
-      <w:numFmt w:val="decimal"/>
-      <w:lvlText w:val="%9."/>
+      <w:numFmt w:val="bullet"/>
+      <w:lvlText w:val=""/>
       <w:lvlJc w:val="start"/>
       <w:pPr>
         <w:tabs>
@@ -14108,12 +14499,133 @@
         </w:tabs>
         <w:ind w:start="6381" w:hanging="283"/>
       </w:pPr>
-      <w:rPr/>
+      <w:rPr>
+        <w:rFonts w:ascii="Symbol" w:hAnsi="Symbol" w:cs="Symbol" w:hint="default"/>
+      </w:rPr>
     </w:lvl>
   </w:abstractNum>
   <w:abstractNum w:abstractNumId="11">
     <w:lvl w:ilvl="0">
       <w:start w:val="1"/>
+      <w:numFmt w:val="decimal"/>
+      <w:lvlText w:val="%1."/>
+      <w:lvlJc w:val="start"/>
+      <w:pPr>
+        <w:tabs>
+          <w:tab w:val="num" w:pos="709"/>
+        </w:tabs>
+        <w:ind w:start="709" w:hanging="283"/>
+      </w:pPr>
+      <w:rPr/>
+    </w:lvl>
+    <w:lvl w:ilvl="1">
+      <w:start w:val="1"/>
+      <w:numFmt w:val="decimal"/>
+      <w:lvlText w:val="%2."/>
+      <w:lvlJc w:val="start"/>
+      <w:pPr>
+        <w:tabs>
+          <w:tab w:val="num" w:pos="1418"/>
+        </w:tabs>
+        <w:ind w:start="1418" w:hanging="283"/>
+      </w:pPr>
+      <w:rPr/>
+    </w:lvl>
+    <w:lvl w:ilvl="2">
+      <w:start w:val="1"/>
+      <w:numFmt w:val="decimal"/>
+      <w:lvlText w:val="%3."/>
+      <w:lvlJc w:val="start"/>
+      <w:pPr>
+        <w:tabs>
+          <w:tab w:val="num" w:pos="2127"/>
+        </w:tabs>
+        <w:ind w:start="2127" w:hanging="283"/>
+      </w:pPr>
+      <w:rPr/>
+    </w:lvl>
+    <w:lvl w:ilvl="3">
+      <w:start w:val="1"/>
+      <w:numFmt w:val="decimal"/>
+      <w:lvlText w:val="%4."/>
+      <w:lvlJc w:val="start"/>
+      <w:pPr>
+        <w:tabs>
+          <w:tab w:val="num" w:pos="2836"/>
+        </w:tabs>
+        <w:ind w:start="2836" w:hanging="283"/>
+      </w:pPr>
+      <w:rPr/>
+    </w:lvl>
+    <w:lvl w:ilvl="4">
+      <w:start w:val="1"/>
+      <w:numFmt w:val="decimal"/>
+      <w:lvlText w:val="%5."/>
+      <w:lvlJc w:val="start"/>
+      <w:pPr>
+        <w:tabs>
+          <w:tab w:val="num" w:pos="3545"/>
+        </w:tabs>
+        <w:ind w:start="3545" w:hanging="283"/>
+      </w:pPr>
+      <w:rPr/>
+    </w:lvl>
+    <w:lvl w:ilvl="5">
+      <w:start w:val="1"/>
+      <w:numFmt w:val="decimal"/>
+      <w:lvlText w:val="%6."/>
+      <w:lvlJc w:val="start"/>
+      <w:pPr>
+        <w:tabs>
+          <w:tab w:val="num" w:pos="4254"/>
+        </w:tabs>
+        <w:ind w:start="4254" w:hanging="283"/>
+      </w:pPr>
+      <w:rPr/>
+    </w:lvl>
+    <w:lvl w:ilvl="6">
+      <w:start w:val="1"/>
+      <w:numFmt w:val="decimal"/>
+      <w:lvlText w:val="%7."/>
+      <w:lvlJc w:val="start"/>
+      <w:pPr>
+        <w:tabs>
+          <w:tab w:val="num" w:pos="4963"/>
+        </w:tabs>
+        <w:ind w:start="4963" w:hanging="283"/>
+      </w:pPr>
+      <w:rPr/>
+    </w:lvl>
+    <w:lvl w:ilvl="7">
+      <w:start w:val="1"/>
+      <w:numFmt w:val="decimal"/>
+      <w:lvlText w:val="%8."/>
+      <w:lvlJc w:val="start"/>
+      <w:pPr>
+        <w:tabs>
+          <w:tab w:val="num" w:pos="5672"/>
+        </w:tabs>
+        <w:ind w:start="5672" w:hanging="283"/>
+      </w:pPr>
+      <w:rPr/>
+    </w:lvl>
+    <w:lvl w:ilvl="8">
+      <w:start w:val="1"/>
+      <w:numFmt w:val="decimal"/>
+      <w:lvlText w:val="%9."/>
+      <w:lvlJc w:val="start"/>
+      <w:pPr>
+        <w:tabs>
+          <w:tab w:val="num" w:pos="6381"/>
+        </w:tabs>
+        <w:ind w:start="6381" w:hanging="283"/>
+      </w:pPr>
+      <w:rPr/>
+    </w:lvl>
+  </w:abstractNum>
+  <w:abstractNum w:abstractNumId="12">
+    <w:lvl w:ilvl="0">
+      <w:start w:val="1"/>
       <w:numFmt w:val="bullet"/>
       <w:lvlText w:val=""/>
       <w:lvlJc w:val="start"/>
@@ -14248,125 +14760,6 @@
       </w:rPr>
     </w:lvl>
   </w:abstractNum>
-  <w:abstractNum w:abstractNumId="12">
-    <w:lvl w:ilvl="0">
-      <w:start w:val="1"/>
-      <w:numFmt w:val="decimal"/>
-      <w:lvlText w:val="%1."/>
-      <w:lvlJc w:val="start"/>
-      <w:pPr>
-        <w:tabs>
-          <w:tab w:val="num" w:pos="709"/>
-        </w:tabs>
-        <w:ind w:start="709" w:hanging="283"/>
-      </w:pPr>
-      <w:rPr/>
-    </w:lvl>
-    <w:lvl w:ilvl="1">
-      <w:start w:val="1"/>
-      <w:numFmt w:val="decimal"/>
-      <w:lvlText w:val="%2."/>
-      <w:lvlJc w:val="start"/>
-      <w:pPr>
-        <w:tabs>
-          <w:tab w:val="num" w:pos="1418"/>
-        </w:tabs>
-        <w:ind w:start="1418" w:hanging="283"/>
-      </w:pPr>
-      <w:rPr/>
-    </w:lvl>
-    <w:lvl w:ilvl="2">
-      <w:start w:val="1"/>
-      <w:numFmt w:val="decimal"/>
-      <w:lvlText w:val="%3."/>
-      <w:lvlJc w:val="start"/>
-      <w:pPr>
-        <w:tabs>
-          <w:tab w:val="num" w:pos="2127"/>
-        </w:tabs>
-        <w:ind w:start="2127" w:hanging="283"/>
-      </w:pPr>
-      <w:rPr/>
-    </w:lvl>
-    <w:lvl w:ilvl="3">
-      <w:start w:val="1"/>
-      <w:numFmt w:val="decimal"/>
-      <w:lvlText w:val="%4."/>
-      <w:lvlJc w:val="start"/>
-      <w:pPr>
-        <w:tabs>
-          <w:tab w:val="num" w:pos="2836"/>
-        </w:tabs>
-        <w:ind w:start="2836" w:hanging="283"/>
-      </w:pPr>
-      <w:rPr/>
-    </w:lvl>
-    <w:lvl w:ilvl="4">
-      <w:start w:val="1"/>
-      <w:numFmt w:val="decimal"/>
-      <w:lvlText w:val="%5."/>
-      <w:lvlJc w:val="start"/>
-      <w:pPr>
-        <w:tabs>
-          <w:tab w:val="num" w:pos="3545"/>
-        </w:tabs>
-        <w:ind w:start="3545" w:hanging="283"/>
-      </w:pPr>
-      <w:rPr/>
-    </w:lvl>
-    <w:lvl w:ilvl="5">
-      <w:start w:val="1"/>
-      <w:numFmt w:val="decimal"/>
-      <w:lvlText w:val="%6."/>
-      <w:lvlJc w:val="start"/>
-      <w:pPr>
-        <w:tabs>
-          <w:tab w:val="num" w:pos="4254"/>
-        </w:tabs>
-        <w:ind w:start="4254" w:hanging="283"/>
-      </w:pPr>
-      <w:rPr/>
-    </w:lvl>
-    <w:lvl w:ilvl="6">
-      <w:start w:val="1"/>
-      <w:numFmt w:val="decimal"/>
-      <w:lvlText w:val="%7."/>
-      <w:lvlJc w:val="start"/>
-      <w:pPr>
-        <w:tabs>
-          <w:tab w:val="num" w:pos="4963"/>
-        </w:tabs>
-        <w:ind w:start="4963" w:hanging="283"/>
-      </w:pPr>
-      <w:rPr/>
-    </w:lvl>
-    <w:lvl w:ilvl="7">
-      <w:start w:val="1"/>
-      <w:numFmt w:val="decimal"/>
-      <w:lvlText w:val="%8."/>
-      <w:lvlJc w:val="start"/>
-      <w:pPr>
-        <w:tabs>
-          <w:tab w:val="num" w:pos="5672"/>
-        </w:tabs>
-        <w:ind w:start="5672" w:hanging="283"/>
-      </w:pPr>
-      <w:rPr/>
-    </w:lvl>
-    <w:lvl w:ilvl="8">
-      <w:start w:val="1"/>
-      <w:numFmt w:val="decimal"/>
-      <w:lvlText w:val="%9."/>
-      <w:lvlJc w:val="start"/>
-      <w:pPr>
-        <w:tabs>
-          <w:tab w:val="num" w:pos="6381"/>
-        </w:tabs>
-        <w:ind w:start="6381" w:hanging="283"/>
-      </w:pPr>
-      <w:rPr/>
-    </w:lvl>
-  </w:abstractNum>
   <w:abstractNum w:abstractNumId="13">
     <w:lvl w:ilvl="0">
       <w:start w:val="1"/>
@@ -14608,6 +15001,125 @@
   <w:abstractNum w:abstractNumId="15">
     <w:lvl w:ilvl="0">
       <w:start w:val="1"/>
+      <w:numFmt w:val="decimal"/>
+      <w:lvlText w:val="%1."/>
+      <w:lvlJc w:val="start"/>
+      <w:pPr>
+        <w:tabs>
+          <w:tab w:val="num" w:pos="709"/>
+        </w:tabs>
+        <w:ind w:start="709" w:hanging="283"/>
+      </w:pPr>
+      <w:rPr/>
+    </w:lvl>
+    <w:lvl w:ilvl="1">
+      <w:start w:val="1"/>
+      <w:numFmt w:val="decimal"/>
+      <w:lvlText w:val="%2."/>
+      <w:lvlJc w:val="start"/>
+      <w:pPr>
+        <w:tabs>
+          <w:tab w:val="num" w:pos="1418"/>
+        </w:tabs>
+        <w:ind w:start="1418" w:hanging="283"/>
+      </w:pPr>
+      <w:rPr/>
+    </w:lvl>
+    <w:lvl w:ilvl="2">
+      <w:start w:val="1"/>
+      <w:numFmt w:val="decimal"/>
+      <w:lvlText w:val="%3."/>
+      <w:lvlJc w:val="start"/>
+      <w:pPr>
+        <w:tabs>
+          <w:tab w:val="num" w:pos="2127"/>
+        </w:tabs>
+        <w:ind w:start="2127" w:hanging="283"/>
+      </w:pPr>
+      <w:rPr/>
+    </w:lvl>
+    <w:lvl w:ilvl="3">
+      <w:start w:val="1"/>
+      <w:numFmt w:val="decimal"/>
+      <w:lvlText w:val="%4."/>
+      <w:lvlJc w:val="start"/>
+      <w:pPr>
+        <w:tabs>
+          <w:tab w:val="num" w:pos="2836"/>
+        </w:tabs>
+        <w:ind w:start="2836" w:hanging="283"/>
+      </w:pPr>
+      <w:rPr/>
+    </w:lvl>
+    <w:lvl w:ilvl="4">
+      <w:start w:val="1"/>
+      <w:numFmt w:val="decimal"/>
+      <w:lvlText w:val="%5."/>
+      <w:lvlJc w:val="start"/>
+      <w:pPr>
+        <w:tabs>
+          <w:tab w:val="num" w:pos="3545"/>
+        </w:tabs>
+        <w:ind w:start="3545" w:hanging="283"/>
+      </w:pPr>
+      <w:rPr/>
+    </w:lvl>
+    <w:lvl w:ilvl="5">
+      <w:start w:val="1"/>
+      <w:numFmt w:val="decimal"/>
+      <w:lvlText w:val="%6."/>
+      <w:lvlJc w:val="start"/>
+      <w:pPr>
+        <w:tabs>
+          <w:tab w:val="num" w:pos="4254"/>
+        </w:tabs>
+        <w:ind w:start="4254" w:hanging="283"/>
+      </w:pPr>
+      <w:rPr/>
+    </w:lvl>
+    <w:lvl w:ilvl="6">
+      <w:start w:val="1"/>
+      <w:numFmt w:val="decimal"/>
+      <w:lvlText w:val="%7."/>
+      <w:lvlJc w:val="start"/>
+      <w:pPr>
+        <w:tabs>
+          <w:tab w:val="num" w:pos="4963"/>
+        </w:tabs>
+        <w:ind w:start="4963" w:hanging="283"/>
+      </w:pPr>
+      <w:rPr/>
+    </w:lvl>
+    <w:lvl w:ilvl="7">
+      <w:start w:val="1"/>
+      <w:numFmt w:val="decimal"/>
+      <w:lvlText w:val="%8."/>
+      <w:lvlJc w:val="start"/>
+      <w:pPr>
+        <w:tabs>
+          <w:tab w:val="num" w:pos="5672"/>
+        </w:tabs>
+        <w:ind w:start="5672" w:hanging="283"/>
+      </w:pPr>
+      <w:rPr/>
+    </w:lvl>
+    <w:lvl w:ilvl="8">
+      <w:start w:val="1"/>
+      <w:numFmt w:val="decimal"/>
+      <w:lvlText w:val="%9."/>
+      <w:lvlJc w:val="start"/>
+      <w:pPr>
+        <w:tabs>
+          <w:tab w:val="num" w:pos="6381"/>
+        </w:tabs>
+        <w:ind w:start="6381" w:hanging="283"/>
+      </w:pPr>
+      <w:rPr/>
+    </w:lvl>
+  </w:abstractNum>
+  <w:abstractNum w:abstractNumId="16">
+    <w:lvl w:ilvl="0">
+      <w:start w:val="1"/>
       <w:numFmt w:val="bullet"/>
       <w:lvlText w:val=""/>
       <w:lvlJc w:val="start"/>
@@ -14742,7 +15254,7 @@
       </w:rPr>
     </w:lvl>
   </w:abstractNum>
-  <w:abstractNum w:abstractNumId="16">
+  <w:abstractNum w:abstractNumId="17">
     <w:lvl w:ilvl="0">
       <w:start w:val="1"/>
       <w:numFmt w:val="decimal"/>
@@ -14861,7 +15373,7 @@
       <w:rPr/>
     </w:lvl>
   </w:abstractNum>
-  <w:abstractNum w:abstractNumId="17">
+  <w:abstractNum w:abstractNumId="18">
     <w:lvl w:ilvl="0">
       <w:start w:val="1"/>
       <w:numFmt w:val="bullet"/>
@@ -14998,7 +15510,7 @@
       </w:rPr>
     </w:lvl>
   </w:abstractNum>
-  <w:abstractNum w:abstractNumId="18">
+  <w:abstractNum w:abstractNumId="19">
     <w:lvl w:ilvl="0">
       <w:start w:val="1"/>
       <w:numFmt w:val="bullet"/>
@@ -15135,7 +15647,7 @@
       </w:rPr>
     </w:lvl>
   </w:abstractNum>
-  <w:abstractNum w:abstractNumId="19">
+  <w:abstractNum w:abstractNumId="20">
     <w:lvl w:ilvl="0">
       <w:start w:val="1"/>
       <w:numFmt w:val="decimal"/>
@@ -15254,7 +15766,7 @@
       <w:rPr/>
     </w:lvl>
   </w:abstractNum>
-  <w:abstractNum w:abstractNumId="20">
+  <w:abstractNum w:abstractNumId="21">
     <w:lvl w:ilvl="0">
       <w:start w:val="1"/>
       <w:numFmt w:val="none"/>
@@ -15435,6 +15947,9 @@
   </w:num>
   <w:num w:numId="20">
     <w:abstractNumId w:val="20"/>
+  </w:num>
+  <w:num w:numId="21">
+    <w:abstractNumId w:val="21"/>
   </w:num>
 </w:numbering>
 </file>

</xml_diff>

<commit_message>
Harden lunar and coastal observation workflows
</commit_message>
<xml_diff>
--- a/docs/v2/output/Celestial_Navigation_Manual_v2.docx
+++ b/docs/v2/output/Celestial_Navigation_Manual_v2.docx
@@ -54,7 +54,7 @@
       </w:pPr>
       <w:r>
         <w:rPr/>
-        <w:t>Celestial Navigation plugin 2.8.1</w:t>
+        <w:t>Celestial Navigation plugin 2.8.2</w:t>
         <w:br/>
         <w:t>Documentation revision 3 September 2026</w:t>
       </w:r>
@@ -6099,7 +6099,7 @@
       </w:pPr>
       <w:r>
         <w:rPr/>
-        <w:t xml:space="preserve">Select </w:t>
+        <w:t xml:space="preserve">Highlight one of the sights in the main list, then select </w:t>
       </w:r>
       <w:r>
         <w:rPr>
@@ -6109,7 +6109,17 @@
       </w:r>
       <w:r>
         <w:rPr/>
-        <w:t xml:space="preserve"> and tick the observations belonging to one watch/session. </w:t>
+        <w:t xml:space="preserve">. The highlighted sight and observations within six hours are initially ticked; adjust the selection so it contains only one watch/session. </w:t>
+      </w:r>
+      <w:r>
+        <w:rPr>
+          <w:rStyle w:val="Strong"/>
+        </w:rPr>
+        <w:t>Select visible sights</w:t>
+      </w:r>
+      <w:r>
+        <w:rPr/>
+        <w:t xml:space="preserve"> is an explicit convenience, not an assertion that every visible sight belongs to one session. </w:t>
       </w:r>
     </w:p>
     <w:p>
@@ -6171,7 +6181,17 @@
       </w:pPr>
       <w:r>
         <w:rPr/>
-        <w:t xml:space="preserve">Enter an initial/known position and a physically justified watch-correction search span. If the vessel moved over the session, enter true COG and SOG. </w:t>
+        <w:t xml:space="preserve">The initial position comes from the earliest selected sight's DR and can be edited or restored with </w:t>
+      </w:r>
+      <w:r>
+        <w:rPr>
+          <w:rStyle w:val="Strong"/>
+        </w:rPr>
+        <w:t>Use earliest selected DR</w:t>
+      </w:r>
+      <w:r>
+        <w:rPr/>
+        <w:t xml:space="preserve">. Do not replace a useful DR with 0° N, 0° E: the triple includes two altitude constraints and the position is also the joint solver's convergence seed. </w:t>
       </w:r>
     </w:p>
     <w:p>
@@ -6192,17 +6212,17 @@
       </w:pPr>
       <w:r>
         <w:rPr/>
-        <w:t xml:space="preserve">Normally retain </w:t>
-      </w:r>
-      <w:r>
-        <w:rPr>
-          <w:rStyle w:val="Strong"/>
-        </w:rPr>
-        <w:t>Robust fit</w:t>
-      </w:r>
-      <w:r>
-        <w:rPr/>
-        <w:t xml:space="preserve">. It reduces the leverage of a discrepant reading but still displays and flags every residual; it never deletes evidence. </w:t>
+        <w:t xml:space="preserve">Enter a physically justified </w:t>
+      </w:r>
+      <w:r>
+        <w:rPr>
+          <w:rStyle w:val="Strong"/>
+        </w:rPr>
+        <w:t>Additional watch correction search ±</w:t>
+      </w:r>
+      <w:r>
+        <w:rPr/>
+        <w:t xml:space="preserve">. Every row already retains its own recorded UTC; this control searches a correction either side of the correction already applied, rather than defining a new observation start time. If the vessel moved over the session, enter true COG and SOG. </w:t>
       </w:r>
     </w:p>
     <w:p>
@@ -6217,12 +6237,54 @@
           <w:tab w:val="left" w:pos="709" w:leader="none"/>
         </w:tabs>
         <w:bidi w:val="0"/>
+        <w:spacing w:before="0" w:after="0"/>
         <w:ind w:hanging="283" w:start="709"/>
         <w:rPr/>
       </w:pPr>
       <w:r>
         <w:rPr/>
-        <w:t xml:space="preserve">Solve, inspect all competitive candidates, angular and weighted RMS, formal uncertainties and every component residual before applying a watch correction. </w:t>
+        <w:t xml:space="preserve">Normally retain </w:t>
+      </w:r>
+      <w:r>
+        <w:rPr>
+          <w:rStyle w:val="Strong"/>
+        </w:rPr>
+        <w:t>Robust fit</w:t>
+      </w:r>
+      <w:r>
+        <w:rPr/>
+        <w:t xml:space="preserve">. It reduces the leverage of a discrepant reading but still displays and flags every residual; it never deletes evidence. </w:t>
+      </w:r>
+    </w:p>
+    <w:p>
+      <w:pPr>
+        <w:pStyle w:val="BodyText"/>
+        <w:numPr>
+          <w:ilvl w:val="0"/>
+          <w:numId w:val="14"/>
+        </w:numPr>
+        <w:tabs>
+          <w:tab w:val="clear" w:pos="1134"/>
+          <w:tab w:val="left" w:pos="709" w:leader="none"/>
+        </w:tabs>
+        <w:bidi w:val="0"/>
+        <w:ind w:hanging="283" w:start="709"/>
+        <w:rPr/>
+      </w:pPr>
+      <w:r>
+        <w:rPr/>
+        <w:t xml:space="preserve">Solve, inspect all competitive candidates, angular and weighted RMS, formal uncertainties and every component residual before applying a watch correction. The bounded multi-start fit runs away from the GUI thread and has progress and cancellation. </w:t>
+      </w:r>
+    </w:p>
+    <w:p>
+      <w:pPr>
+        <w:pStyle w:val="BodyText"/>
+        <w:bidi w:val="0"/>
+        <w:rPr/>
+      </w:pPr>
+      <w:r>
+        <w:rPr/>
+        <w:t>A sequence is limited to 12 observations spanning no more than 24 hours. These are deliberate session-integrity and fail-safe limits: split a historic archive into the watches during which one clock correction and one motion model were physically meaningful.</w:t>
       </w:r>
     </w:p>
     <w:p>
@@ -6373,6 +6435,17 @@
       <w:r>
         <w:rPr/>
         <w:t>: add it to the raw reading.</w:t>
+      </w:r>
+    </w:p>
+    <w:p>
+      <w:pPr>
+        <w:pStyle w:val="BodyText"/>
+        <w:bidi w:val="0"/>
+        <w:rPr/>
+      </w:pPr>
+      <w:r>
+        <w:rPr/>
+        <w:t>The current sight index-error default is displayed for comparison but is not applied to this check. Applying a pre-existing correction while measuring the instrument's correction would make the calibration circular.</w:t>
       </w:r>
     </w:p>
     <w:p>
@@ -6710,6 +6783,48 @@
     </w:p>
     <w:p>
       <w:pPr>
+        <w:pStyle w:val="BodyText"/>
+        <w:bidi w:val="0"/>
+        <w:rPr/>
+      </w:pPr>
+      <w:r>
+        <w:rPr/>
+        <w:t xml:space="preserve">Observation coordinates and measured angles start blank. Closing the window temporarily retains an unfinished observation; the window says so. Select </w:t>
+      </w:r>
+      <w:r>
+        <w:rPr>
+          <w:rStyle w:val="Strong"/>
+        </w:rPr>
+        <w:t>New / clear observation</w:t>
+      </w:r>
+      <w:r>
+        <w:rPr/>
+        <w:t xml:space="preserve"> before a different observation to clear all entries, results and plots and reload the current central index- error and eye-height defaults.</w:t>
+      </w:r>
+    </w:p>
+    <w:p>
+      <w:pPr>
+        <w:pStyle w:val="BodyText"/>
+        <w:bidi w:val="0"/>
+        <w:rPr/>
+      </w:pPr>
+      <w:r>
+        <w:rPr/>
+        <w:t xml:space="preserve">For a true bearing, magnetic variation and compass deviation are disabled and ignored. For a magnetic compass bearing they remain editable. </w:t>
+      </w:r>
+      <w:r>
+        <w:rPr>
+          <w:rStyle w:val="Strong"/>
+        </w:rPr>
+        <w:t>Use WMM at current boat/time</w:t>
+      </w:r>
+      <w:r>
+        <w:rPr/>
+        <w:t xml:space="preserve"> obtains a clearly labelled estimate for the current boat position and UTC; compass deviation always remains a manual instrument/vessel input.</w:t>
+      </w:r>
+    </w:p>
+    <w:p>
+      <w:pPr>
         <w:pStyle w:val="Heading2"/>
         <w:bidi w:val="0"/>
         <w:rPr/>
@@ -6737,7 +6852,7 @@
       </w:r>
       <w:r>
         <w:rPr/>
-        <w:t xml:space="preserve">. Enter three charted objects in left–centre–right visual order and the included left-centre and centre-right measurements. Landmark coordinates start at 0° N, 0° E so stale vessel coordinates cannot be mistaken for targets. The central sextant index-error default is applied to both angle measurements and remains editable. Enter uncertainty and an approximate vessel position to choose among ambiguous solutions. Select </w:t>
+        <w:t xml:space="preserve">. Enter three charted objects in left–centre–right visual order and the included left-centre and centre-right measurements. Landmark coordinates and the two measurements start blank so plausible-looking defaults cannot be mistaken for observations. The central sextant index-error default is applied to both angle measurements and remains editable. Enter uncertainty and an approximate vessel position to choose among ambiguous solutions. Select </w:t>
       </w:r>
       <w:r>
         <w:rPr>

</xml_diff>